<commit_message>
Update 4/14/2023 6:59AM EST
Update as of 6:59AM EST on 4/14/2023.
</commit_message>
<xml_diff>
--- a/20230414 - MCE123 Technology Development - Illicit Government Software Runtime Prevention Security Systems - v1.0.0.1.docx
+++ b/20230414 - MCE123 Technology Development - Illicit Government Software Runtime Prevention Security Systems - v1.0.0.1.docx
@@ -223,7 +223,7 @@
           <w:sz w:val="28"/>
           <w:szCs w:val="28"/>
         </w:rPr>
-        <w:t>4/14/2023 6:46:12 AM</w:t>
+        <w:t>4/14/2023 6:58:33 AM</w:t>
       </w:r>
     </w:p>
     <w:p>
@@ -286,31 +286,19 @@
         <w:rPr>
           <w:u w:val="single"/>
         </w:rPr>
-        <w:t xml:space="preserve">AUTONOMOUS </w:t>
+        <w:t>AUTONOMOUS ILLICIT</w:t>
       </w:r>
       <w:r>
         <w:rPr>
           <w:u w:val="single"/>
         </w:rPr>
-        <w:t>ILLICIT</w:t>
+        <w:t xml:space="preserve"> GOVERNMENT</w:t>
       </w:r>
       <w:r>
         <w:rPr>
           <w:u w:val="single"/>
         </w:rPr>
-        <w:t xml:space="preserve"> GOVERNMENT</w:t>
-      </w:r>
-      <w:r>
-        <w:rPr>
-          <w:u w:val="single"/>
-        </w:rPr>
-        <w:t xml:space="preserve"> SOFTWARE</w:t>
-      </w:r>
-      <w:r>
-        <w:rPr>
-          <w:u w:val="single"/>
-        </w:rPr>
-        <w:t xml:space="preserve"> PREVENTION SECURITY SYSTEMS INSTANCE BUILDER</w:t>
+        <w:t xml:space="preserve"> SOFTWARE PREVENTION SECURITY SYSTEMS INSTANCE BUILDER</w:t>
       </w:r>
       <w:r>
         <w:t xml:space="preserve"> (</w:t>
@@ -382,15 +370,7 @@
           <w:bCs/>
           <w:color w:val="FF0000"/>
         </w:rPr>
-        <w:t>SOFTWARE</w:t>
-      </w:r>
-      <w:r>
-        <w:rPr>
-          <w:b/>
-          <w:bCs/>
-          <w:color w:val="FF0000"/>
-        </w:rPr>
-        <w:t xml:space="preserve"> TYPE</w:t>
+        <w:t>SOFTWARE TYPE</w:t>
       </w:r>
       <w:r>
         <w:rPr>
@@ -415,14 +395,7 @@
           <w:b/>
           <w:bCs/>
         </w:rPr>
-        <w:t xml:space="preserve"> </w:t>
-      </w:r>
-      <w:r>
-        <w:rPr>
-          <w:b/>
-          <w:bCs/>
-        </w:rPr>
-        <w:t xml:space="preserve">                                                             </w:t>
+        <w:t xml:space="preserve">                                                              </w:t>
       </w:r>
       <w:r>
         <w:rPr>
@@ -521,15 +494,7 @@
           <w:bCs/>
           <w:color w:val="FF0000"/>
         </w:rPr>
-        <w:t>SOFTWARE</w:t>
-      </w:r>
-      <w:r>
-        <w:rPr>
-          <w:b/>
-          <w:bCs/>
-          <w:color w:val="FF0000"/>
-        </w:rPr>
-        <w:t xml:space="preserve"> TYPE</w:t>
+        <w:t>SOFTWARE TYPE</w:t>
       </w:r>
       <w:r>
         <w:t xml:space="preserve"> </w:t>
@@ -572,10 +537,7 @@
         <w:t>۞</w:t>
       </w:r>
       <w:r>
-        <w:t>,</w:t>
-      </w:r>
-      <w:r>
-        <w:t xml:space="preserve"> </w:t>
+        <w:t xml:space="preserve">, </w:t>
       </w:r>
       <w:r>
         <w:t xml:space="preserve">  </w:t>
@@ -643,15 +605,7 @@
           <w:bCs/>
           <w:color w:val="FF0000"/>
         </w:rPr>
-        <w:t>ILLICIT SOFTWARE</w:t>
-      </w:r>
-      <w:r>
-        <w:rPr>
-          <w:b/>
-          <w:bCs/>
-          <w:color w:val="FF0000"/>
-        </w:rPr>
-        <w:t xml:space="preserve"> </w:t>
+        <w:t xml:space="preserve">ILLICIT SOFTWARE </w:t>
       </w:r>
       <w:proofErr w:type="gramStart"/>
       <w:r>
@@ -709,7 +663,7 @@
           <w:bCs/>
           <w:color w:val="FF0000"/>
         </w:rPr>
-        <w:t xml:space="preserve">BLAMING </w:t>
+        <w:t xml:space="preserve">AT </w:t>
       </w:r>
       <w:proofErr w:type="gramStart"/>
       <w:r>
@@ -718,7 +672,7 @@
           <w:bCs/>
           <w:color w:val="FF0000"/>
         </w:rPr>
-        <w:t>MACHINE</w:t>
+        <w:t>SYSTEMS</w:t>
       </w:r>
       <w:r>
         <w:rPr>
@@ -767,7 +721,7 @@
           <w:bCs/>
           <w:color w:val="FF0000"/>
         </w:rPr>
-        <w:t xml:space="preserve">CHRISTOPHER HAWKINSON </w:t>
+        <w:t xml:space="preserve">BLAMING </w:t>
       </w:r>
       <w:proofErr w:type="gramStart"/>
       <w:r>
@@ -776,7 +730,7 @@
           <w:bCs/>
           <w:color w:val="FF0000"/>
         </w:rPr>
-        <w:t>INSTANCES</w:t>
+        <w:t>MACHINE</w:t>
       </w:r>
       <w:r>
         <w:rPr>
@@ -834,7 +788,7 @@
           <w:bCs/>
           <w:color w:val="FF0000"/>
         </w:rPr>
-        <w:t>SYSTEMS</w:t>
+        <w:t>INSTANCES</w:t>
       </w:r>
       <w:r>
         <w:rPr>
@@ -883,7 +837,7 @@
           <w:bCs/>
           <w:color w:val="FF0000"/>
         </w:rPr>
-        <w:t xml:space="preserve">COMPLACENCY SECURITY </w:t>
+        <w:t xml:space="preserve">CHRISTOPHER HAWKINSON </w:t>
       </w:r>
       <w:proofErr w:type="gramStart"/>
       <w:r>
@@ -941,7 +895,7 @@
           <w:bCs/>
           <w:color w:val="FF0000"/>
         </w:rPr>
-        <w:t xml:space="preserve">EX-JUDICIAL EXECUTION </w:t>
+        <w:t xml:space="preserve">COMPLACENCY SECURITY </w:t>
       </w:r>
       <w:proofErr w:type="gramStart"/>
       <w:r>
@@ -999,7 +953,7 @@
           <w:bCs/>
           <w:color w:val="FF0000"/>
         </w:rPr>
-        <w:t xml:space="preserve">EYE DAMAGING </w:t>
+        <w:t xml:space="preserve">EX-JUDICIAL EXECUTION </w:t>
       </w:r>
       <w:proofErr w:type="gramStart"/>
       <w:r>
@@ -1057,7 +1011,7 @@
           <w:bCs/>
           <w:color w:val="FF0000"/>
         </w:rPr>
-        <w:t xml:space="preserve">INVERSION </w:t>
+        <w:t xml:space="preserve">EYE DAMAGING </w:t>
       </w:r>
       <w:proofErr w:type="gramStart"/>
       <w:r>
@@ -1066,7 +1020,7 @@
           <w:bCs/>
           <w:color w:val="FF0000"/>
         </w:rPr>
-        <w:t>SOFTWARE</w:t>
+        <w:t>SYSTEMS</w:t>
       </w:r>
       <w:r>
         <w:rPr>
@@ -1115,7 +1069,15 @@
           <w:bCs/>
           <w:color w:val="FF0000"/>
         </w:rPr>
-        <w:t xml:space="preserve">JOEY MENDONCA </w:t>
+        <w:t>I</w:t>
+      </w:r>
+      <w:r>
+        <w:rPr>
+          <w:b/>
+          <w:bCs/>
+          <w:color w:val="FF0000"/>
+        </w:rPr>
+        <w:t xml:space="preserve">CC COURT </w:t>
       </w:r>
       <w:proofErr w:type="gramStart"/>
       <w:r>
@@ -1124,7 +1086,7 @@
           <w:bCs/>
           <w:color w:val="FF0000"/>
         </w:rPr>
-        <w:t>INSTANCES</w:t>
+        <w:t>SYSTEMS</w:t>
       </w:r>
       <w:r>
         <w:rPr>
@@ -1173,7 +1135,39 @@
           <w:bCs/>
           <w:color w:val="FF0000"/>
         </w:rPr>
-        <w:t xml:space="preserve">JOSH PRUIT </w:t>
+        <w:t>I</w:t>
+      </w:r>
+      <w:r>
+        <w:rPr>
+          <w:b/>
+          <w:bCs/>
+          <w:color w:val="FF0000"/>
+        </w:rPr>
+        <w:t xml:space="preserve">NTERNATIONAL </w:t>
+      </w:r>
+      <w:r>
+        <w:rPr>
+          <w:b/>
+          <w:bCs/>
+          <w:color w:val="FF0000"/>
+        </w:rPr>
+        <w:t>C</w:t>
+      </w:r>
+      <w:r>
+        <w:rPr>
+          <w:b/>
+          <w:bCs/>
+          <w:color w:val="FF0000"/>
+        </w:rPr>
+        <w:t xml:space="preserve">RIMINAL </w:t>
+      </w:r>
+      <w:r>
+        <w:rPr>
+          <w:b/>
+          <w:bCs/>
+          <w:color w:val="FF0000"/>
+        </w:rPr>
+        <w:t xml:space="preserve">COURT </w:t>
       </w:r>
       <w:proofErr w:type="gramStart"/>
       <w:r>
@@ -1231,7 +1225,7 @@
           <w:bCs/>
           <w:color w:val="FF0000"/>
         </w:rPr>
-        <w:t xml:space="preserve">LASER STRIKE </w:t>
+        <w:t xml:space="preserve">INVERSION </w:t>
       </w:r>
       <w:proofErr w:type="gramStart"/>
       <w:r>
@@ -1289,7 +1283,7 @@
           <w:bCs/>
           <w:color w:val="FF0000"/>
         </w:rPr>
-        <w:t xml:space="preserve">MIND PHREAK </w:t>
+        <w:t xml:space="preserve">JOEY MENDONCA </w:t>
       </w:r>
       <w:proofErr w:type="gramStart"/>
       <w:r>
@@ -1298,7 +1292,7 @@
           <w:bCs/>
           <w:color w:val="FF0000"/>
         </w:rPr>
-        <w:t>SYSTEMS</w:t>
+        <w:t>INSTANCES</w:t>
       </w:r>
       <w:r>
         <w:rPr>
@@ -1347,7 +1341,7 @@
           <w:bCs/>
           <w:color w:val="FF0000"/>
         </w:rPr>
-        <w:t xml:space="preserve">MINDPHREAK </w:t>
+        <w:t xml:space="preserve">JOSH PRUIT </w:t>
       </w:r>
       <w:proofErr w:type="gramStart"/>
       <w:r>
@@ -1356,7 +1350,7 @@
           <w:bCs/>
           <w:color w:val="FF0000"/>
         </w:rPr>
-        <w:t>SYSTEMS</w:t>
+        <w:t>INSTANCES</w:t>
       </w:r>
       <w:r>
         <w:rPr>
@@ -1405,7 +1399,15 @@
           <w:bCs/>
           <w:color w:val="FF0000"/>
         </w:rPr>
-        <w:t xml:space="preserve">NICOTINE GUM COMMAND </w:t>
+        <w:t>J</w:t>
+      </w:r>
+      <w:r>
+        <w:rPr>
+          <w:b/>
+          <w:bCs/>
+          <w:color w:val="FF0000"/>
+        </w:rPr>
+        <w:t xml:space="preserve">ULIE CHAMBERLAIN </w:t>
       </w:r>
       <w:proofErr w:type="gramStart"/>
       <w:r>
@@ -1414,7 +1416,7 @@
           <w:bCs/>
           <w:color w:val="FF0000"/>
         </w:rPr>
-        <w:t>SYSTEM</w:t>
+        <w:t>INSTANCES</w:t>
       </w:r>
       <w:r>
         <w:rPr>
@@ -1463,7 +1465,7 @@
           <w:bCs/>
           <w:color w:val="FF0000"/>
         </w:rPr>
-        <w:t xml:space="preserve">NICOTINE GUM COMMAND </w:t>
+        <w:t xml:space="preserve">LASER STRIKE </w:t>
       </w:r>
       <w:proofErr w:type="gramStart"/>
       <w:r>
@@ -1472,7 +1474,7 @@
           <w:bCs/>
           <w:color w:val="FF0000"/>
         </w:rPr>
-        <w:t>SYSTEMS</w:t>
+        <w:t>SOFTWARE</w:t>
       </w:r>
       <w:r>
         <w:rPr>
@@ -1521,7 +1523,7 @@
           <w:bCs/>
           <w:color w:val="FF0000"/>
         </w:rPr>
-        <w:t xml:space="preserve">NICOTINE GUM </w:t>
+        <w:t xml:space="preserve">MIND PHREAK </w:t>
       </w:r>
       <w:proofErr w:type="gramStart"/>
       <w:r>
@@ -1530,7 +1532,7 @@
           <w:bCs/>
           <w:color w:val="FF0000"/>
         </w:rPr>
-        <w:t>COMMAND</w:t>
+        <w:t>SYSTEMS</w:t>
       </w:r>
       <w:r>
         <w:rPr>
@@ -1579,7 +1581,7 @@
           <w:bCs/>
           <w:color w:val="FF0000"/>
         </w:rPr>
-        <w:t xml:space="preserve">NICOTINE GUM </w:t>
+        <w:t xml:space="preserve">MINDPHREAK </w:t>
       </w:r>
       <w:proofErr w:type="gramStart"/>
       <w:r>
@@ -1588,7 +1590,7 @@
           <w:bCs/>
           <w:color w:val="FF0000"/>
         </w:rPr>
-        <w:t>SYSTEM</w:t>
+        <w:t>SYSTEMS</w:t>
       </w:r>
       <w:r>
         <w:rPr>
@@ -1638,7 +1640,7 @@
           <w:bCs/>
           <w:color w:val="FF0000"/>
         </w:rPr>
-        <w:t xml:space="preserve">NICOTINE GUM </w:t>
+        <w:t xml:space="preserve">NICOTINE GUM COMMAND </w:t>
       </w:r>
       <w:proofErr w:type="gramStart"/>
       <w:r>
@@ -1647,7 +1649,7 @@
           <w:bCs/>
           <w:color w:val="FF0000"/>
         </w:rPr>
-        <w:t>SYSTEMS</w:t>
+        <w:t>SYSTEM</w:t>
       </w:r>
       <w:r>
         <w:rPr>
@@ -1696,7 +1698,7 @@
           <w:bCs/>
           <w:color w:val="FF0000"/>
         </w:rPr>
-        <w:t xml:space="preserve">OFFENSIVE COMPUTER </w:t>
+        <w:t xml:space="preserve">NICOTINE GUM COMMAND </w:t>
       </w:r>
       <w:proofErr w:type="gramStart"/>
       <w:r>
@@ -1705,7 +1707,7 @@
           <w:bCs/>
           <w:color w:val="FF0000"/>
         </w:rPr>
-        <w:t>SYSTEM</w:t>
+        <w:t>SYSTEMS</w:t>
       </w:r>
       <w:r>
         <w:rPr>
@@ -1754,7 +1756,7 @@
           <w:bCs/>
           <w:color w:val="FF0000"/>
         </w:rPr>
-        <w:t xml:space="preserve">THE </w:t>
+        <w:t xml:space="preserve">NICOTINE GUM </w:t>
       </w:r>
       <w:proofErr w:type="gramStart"/>
       <w:r>
@@ -1763,7 +1765,7 @@
           <w:bCs/>
           <w:color w:val="FF0000"/>
         </w:rPr>
-        <w:t>CONSTRUCT</w:t>
+        <w:t>COMMAND</w:t>
       </w:r>
       <w:r>
         <w:rPr>
@@ -1812,7 +1814,7 @@
           <w:bCs/>
           <w:color w:val="FF0000"/>
         </w:rPr>
-        <w:t xml:space="preserve">THE </w:t>
+        <w:t xml:space="preserve">NICOTINE GUM </w:t>
       </w:r>
       <w:proofErr w:type="gramStart"/>
       <w:r>
@@ -1821,7 +1823,7 @@
           <w:bCs/>
           <w:color w:val="FF0000"/>
         </w:rPr>
-        <w:t>GAME</w:t>
+        <w:t>SYSTEM</w:t>
       </w:r>
       <w:r>
         <w:rPr>
@@ -1870,7 +1872,7 @@
           <w:bCs/>
           <w:color w:val="FF0000"/>
         </w:rPr>
-        <w:t xml:space="preserve">THE PENTAGON </w:t>
+        <w:t xml:space="preserve">NICOTINE GUM </w:t>
       </w:r>
       <w:proofErr w:type="gramStart"/>
       <w:r>
@@ -1879,7 +1881,7 @@
           <w:bCs/>
           <w:color w:val="FF0000"/>
         </w:rPr>
-        <w:t>PROGRAM</w:t>
+        <w:t>SYSTEMS</w:t>
       </w:r>
       <w:r>
         <w:rPr>
@@ -1928,7 +1930,7 @@
           <w:bCs/>
           <w:color w:val="FF0000"/>
         </w:rPr>
-        <w:t xml:space="preserve">WAR CODE </w:t>
+        <w:t xml:space="preserve">OFFENSIVE COMPUTER </w:t>
       </w:r>
       <w:proofErr w:type="gramStart"/>
       <w:r>
@@ -1937,7 +1939,7 @@
           <w:bCs/>
           <w:color w:val="FF0000"/>
         </w:rPr>
-        <w:t>COMMAND</w:t>
+        <w:t>SYSTEM</w:t>
       </w:r>
       <w:r>
         <w:rPr>
@@ -1980,14 +1982,6 @@
         </w:rPr>
         <w:t xml:space="preserve">ANY </w:t>
       </w:r>
-      <w:r>
-        <w:rPr>
-          <w:b/>
-          <w:bCs/>
-          <w:color w:val="FF0000"/>
-        </w:rPr>
-        <w:t xml:space="preserve">WAR CODE </w:t>
-      </w:r>
       <w:proofErr w:type="gramStart"/>
       <w:r>
         <w:rPr>
@@ -1995,7 +1989,7 @@
           <w:bCs/>
           <w:color w:val="FF0000"/>
         </w:rPr>
-        <w:t>RUNTIME</w:t>
+        <w:t>PATRICK</w:t>
       </w:r>
       <w:r>
         <w:rPr>
@@ -2044,7 +2038,15 @@
           <w:bCs/>
           <w:color w:val="FF0000"/>
         </w:rPr>
-        <w:t xml:space="preserve">WAR COMMAND </w:t>
+        <w:t>THE C</w:t>
+      </w:r>
+      <w:r>
+        <w:rPr>
+          <w:b/>
+          <w:bCs/>
+          <w:color w:val="FF0000"/>
+        </w:rPr>
+        <w:t xml:space="preserve">IA </w:t>
       </w:r>
       <w:proofErr w:type="gramStart"/>
       <w:r>
@@ -2053,7 +2055,7 @@
           <w:bCs/>
           <w:color w:val="FF0000"/>
         </w:rPr>
-        <w:t>RUNTIME</w:t>
+        <w:t>SYSTEMS</w:t>
       </w:r>
       <w:r>
         <w:rPr>
@@ -2102,7 +2104,7 @@
           <w:bCs/>
           <w:color w:val="FF0000"/>
         </w:rPr>
-        <w:t xml:space="preserve">WAR COMMAND </w:t>
+        <w:t xml:space="preserve">THE </w:t>
       </w:r>
       <w:proofErr w:type="gramStart"/>
       <w:r>
@@ -2111,7 +2113,7 @@
           <w:bCs/>
           <w:color w:val="FF0000"/>
         </w:rPr>
-        <w:t>SYSTEMS</w:t>
+        <w:t>CONSTRUCT</w:t>
       </w:r>
       <w:r>
         <w:rPr>
@@ -2160,7 +2162,15 @@
           <w:bCs/>
           <w:color w:val="FF0000"/>
         </w:rPr>
-        <w:t xml:space="preserve">WAR CRIMES </w:t>
+        <w:t xml:space="preserve">THE </w:t>
+      </w:r>
+      <w:r>
+        <w:rPr>
+          <w:b/>
+          <w:bCs/>
+          <w:color w:val="FF0000"/>
+        </w:rPr>
+        <w:t xml:space="preserve">DIA </w:t>
       </w:r>
       <w:proofErr w:type="gramStart"/>
       <w:r>
@@ -2169,7 +2179,7 @@
           <w:bCs/>
           <w:color w:val="FF0000"/>
         </w:rPr>
-        <w:t>COMMAND</w:t>
+        <w:t>SYSTEMS</w:t>
       </w:r>
       <w:r>
         <w:rPr>
@@ -2218,7 +2228,15 @@
           <w:bCs/>
           <w:color w:val="FF0000"/>
         </w:rPr>
-        <w:t xml:space="preserve">WAR CRIMES </w:t>
+        <w:t xml:space="preserve">THE </w:t>
+      </w:r>
+      <w:r>
+        <w:rPr>
+          <w:b/>
+          <w:bCs/>
+          <w:color w:val="FF0000"/>
+        </w:rPr>
+        <w:t xml:space="preserve">FBI </w:t>
       </w:r>
       <w:proofErr w:type="gramStart"/>
       <w:r>
@@ -2227,7 +2245,7 @@
           <w:bCs/>
           <w:color w:val="FF0000"/>
         </w:rPr>
-        <w:t>SYSTEM</w:t>
+        <w:t>SYSTEMS</w:t>
       </w:r>
       <w:r>
         <w:rPr>
@@ -2276,7 +2294,7 @@
           <w:bCs/>
           <w:color w:val="FF0000"/>
         </w:rPr>
-        <w:t xml:space="preserve">WAR CRIMES </w:t>
+        <w:t xml:space="preserve">THE </w:t>
       </w:r>
       <w:proofErr w:type="gramStart"/>
       <w:r>
@@ -2285,7 +2303,7 @@
           <w:bCs/>
           <w:color w:val="FF0000"/>
         </w:rPr>
-        <w:t>SYSTEMS</w:t>
+        <w:t>GAME</w:t>
       </w:r>
       <w:r>
         <w:rPr>
@@ -2334,6 +2352,735 @@
           <w:bCs/>
           <w:color w:val="FF0000"/>
         </w:rPr>
+        <w:t xml:space="preserve">THE </w:t>
+      </w:r>
+      <w:r>
+        <w:rPr>
+          <w:b/>
+          <w:bCs/>
+          <w:color w:val="FF0000"/>
+        </w:rPr>
+        <w:t xml:space="preserve">IRS </w:t>
+      </w:r>
+      <w:proofErr w:type="gramStart"/>
+      <w:r>
+        <w:rPr>
+          <w:b/>
+          <w:bCs/>
+          <w:color w:val="FF0000"/>
+        </w:rPr>
+        <w:t>SYSTEMS</w:t>
+      </w:r>
+      <w:r>
+        <w:rPr>
+          <w:b/>
+          <w:bCs/>
+        </w:rPr>
+        <w:t>;</w:t>
+      </w:r>
+      <w:proofErr w:type="gramEnd"/>
+    </w:p>
+    <w:p>
+      <w:pPr>
+        <w:ind w:left="360"/>
+        <w:jc w:val="both"/>
+        <w:rPr>
+          <w:b/>
+          <w:bCs/>
+        </w:rPr>
+      </w:pPr>
+      <w:r>
+        <w:tab/>
+      </w:r>
+      <w:r>
+        <w:rPr>
+          <w:u w:val="single"/>
+        </w:rPr>
+        <w:t>PREVENTION SECURITY SYSTEM</w:t>
+      </w:r>
+      <w:r>
+        <w:t>:</w:t>
+      </w:r>
+      <w:r>
+        <w:t xml:space="preserve"> </w:t>
+      </w:r>
+      <w:r>
+        <w:rPr>
+          <w:b/>
+          <w:bCs/>
+          <w:color w:val="FF0000"/>
+        </w:rPr>
+        <w:t xml:space="preserve">ANY </w:t>
+      </w:r>
+      <w:r>
+        <w:rPr>
+          <w:b/>
+          <w:bCs/>
+          <w:color w:val="FF0000"/>
+        </w:rPr>
+        <w:t xml:space="preserve">THE </w:t>
+      </w:r>
+      <w:r>
+        <w:rPr>
+          <w:b/>
+          <w:bCs/>
+          <w:color w:val="FF0000"/>
+        </w:rPr>
+        <w:t>NSA</w:t>
+      </w:r>
+      <w:r>
+        <w:rPr>
+          <w:b/>
+          <w:bCs/>
+          <w:color w:val="FF0000"/>
+        </w:rPr>
+        <w:t xml:space="preserve"> </w:t>
+      </w:r>
+      <w:proofErr w:type="gramStart"/>
+      <w:r>
+        <w:rPr>
+          <w:b/>
+          <w:bCs/>
+          <w:color w:val="FF0000"/>
+        </w:rPr>
+        <w:t>SYSTEMS</w:t>
+      </w:r>
+      <w:r>
+        <w:rPr>
+          <w:b/>
+          <w:bCs/>
+        </w:rPr>
+        <w:t>;</w:t>
+      </w:r>
+      <w:proofErr w:type="gramEnd"/>
+    </w:p>
+    <w:p>
+      <w:pPr>
+        <w:ind w:left="360"/>
+        <w:jc w:val="both"/>
+        <w:rPr>
+          <w:b/>
+          <w:bCs/>
+        </w:rPr>
+      </w:pPr>
+      <w:r>
+        <w:tab/>
+      </w:r>
+      <w:r>
+        <w:rPr>
+          <w:u w:val="single"/>
+        </w:rPr>
+        <w:t>PREVENTION SECURITY SYSTEM</w:t>
+      </w:r>
+      <w:r>
+        <w:t>:</w:t>
+      </w:r>
+      <w:r>
+        <w:t xml:space="preserve"> </w:t>
+      </w:r>
+      <w:r>
+        <w:rPr>
+          <w:b/>
+          <w:bCs/>
+          <w:color w:val="FF0000"/>
+        </w:rPr>
+        <w:t xml:space="preserve">ANY </w:t>
+      </w:r>
+      <w:r>
+        <w:rPr>
+          <w:b/>
+          <w:bCs/>
+          <w:color w:val="FF0000"/>
+        </w:rPr>
+        <w:t xml:space="preserve">THE </w:t>
+      </w:r>
+      <w:proofErr w:type="gramStart"/>
+      <w:r>
+        <w:rPr>
+          <w:b/>
+          <w:bCs/>
+          <w:color w:val="FF0000"/>
+        </w:rPr>
+        <w:t>PENTAGON</w:t>
+      </w:r>
+      <w:r>
+        <w:rPr>
+          <w:b/>
+          <w:bCs/>
+        </w:rPr>
+        <w:t>;</w:t>
+      </w:r>
+      <w:proofErr w:type="gramEnd"/>
+    </w:p>
+    <w:p>
+      <w:pPr>
+        <w:ind w:left="360"/>
+        <w:jc w:val="both"/>
+        <w:rPr>
+          <w:b/>
+          <w:bCs/>
+        </w:rPr>
+      </w:pPr>
+      <w:r>
+        <w:tab/>
+      </w:r>
+      <w:r>
+        <w:rPr>
+          <w:u w:val="single"/>
+        </w:rPr>
+        <w:t>PREVENTION SECURITY SYSTEM</w:t>
+      </w:r>
+      <w:r>
+        <w:t>:</w:t>
+      </w:r>
+      <w:r>
+        <w:t xml:space="preserve"> </w:t>
+      </w:r>
+      <w:r>
+        <w:rPr>
+          <w:b/>
+          <w:bCs/>
+          <w:color w:val="FF0000"/>
+        </w:rPr>
+        <w:t xml:space="preserve">ANY </w:t>
+      </w:r>
+      <w:r>
+        <w:rPr>
+          <w:b/>
+          <w:bCs/>
+          <w:color w:val="FF0000"/>
+        </w:rPr>
+        <w:t xml:space="preserve">THE PENTAGON </w:t>
+      </w:r>
+      <w:proofErr w:type="gramStart"/>
+      <w:r>
+        <w:rPr>
+          <w:b/>
+          <w:bCs/>
+          <w:color w:val="FF0000"/>
+        </w:rPr>
+        <w:t>PROGRAM</w:t>
+      </w:r>
+      <w:r>
+        <w:rPr>
+          <w:b/>
+          <w:bCs/>
+        </w:rPr>
+        <w:t>;</w:t>
+      </w:r>
+      <w:proofErr w:type="gramEnd"/>
+    </w:p>
+    <w:p>
+      <w:pPr>
+        <w:ind w:left="360"/>
+        <w:jc w:val="both"/>
+        <w:rPr>
+          <w:b/>
+          <w:bCs/>
+        </w:rPr>
+      </w:pPr>
+      <w:r>
+        <w:tab/>
+      </w:r>
+      <w:r>
+        <w:rPr>
+          <w:u w:val="single"/>
+        </w:rPr>
+        <w:t>PREVENTION SECURITY SYSTEM</w:t>
+      </w:r>
+      <w:r>
+        <w:t>:</w:t>
+      </w:r>
+      <w:r>
+        <w:t xml:space="preserve"> </w:t>
+      </w:r>
+      <w:r>
+        <w:rPr>
+          <w:b/>
+          <w:bCs/>
+          <w:color w:val="FF0000"/>
+        </w:rPr>
+        <w:t xml:space="preserve">ANY </w:t>
+      </w:r>
+      <w:r>
+        <w:rPr>
+          <w:b/>
+          <w:bCs/>
+          <w:color w:val="FF0000"/>
+        </w:rPr>
+        <w:t xml:space="preserve">THE </w:t>
+      </w:r>
+      <w:r>
+        <w:rPr>
+          <w:b/>
+          <w:bCs/>
+          <w:color w:val="FF0000"/>
+        </w:rPr>
+        <w:t xml:space="preserve">UNIVERSITY </w:t>
+      </w:r>
+      <w:proofErr w:type="gramStart"/>
+      <w:r>
+        <w:rPr>
+          <w:b/>
+          <w:bCs/>
+          <w:color w:val="FF0000"/>
+        </w:rPr>
+        <w:t>SYSTEMS</w:t>
+      </w:r>
+      <w:r>
+        <w:rPr>
+          <w:b/>
+          <w:bCs/>
+        </w:rPr>
+        <w:t>;</w:t>
+      </w:r>
+      <w:proofErr w:type="gramEnd"/>
+    </w:p>
+    <w:p>
+      <w:pPr>
+        <w:ind w:left="360"/>
+        <w:jc w:val="both"/>
+        <w:rPr>
+          <w:b/>
+          <w:bCs/>
+        </w:rPr>
+      </w:pPr>
+      <w:r>
+        <w:tab/>
+      </w:r>
+      <w:r>
+        <w:rPr>
+          <w:u w:val="single"/>
+        </w:rPr>
+        <w:t>PREVENTION SECURITY SYSTEM</w:t>
+      </w:r>
+      <w:r>
+        <w:t>:</w:t>
+      </w:r>
+      <w:r>
+        <w:t xml:space="preserve"> </w:t>
+      </w:r>
+      <w:r>
+        <w:rPr>
+          <w:b/>
+          <w:bCs/>
+          <w:color w:val="FF0000"/>
+        </w:rPr>
+        <w:t xml:space="preserve">ANY </w:t>
+      </w:r>
+      <w:r>
+        <w:rPr>
+          <w:b/>
+          <w:bCs/>
+          <w:color w:val="FF0000"/>
+        </w:rPr>
+        <w:t xml:space="preserve">WAR CODE </w:t>
+      </w:r>
+      <w:proofErr w:type="gramStart"/>
+      <w:r>
+        <w:rPr>
+          <w:b/>
+          <w:bCs/>
+          <w:color w:val="FF0000"/>
+        </w:rPr>
+        <w:t>COMMAND</w:t>
+      </w:r>
+      <w:r>
+        <w:rPr>
+          <w:b/>
+          <w:bCs/>
+        </w:rPr>
+        <w:t>;</w:t>
+      </w:r>
+      <w:proofErr w:type="gramEnd"/>
+    </w:p>
+    <w:p>
+      <w:pPr>
+        <w:ind w:left="360"/>
+        <w:jc w:val="both"/>
+        <w:rPr>
+          <w:b/>
+          <w:bCs/>
+        </w:rPr>
+      </w:pPr>
+      <w:r>
+        <w:tab/>
+      </w:r>
+      <w:r>
+        <w:rPr>
+          <w:u w:val="single"/>
+        </w:rPr>
+        <w:t>PREVENTION SECURITY SYSTEM</w:t>
+      </w:r>
+      <w:r>
+        <w:t>:</w:t>
+      </w:r>
+      <w:r>
+        <w:t xml:space="preserve"> </w:t>
+      </w:r>
+      <w:r>
+        <w:rPr>
+          <w:b/>
+          <w:bCs/>
+          <w:color w:val="FF0000"/>
+        </w:rPr>
+        <w:t xml:space="preserve">ANY </w:t>
+      </w:r>
+      <w:r>
+        <w:rPr>
+          <w:b/>
+          <w:bCs/>
+          <w:color w:val="FF0000"/>
+        </w:rPr>
+        <w:t xml:space="preserve">WAR CODE </w:t>
+      </w:r>
+      <w:proofErr w:type="gramStart"/>
+      <w:r>
+        <w:rPr>
+          <w:b/>
+          <w:bCs/>
+          <w:color w:val="FF0000"/>
+        </w:rPr>
+        <w:t>RUNTIME</w:t>
+      </w:r>
+      <w:r>
+        <w:rPr>
+          <w:b/>
+          <w:bCs/>
+        </w:rPr>
+        <w:t>;</w:t>
+      </w:r>
+      <w:proofErr w:type="gramEnd"/>
+    </w:p>
+    <w:p>
+      <w:pPr>
+        <w:ind w:left="360"/>
+        <w:jc w:val="both"/>
+        <w:rPr>
+          <w:b/>
+          <w:bCs/>
+        </w:rPr>
+      </w:pPr>
+      <w:r>
+        <w:tab/>
+      </w:r>
+      <w:r>
+        <w:rPr>
+          <w:u w:val="single"/>
+        </w:rPr>
+        <w:t>PREVENTION SECURITY SYSTEM</w:t>
+      </w:r>
+      <w:r>
+        <w:t>:</w:t>
+      </w:r>
+      <w:r>
+        <w:t xml:space="preserve"> </w:t>
+      </w:r>
+      <w:r>
+        <w:rPr>
+          <w:b/>
+          <w:bCs/>
+          <w:color w:val="FF0000"/>
+        </w:rPr>
+        <w:t xml:space="preserve">ANY </w:t>
+      </w:r>
+      <w:r>
+        <w:rPr>
+          <w:b/>
+          <w:bCs/>
+          <w:color w:val="FF0000"/>
+        </w:rPr>
+        <w:t xml:space="preserve">WAR COMMAND </w:t>
+      </w:r>
+      <w:proofErr w:type="gramStart"/>
+      <w:r>
+        <w:rPr>
+          <w:b/>
+          <w:bCs/>
+          <w:color w:val="FF0000"/>
+        </w:rPr>
+        <w:t>RUNTIME</w:t>
+      </w:r>
+      <w:r>
+        <w:rPr>
+          <w:b/>
+          <w:bCs/>
+        </w:rPr>
+        <w:t>;</w:t>
+      </w:r>
+      <w:proofErr w:type="gramEnd"/>
+    </w:p>
+    <w:p>
+      <w:pPr>
+        <w:ind w:left="360"/>
+        <w:jc w:val="both"/>
+        <w:rPr>
+          <w:b/>
+          <w:bCs/>
+        </w:rPr>
+      </w:pPr>
+      <w:r>
+        <w:tab/>
+      </w:r>
+      <w:r>
+        <w:rPr>
+          <w:u w:val="single"/>
+        </w:rPr>
+        <w:t>PREVENTION SECURITY SYSTEM</w:t>
+      </w:r>
+      <w:r>
+        <w:t>:</w:t>
+      </w:r>
+      <w:r>
+        <w:t xml:space="preserve"> </w:t>
+      </w:r>
+      <w:r>
+        <w:rPr>
+          <w:b/>
+          <w:bCs/>
+          <w:color w:val="FF0000"/>
+        </w:rPr>
+        <w:t xml:space="preserve">ANY </w:t>
+      </w:r>
+      <w:r>
+        <w:rPr>
+          <w:b/>
+          <w:bCs/>
+          <w:color w:val="FF0000"/>
+        </w:rPr>
+        <w:t xml:space="preserve">WAR COMMAND </w:t>
+      </w:r>
+      <w:proofErr w:type="gramStart"/>
+      <w:r>
+        <w:rPr>
+          <w:b/>
+          <w:bCs/>
+          <w:color w:val="FF0000"/>
+        </w:rPr>
+        <w:t>SYSTEMS</w:t>
+      </w:r>
+      <w:r>
+        <w:rPr>
+          <w:b/>
+          <w:bCs/>
+        </w:rPr>
+        <w:t>;</w:t>
+      </w:r>
+      <w:proofErr w:type="gramEnd"/>
+    </w:p>
+    <w:p>
+      <w:pPr>
+        <w:ind w:left="360"/>
+        <w:jc w:val="both"/>
+        <w:rPr>
+          <w:b/>
+          <w:bCs/>
+        </w:rPr>
+      </w:pPr>
+      <w:r>
+        <w:tab/>
+      </w:r>
+      <w:r>
+        <w:rPr>
+          <w:u w:val="single"/>
+        </w:rPr>
+        <w:t>PREVENTION SECURITY SYSTEM</w:t>
+      </w:r>
+      <w:r>
+        <w:t>:</w:t>
+      </w:r>
+      <w:r>
+        <w:t xml:space="preserve"> </w:t>
+      </w:r>
+      <w:r>
+        <w:rPr>
+          <w:b/>
+          <w:bCs/>
+          <w:color w:val="FF0000"/>
+        </w:rPr>
+        <w:t xml:space="preserve">ANY </w:t>
+      </w:r>
+      <w:r>
+        <w:rPr>
+          <w:b/>
+          <w:bCs/>
+          <w:color w:val="FF0000"/>
+        </w:rPr>
+        <w:t xml:space="preserve">WAR CRIMES </w:t>
+      </w:r>
+      <w:proofErr w:type="gramStart"/>
+      <w:r>
+        <w:rPr>
+          <w:b/>
+          <w:bCs/>
+          <w:color w:val="FF0000"/>
+        </w:rPr>
+        <w:t>COMMAND</w:t>
+      </w:r>
+      <w:r>
+        <w:rPr>
+          <w:b/>
+          <w:bCs/>
+        </w:rPr>
+        <w:t>;</w:t>
+      </w:r>
+      <w:proofErr w:type="gramEnd"/>
+    </w:p>
+    <w:p>
+      <w:pPr>
+        <w:ind w:left="360"/>
+        <w:jc w:val="both"/>
+        <w:rPr>
+          <w:b/>
+          <w:bCs/>
+        </w:rPr>
+      </w:pPr>
+      <w:r>
+        <w:lastRenderedPageBreak/>
+        <w:tab/>
+      </w:r>
+      <w:r>
+        <w:rPr>
+          <w:u w:val="single"/>
+        </w:rPr>
+        <w:t>PREVENTION SECURITY SYSTEM</w:t>
+      </w:r>
+      <w:r>
+        <w:t>:</w:t>
+      </w:r>
+      <w:r>
+        <w:t xml:space="preserve"> </w:t>
+      </w:r>
+      <w:r>
+        <w:rPr>
+          <w:b/>
+          <w:bCs/>
+          <w:color w:val="FF0000"/>
+        </w:rPr>
+        <w:t xml:space="preserve">ANY </w:t>
+      </w:r>
+      <w:r>
+        <w:rPr>
+          <w:b/>
+          <w:bCs/>
+          <w:color w:val="FF0000"/>
+        </w:rPr>
+        <w:t xml:space="preserve">WAR CRIMES </w:t>
+      </w:r>
+      <w:proofErr w:type="gramStart"/>
+      <w:r>
+        <w:rPr>
+          <w:b/>
+          <w:bCs/>
+          <w:color w:val="FF0000"/>
+        </w:rPr>
+        <w:t>SYSTEM</w:t>
+      </w:r>
+      <w:r>
+        <w:rPr>
+          <w:b/>
+          <w:bCs/>
+        </w:rPr>
+        <w:t>;</w:t>
+      </w:r>
+      <w:proofErr w:type="gramEnd"/>
+    </w:p>
+    <w:p>
+      <w:pPr>
+        <w:ind w:left="360"/>
+        <w:jc w:val="both"/>
+        <w:rPr>
+          <w:b/>
+          <w:bCs/>
+        </w:rPr>
+      </w:pPr>
+      <w:r>
+        <w:tab/>
+      </w:r>
+      <w:r>
+        <w:rPr>
+          <w:u w:val="single"/>
+        </w:rPr>
+        <w:t>PREVENTION SECURITY SYSTEM</w:t>
+      </w:r>
+      <w:r>
+        <w:t>:</w:t>
+      </w:r>
+      <w:r>
+        <w:t xml:space="preserve"> </w:t>
+      </w:r>
+      <w:r>
+        <w:rPr>
+          <w:b/>
+          <w:bCs/>
+          <w:color w:val="FF0000"/>
+        </w:rPr>
+        <w:t xml:space="preserve">ANY </w:t>
+      </w:r>
+      <w:r>
+        <w:rPr>
+          <w:b/>
+          <w:bCs/>
+          <w:color w:val="FF0000"/>
+        </w:rPr>
+        <w:t xml:space="preserve">WAR CRIMES </w:t>
+      </w:r>
+      <w:proofErr w:type="gramStart"/>
+      <w:r>
+        <w:rPr>
+          <w:b/>
+          <w:bCs/>
+          <w:color w:val="FF0000"/>
+        </w:rPr>
+        <w:t>SYSTEMS</w:t>
+      </w:r>
+      <w:r>
+        <w:rPr>
+          <w:b/>
+          <w:bCs/>
+        </w:rPr>
+        <w:t>;</w:t>
+      </w:r>
+      <w:proofErr w:type="gramEnd"/>
+    </w:p>
+    <w:p>
+      <w:pPr>
+        <w:ind w:left="360"/>
+        <w:jc w:val="both"/>
+        <w:rPr>
+          <w:b/>
+          <w:bCs/>
+        </w:rPr>
+      </w:pPr>
+      <w:r>
+        <w:tab/>
+      </w:r>
+      <w:r>
+        <w:rPr>
+          <w:u w:val="single"/>
+        </w:rPr>
+        <w:t>PREVENTION SECURITY SYSTEM</w:t>
+      </w:r>
+      <w:r>
+        <w:t>:</w:t>
+      </w:r>
+      <w:r>
+        <w:t xml:space="preserve"> </w:t>
+      </w:r>
+      <w:r>
+        <w:rPr>
+          <w:b/>
+          <w:bCs/>
+          <w:color w:val="FF0000"/>
+        </w:rPr>
+        <w:t xml:space="preserve">ANY </w:t>
+      </w:r>
+      <w:r>
+        <w:rPr>
+          <w:b/>
+          <w:bCs/>
+          <w:color w:val="FF0000"/>
+        </w:rPr>
         <w:t xml:space="preserve">WAR </w:t>
       </w:r>
       <w:proofErr w:type="gramStart"/>
@@ -2411,15 +3158,7 @@
           <w:bCs/>
           <w:color w:val="FF0000"/>
         </w:rPr>
-        <w:t xml:space="preserve">OTHER </w:t>
-      </w:r>
-      <w:r>
-        <w:rPr>
-          <w:b/>
-          <w:bCs/>
-          <w:color w:val="FF0000"/>
-        </w:rPr>
-        <w:t xml:space="preserve">ILLICIT </w:t>
+        <w:t xml:space="preserve">OTHER ILLICIT </w:t>
       </w:r>
       <w:r>
         <w:rPr>
@@ -2435,15 +3174,7 @@
           <w:bCs/>
           <w:color w:val="FF0000"/>
         </w:rPr>
-        <w:t>SOFTWARE</w:t>
-      </w:r>
-      <w:r>
-        <w:rPr>
-          <w:b/>
-          <w:bCs/>
-          <w:color w:val="FF0000"/>
-        </w:rPr>
-        <w:t xml:space="preserve"> </w:t>
+        <w:t xml:space="preserve">SOFTWARE </w:t>
       </w:r>
       <w:proofErr w:type="gramStart"/>
       <w:r>

</xml_diff>

<commit_message>
Update 4/14/2023 8:59AM EST
Update as of 8:59AM EST on 4/14/2023.
</commit_message>
<xml_diff>
--- a/20230414 - MCE123 Technology Development - Illicit Government Software Runtime Prevention Security Systems - v1.0.0.1.docx
+++ b/20230414 - MCE123 Technology Development - Illicit Government Software Runtime Prevention Security Systems - v1.0.0.1.docx
@@ -223,7 +223,7 @@
           <w:sz w:val="28"/>
           <w:szCs w:val="28"/>
         </w:rPr>
-        <w:t>4/14/2023 6:58:33 AM</w:t>
+        <w:t>4/14/2023 8:58:58 AM</w:t>
       </w:r>
     </w:p>
     <w:p>
@@ -627,7 +627,7 @@
     </w:p>
     <w:p>
       <w:pPr>
-        <w:ind w:left="360"/>
+        <w:ind w:left="720"/>
         <w:jc w:val="both"/>
         <w:rPr>
           <w:b/>
@@ -635,9 +635,6 @@
         </w:rPr>
       </w:pPr>
       <w:r>
-        <w:tab/>
-      </w:r>
-      <w:r>
         <w:rPr>
           <w:u w:val="single"/>
         </w:rPr>
@@ -663,7 +660,159 @@
           <w:bCs/>
           <w:color w:val="FF0000"/>
         </w:rPr>
-        <w:t xml:space="preserve">AT </w:t>
+        <w:t>AT SYSTEMS</w:t>
+      </w:r>
+      <w:r>
+        <w:rPr>
+          <w:b/>
+          <w:bCs/>
+        </w:rPr>
+        <w:t>;</w:t>
+      </w:r>
+      <w:r>
+        <w:rPr>
+          <w:b/>
+          <w:bCs/>
+        </w:rPr>
+        <w:t xml:space="preserve"> </w:t>
+      </w:r>
+      <w:r>
+        <w:rPr>
+          <w:color w:val="808080" w:themeColor="background1" w:themeShade="80"/>
+        </w:rPr>
+        <w:t xml:space="preserve">// </w:t>
+      </w:r>
+      <w:r>
+        <w:rPr>
+          <w:color w:val="808080" w:themeColor="background1" w:themeShade="80"/>
+        </w:rPr>
+        <w:t xml:space="preserve">ALLEGEDLY </w:t>
+      </w:r>
+      <w:r>
+        <w:rPr>
+          <w:color w:val="808080" w:themeColor="background1" w:themeShade="80"/>
+        </w:rPr>
+        <w:t>ARTIFICIAL TELEPATHY SYSTEMS, ALLEGEDLY PRODUCED BY THE CENTRAL INTELLIGENCE AGENCY</w:t>
+      </w:r>
+      <w:r>
+        <w:rPr>
+          <w:color w:val="808080" w:themeColor="background1" w:themeShade="80"/>
+        </w:rPr>
+        <w:t>.</w:t>
+      </w:r>
+    </w:p>
+    <w:p>
+      <w:pPr>
+        <w:ind w:left="720"/>
+        <w:jc w:val="both"/>
+        <w:rPr>
+          <w:b/>
+          <w:bCs/>
+        </w:rPr>
+      </w:pPr>
+      <w:r>
+        <w:rPr>
+          <w:u w:val="single"/>
+        </w:rPr>
+        <w:t>PREVENTION SECURITY SYSTEM</w:t>
+      </w:r>
+      <w:r>
+        <w:t>:</w:t>
+      </w:r>
+      <w:r>
+        <w:t xml:space="preserve"> </w:t>
+      </w:r>
+      <w:r>
+        <w:rPr>
+          <w:b/>
+          <w:bCs/>
+          <w:color w:val="FF0000"/>
+        </w:rPr>
+        <w:t xml:space="preserve">ANY </w:t>
+      </w:r>
+      <w:r>
+        <w:rPr>
+          <w:b/>
+          <w:bCs/>
+          <w:color w:val="FF0000"/>
+        </w:rPr>
+        <w:t>BLAMING MACHINE</w:t>
+      </w:r>
+      <w:r>
+        <w:rPr>
+          <w:b/>
+          <w:bCs/>
+        </w:rPr>
+        <w:t>;</w:t>
+      </w:r>
+      <w:r>
+        <w:rPr>
+          <w:b/>
+          <w:bCs/>
+        </w:rPr>
+        <w:t xml:space="preserve"> </w:t>
+      </w:r>
+      <w:r>
+        <w:rPr>
+          <w:color w:val="808080" w:themeColor="background1" w:themeShade="80"/>
+        </w:rPr>
+        <w:t xml:space="preserve">// </w:t>
+      </w:r>
+      <w:r>
+        <w:rPr>
+          <w:color w:val="808080" w:themeColor="background1" w:themeShade="80"/>
+        </w:rPr>
+        <w:t xml:space="preserve">ALLEGEDLY ILLICIT </w:t>
+      </w:r>
+      <w:r>
+        <w:rPr>
+          <w:color w:val="808080" w:themeColor="background1" w:themeShade="80"/>
+        </w:rPr>
+        <w:t>BLAMING SOFTWARE PRODUCED BY THE DEPARTMENT OF DEFENSE</w:t>
+      </w:r>
+      <w:r>
+        <w:rPr>
+          <w:color w:val="808080" w:themeColor="background1" w:themeShade="80"/>
+        </w:rPr>
+        <w:t>.</w:t>
+      </w:r>
+    </w:p>
+    <w:p>
+      <w:pPr>
+        <w:ind w:left="720"/>
+        <w:jc w:val="both"/>
+        <w:rPr>
+          <w:b/>
+          <w:bCs/>
+        </w:rPr>
+      </w:pPr>
+      <w:r>
+        <w:rPr>
+          <w:u w:val="single"/>
+        </w:rPr>
+        <w:t>PREVENTION SECURITY SYSTEM</w:t>
+      </w:r>
+      <w:r>
+        <w:t>:</w:t>
+      </w:r>
+      <w:r>
+        <w:t xml:space="preserve"> </w:t>
+      </w:r>
+      <w:r>
+        <w:rPr>
+          <w:b/>
+          <w:bCs/>
+          <w:color w:val="FF0000"/>
+        </w:rPr>
+        <w:t xml:space="preserve">ANY </w:t>
+      </w:r>
+      <w:r>
+        <w:rPr>
+          <w:b/>
+          <w:bCs/>
+          <w:color w:val="FF0000"/>
+        </w:rPr>
+        <w:t xml:space="preserve">CHRISTOPHER HAWKINSON </w:t>
       </w:r>
       <w:proofErr w:type="gramStart"/>
       <w:r>
@@ -672,6 +821,87 @@
           <w:bCs/>
           <w:color w:val="FF0000"/>
         </w:rPr>
+        <w:t>INSTANCES</w:t>
+      </w:r>
+      <w:r>
+        <w:rPr>
+          <w:b/>
+          <w:bCs/>
+        </w:rPr>
+        <w:t>;</w:t>
+      </w:r>
+      <w:r>
+        <w:rPr>
+          <w:b/>
+          <w:bCs/>
+        </w:rPr>
+        <w:t xml:space="preserve">   </w:t>
+      </w:r>
+      <w:proofErr w:type="gramEnd"/>
+      <w:r>
+        <w:rPr>
+          <w:b/>
+          <w:bCs/>
+        </w:rPr>
+        <w:t xml:space="preserve">                                  </w:t>
+      </w:r>
+      <w:r>
+        <w:rPr>
+          <w:color w:val="808080" w:themeColor="background1" w:themeShade="80"/>
+        </w:rPr>
+        <w:t xml:space="preserve">// </w:t>
+      </w:r>
+      <w:r>
+        <w:rPr>
+          <w:color w:val="808080" w:themeColor="background1" w:themeShade="80"/>
+        </w:rPr>
+        <w:t>CHRIS HAWKINSON’S COMPUTER SYSTEM.</w:t>
+      </w:r>
+    </w:p>
+    <w:p>
+      <w:pPr>
+        <w:ind w:left="720"/>
+        <w:jc w:val="both"/>
+        <w:rPr>
+          <w:b/>
+          <w:bCs/>
+        </w:rPr>
+      </w:pPr>
+      <w:r>
+        <w:rPr>
+          <w:u w:val="single"/>
+        </w:rPr>
+        <w:t>PREVENTION SECURITY SYSTEM</w:t>
+      </w:r>
+      <w:r>
+        <w:t>:</w:t>
+      </w:r>
+      <w:r>
+        <w:t xml:space="preserve"> </w:t>
+      </w:r>
+      <w:r>
+        <w:rPr>
+          <w:b/>
+          <w:bCs/>
+          <w:color w:val="FF0000"/>
+        </w:rPr>
+        <w:t xml:space="preserve">ANY </w:t>
+      </w:r>
+      <w:r>
+        <w:rPr>
+          <w:b/>
+          <w:bCs/>
+          <w:color w:val="FF0000"/>
+        </w:rPr>
+        <w:t xml:space="preserve">CHRISTOPHER HAWKINSON </w:t>
+      </w:r>
+      <w:proofErr w:type="gramStart"/>
+      <w:r>
+        <w:rPr>
+          <w:b/>
+          <w:bCs/>
+          <w:color w:val="FF0000"/>
+        </w:rPr>
         <w:t>SYSTEMS</w:t>
       </w:r>
       <w:r>
@@ -681,7 +911,410 @@
         </w:rPr>
         <w:t>;</w:t>
       </w:r>
+      <w:r>
+        <w:rPr>
+          <w:b/>
+          <w:bCs/>
+        </w:rPr>
+        <w:t xml:space="preserve">   </w:t>
+      </w:r>
       <w:proofErr w:type="gramEnd"/>
+      <w:r>
+        <w:rPr>
+          <w:b/>
+          <w:bCs/>
+        </w:rPr>
+        <w:t xml:space="preserve">                                      </w:t>
+      </w:r>
+      <w:r>
+        <w:rPr>
+          <w:color w:val="808080" w:themeColor="background1" w:themeShade="80"/>
+        </w:rPr>
+        <w:t>//</w:t>
+      </w:r>
+      <w:r>
+        <w:rPr>
+          <w:color w:val="808080" w:themeColor="background1" w:themeShade="80"/>
+        </w:rPr>
+        <w:t xml:space="preserve"> CHRIS HAWKINSON’S COMPUTER SYSTEM.</w:t>
+      </w:r>
+    </w:p>
+    <w:p>
+      <w:pPr>
+        <w:ind w:left="720"/>
+        <w:jc w:val="both"/>
+        <w:rPr>
+          <w:b/>
+          <w:bCs/>
+        </w:rPr>
+      </w:pPr>
+      <w:r>
+        <w:rPr>
+          <w:u w:val="single"/>
+        </w:rPr>
+        <w:t>PREVENTION SECURITY SYSTEM</w:t>
+      </w:r>
+      <w:r>
+        <w:t>:</w:t>
+      </w:r>
+      <w:r>
+        <w:t xml:space="preserve"> </w:t>
+      </w:r>
+      <w:r>
+        <w:rPr>
+          <w:b/>
+          <w:bCs/>
+          <w:color w:val="FF0000"/>
+        </w:rPr>
+        <w:t xml:space="preserve">ANY </w:t>
+      </w:r>
+      <w:r>
+        <w:rPr>
+          <w:b/>
+          <w:bCs/>
+          <w:color w:val="FF0000"/>
+        </w:rPr>
+        <w:t>COMPLACENCY SECURITY SYSTEMS</w:t>
+      </w:r>
+      <w:r>
+        <w:rPr>
+          <w:b/>
+          <w:bCs/>
+        </w:rPr>
+        <w:t>;</w:t>
+      </w:r>
+      <w:r>
+        <w:rPr>
+          <w:b/>
+          <w:bCs/>
+        </w:rPr>
+        <w:t xml:space="preserve"> </w:t>
+      </w:r>
+      <w:r>
+        <w:rPr>
+          <w:color w:val="808080" w:themeColor="background1" w:themeShade="80"/>
+        </w:rPr>
+        <w:t xml:space="preserve">// </w:t>
+      </w:r>
+      <w:r>
+        <w:rPr>
+          <w:color w:val="808080" w:themeColor="background1" w:themeShade="80"/>
+        </w:rPr>
+        <w:t xml:space="preserve">ALLEGEDLY </w:t>
+      </w:r>
+      <w:r>
+        <w:rPr>
+          <w:color w:val="808080" w:themeColor="background1" w:themeShade="80"/>
+        </w:rPr>
+        <w:t>USED TO CAUSE COMPLACENCY UTILIZING MIND CONTROL ON AN UNWILLING VICTIM</w:t>
+      </w:r>
+      <w:r>
+        <w:rPr>
+          <w:color w:val="808080" w:themeColor="background1" w:themeShade="80"/>
+        </w:rPr>
+        <w:t>.</w:t>
+      </w:r>
+    </w:p>
+    <w:p>
+      <w:pPr>
+        <w:ind w:left="720"/>
+        <w:jc w:val="both"/>
+        <w:rPr>
+          <w:b/>
+          <w:bCs/>
+        </w:rPr>
+      </w:pPr>
+      <w:r>
+        <w:rPr>
+          <w:u w:val="single"/>
+        </w:rPr>
+        <w:t>PREVENTION SECURITY SYSTEM</w:t>
+      </w:r>
+      <w:r>
+        <w:t>:</w:t>
+      </w:r>
+      <w:r>
+        <w:t xml:space="preserve"> </w:t>
+      </w:r>
+      <w:r>
+        <w:rPr>
+          <w:b/>
+          <w:bCs/>
+          <w:color w:val="FF0000"/>
+        </w:rPr>
+        <w:t xml:space="preserve">ANY </w:t>
+      </w:r>
+      <w:r>
+        <w:rPr>
+          <w:b/>
+          <w:bCs/>
+          <w:color w:val="FF0000"/>
+        </w:rPr>
+        <w:t>EX-JUDICIAL EXECUTION SYSTEMS</w:t>
+      </w:r>
+      <w:r>
+        <w:rPr>
+          <w:b/>
+          <w:bCs/>
+        </w:rPr>
+        <w:t>;</w:t>
+      </w:r>
+      <w:r>
+        <w:rPr>
+          <w:b/>
+          <w:bCs/>
+        </w:rPr>
+        <w:t xml:space="preserve"> </w:t>
+      </w:r>
+      <w:r>
+        <w:rPr>
+          <w:color w:val="808080" w:themeColor="background1" w:themeShade="80"/>
+        </w:rPr>
+        <w:t xml:space="preserve">// </w:t>
+      </w:r>
+      <w:r>
+        <w:rPr>
+          <w:color w:val="808080" w:themeColor="background1" w:themeShade="80"/>
+        </w:rPr>
+        <w:t>ALLEGEDLY ILLICIT EX-JUDICIAL EXECUTION SOFTWARE DEVELOPED BY CHRIS HAWKINSON OR OTHER FORMER OR CURRENT FEDERAL EMPLOYEES.</w:t>
+      </w:r>
+    </w:p>
+    <w:p>
+      <w:pPr>
+        <w:tabs>
+          <w:tab w:val="left" w:pos="720"/>
+        </w:tabs>
+        <w:ind w:left="720"/>
+        <w:jc w:val="both"/>
+        <w:rPr>
+          <w:b/>
+          <w:bCs/>
+        </w:rPr>
+      </w:pPr>
+      <w:r>
+        <w:rPr>
+          <w:u w:val="single"/>
+        </w:rPr>
+        <w:t>PREVENTION SECURITY SYSTEM</w:t>
+      </w:r>
+      <w:r>
+        <w:t>:</w:t>
+      </w:r>
+      <w:r>
+        <w:t xml:space="preserve"> </w:t>
+      </w:r>
+      <w:r>
+        <w:rPr>
+          <w:b/>
+          <w:bCs/>
+          <w:color w:val="FF0000"/>
+        </w:rPr>
+        <w:t xml:space="preserve">ANY </w:t>
+      </w:r>
+      <w:r>
+        <w:rPr>
+          <w:b/>
+          <w:bCs/>
+          <w:color w:val="FF0000"/>
+        </w:rPr>
+        <w:t>EYE DAMAGING SYSTEMS</w:t>
+      </w:r>
+      <w:r>
+        <w:rPr>
+          <w:b/>
+          <w:bCs/>
+        </w:rPr>
+        <w:t>;</w:t>
+      </w:r>
+      <w:r>
+        <w:rPr>
+          <w:b/>
+          <w:bCs/>
+        </w:rPr>
+        <w:t xml:space="preserve"> </w:t>
+      </w:r>
+      <w:r>
+        <w:rPr>
+          <w:color w:val="808080" w:themeColor="background1" w:themeShade="80"/>
+        </w:rPr>
+        <w:t xml:space="preserve">// </w:t>
+      </w:r>
+      <w:r>
+        <w:rPr>
+          <w:color w:val="808080" w:themeColor="background1" w:themeShade="80"/>
+        </w:rPr>
+        <w:t xml:space="preserve">ALLEGEDLY USED TO CONDUCT OFFENSIVE </w:t>
+      </w:r>
+      <w:r>
+        <w:rPr>
+          <w:color w:val="808080" w:themeColor="background1" w:themeShade="80"/>
+        </w:rPr>
+        <w:t xml:space="preserve">WAR CRIMINAL </w:t>
+      </w:r>
+      <w:r>
+        <w:rPr>
+          <w:color w:val="808080" w:themeColor="background1" w:themeShade="80"/>
+        </w:rPr>
+        <w:t xml:space="preserve">ACTS TOWARDS </w:t>
+      </w:r>
+      <w:r>
+        <w:rPr>
+          <w:color w:val="808080" w:themeColor="background1" w:themeShade="80"/>
+        </w:rPr>
+        <w:t xml:space="preserve">THE EYES OF </w:t>
+      </w:r>
+      <w:r>
+        <w:rPr>
+          <w:color w:val="808080" w:themeColor="background1" w:themeShade="80"/>
+        </w:rPr>
+        <w:t>PATRICK R. MCELHINEY.</w:t>
+      </w:r>
+    </w:p>
+    <w:p>
+      <w:pPr>
+        <w:ind w:left="720"/>
+        <w:jc w:val="both"/>
+        <w:rPr>
+          <w:b/>
+          <w:bCs/>
+        </w:rPr>
+      </w:pPr>
+      <w:r>
+        <w:rPr>
+          <w:u w:val="single"/>
+        </w:rPr>
+        <w:t>PREVENTION SECURITY SYSTEM</w:t>
+      </w:r>
+      <w:r>
+        <w:t>:</w:t>
+      </w:r>
+      <w:r>
+        <w:t xml:space="preserve"> </w:t>
+      </w:r>
+      <w:r>
+        <w:rPr>
+          <w:b/>
+          <w:bCs/>
+          <w:color w:val="FF0000"/>
+        </w:rPr>
+        <w:t xml:space="preserve">ANY </w:t>
+      </w:r>
+      <w:r>
+        <w:rPr>
+          <w:b/>
+          <w:bCs/>
+          <w:color w:val="FF0000"/>
+        </w:rPr>
+        <w:t>ICC COURT SYSTEMS</w:t>
+      </w:r>
+      <w:r>
+        <w:rPr>
+          <w:b/>
+          <w:bCs/>
+        </w:rPr>
+        <w:t>;</w:t>
+      </w:r>
+      <w:r>
+        <w:rPr>
+          <w:b/>
+          <w:bCs/>
+        </w:rPr>
+        <w:t xml:space="preserve"> </w:t>
+      </w:r>
+      <w:r>
+        <w:rPr>
+          <w:color w:val="808080" w:themeColor="background1" w:themeShade="80"/>
+        </w:rPr>
+        <w:t xml:space="preserve">// </w:t>
+      </w:r>
+      <w:r>
+        <w:rPr>
+          <w:color w:val="808080" w:themeColor="background1" w:themeShade="80"/>
+        </w:rPr>
+        <w:t>ALLEGEDLY CHRIS HAWKINSON’S COMPUTER SYSTEM.</w:t>
+      </w:r>
+    </w:p>
+    <w:p>
+      <w:pPr>
+        <w:ind w:left="720"/>
+        <w:jc w:val="both"/>
+        <w:rPr>
+          <w:b/>
+          <w:bCs/>
+        </w:rPr>
+      </w:pPr>
+      <w:r>
+        <w:rPr>
+          <w:u w:val="single"/>
+        </w:rPr>
+        <w:t>PREVENTION SECURITY SYSTEM</w:t>
+      </w:r>
+      <w:r>
+        <w:t>:</w:t>
+      </w:r>
+      <w:r>
+        <w:t xml:space="preserve"> </w:t>
+      </w:r>
+      <w:r>
+        <w:rPr>
+          <w:b/>
+          <w:bCs/>
+          <w:color w:val="FF0000"/>
+        </w:rPr>
+        <w:t xml:space="preserve">ANY </w:t>
+      </w:r>
+      <w:r>
+        <w:rPr>
+          <w:b/>
+          <w:bCs/>
+          <w:color w:val="FF0000"/>
+        </w:rPr>
+        <w:t>INTERNATIONAL CRIMINAL COURT INSTANCES</w:t>
+      </w:r>
+      <w:r>
+        <w:rPr>
+          <w:b/>
+          <w:bCs/>
+        </w:rPr>
+        <w:t>;</w:t>
+      </w:r>
+      <w:r>
+        <w:rPr>
+          <w:b/>
+          <w:bCs/>
+        </w:rPr>
+        <w:t xml:space="preserve"> </w:t>
+      </w:r>
+      <w:r>
+        <w:rPr>
+          <w:color w:val="808080" w:themeColor="background1" w:themeShade="80"/>
+        </w:rPr>
+        <w:t xml:space="preserve">// </w:t>
+      </w:r>
+      <w:r>
+        <w:rPr>
+          <w:color w:val="808080" w:themeColor="background1" w:themeShade="80"/>
+        </w:rPr>
+        <w:t xml:space="preserve">ALLEGEDLY </w:t>
+      </w:r>
+      <w:r>
+        <w:rPr>
+          <w:color w:val="808080" w:themeColor="background1" w:themeShade="80"/>
+        </w:rPr>
+        <w:t>JOEY MENDONCA</w:t>
+      </w:r>
+      <w:r>
+        <w:rPr>
+          <w:color w:val="808080" w:themeColor="background1" w:themeShade="80"/>
+        </w:rPr>
+        <w:t>’S COMPUTER SYSTEM</w:t>
+      </w:r>
+      <w:r>
+        <w:rPr>
+          <w:color w:val="808080" w:themeColor="background1" w:themeShade="80"/>
+        </w:rPr>
+        <w:t>.</w:t>
+      </w:r>
     </w:p>
     <w:p>
       <w:pPr>
@@ -721,7 +1354,7 @@
           <w:bCs/>
           <w:color w:val="FF0000"/>
         </w:rPr>
-        <w:t xml:space="preserve">BLAMING </w:t>
+        <w:t xml:space="preserve">INVERSION </w:t>
       </w:r>
       <w:proofErr w:type="gramStart"/>
       <w:r>
@@ -730,7 +1363,7 @@
           <w:bCs/>
           <w:color w:val="FF0000"/>
         </w:rPr>
-        <w:t>MACHINE</w:t>
+        <w:t>SOFTWARE</w:t>
       </w:r>
       <w:r>
         <w:rPr>
@@ -743,7 +1376,7 @@
     </w:p>
     <w:p>
       <w:pPr>
-        <w:ind w:left="360"/>
+        <w:ind w:left="720"/>
         <w:jc w:val="both"/>
         <w:rPr>
           <w:b/>
@@ -751,12 +1384,10 @@
         </w:rPr>
       </w:pPr>
       <w:r>
-        <w:tab/>
-      </w:r>
-      <w:r>
         <w:rPr>
           <w:u w:val="single"/>
         </w:rPr>
+        <w:lastRenderedPageBreak/>
         <w:t>PREVENTION SECURITY SYSTEM</w:t>
       </w:r>
       <w:r>
@@ -779,16 +1410,7 @@
           <w:bCs/>
           <w:color w:val="FF0000"/>
         </w:rPr>
-        <w:t xml:space="preserve">CHRISTOPHER HAWKINSON </w:t>
-      </w:r>
-      <w:proofErr w:type="gramStart"/>
-      <w:r>
-        <w:rPr>
-          <w:b/>
-          <w:bCs/>
-          <w:color w:val="FF0000"/>
-        </w:rPr>
-        <w:t>INSTANCES</w:t>
+        <w:t>JOEY MENDONCA INSTANCES</w:t>
       </w:r>
       <w:r>
         <w:rPr>
@@ -797,11 +1419,35 @@
         </w:rPr>
         <w:t>;</w:t>
       </w:r>
-      <w:proofErr w:type="gramEnd"/>
+      <w:r>
+        <w:rPr>
+          <w:b/>
+          <w:bCs/>
+        </w:rPr>
+        <w:t xml:space="preserve"> </w:t>
+      </w:r>
+      <w:r>
+        <w:rPr>
+          <w:color w:val="808080" w:themeColor="background1" w:themeShade="80"/>
+        </w:rPr>
+        <w:t xml:space="preserve">// </w:t>
+      </w:r>
+      <w:r>
+        <w:rPr>
+          <w:color w:val="808080" w:themeColor="background1" w:themeShade="80"/>
+        </w:rPr>
+        <w:t>JOEY MENDONCA’S COMPUTER SYSTEM</w:t>
+      </w:r>
+      <w:r>
+        <w:rPr>
+          <w:color w:val="808080" w:themeColor="background1" w:themeShade="80"/>
+        </w:rPr>
+        <w:t>.</w:t>
+      </w:r>
     </w:p>
     <w:p>
       <w:pPr>
-        <w:ind w:left="360"/>
+        <w:ind w:left="720"/>
         <w:jc w:val="both"/>
         <w:rPr>
           <w:b/>
@@ -809,9 +1455,6 @@
         </w:rPr>
       </w:pPr>
       <w:r>
-        <w:tab/>
-      </w:r>
-      <w:r>
         <w:rPr>
           <w:u w:val="single"/>
         </w:rPr>
@@ -837,16 +1480,7 @@
           <w:bCs/>
           <w:color w:val="FF0000"/>
         </w:rPr>
-        <w:t xml:space="preserve">CHRISTOPHER HAWKINSON </w:t>
-      </w:r>
-      <w:proofErr w:type="gramStart"/>
-      <w:r>
-        <w:rPr>
-          <w:b/>
-          <w:bCs/>
-          <w:color w:val="FF0000"/>
-        </w:rPr>
-        <w:t>SYSTEMS</w:t>
+        <w:t>JOSH PRUIT INSTANCES</w:t>
       </w:r>
       <w:r>
         <w:rPr>
@@ -855,11 +1489,29 @@
         </w:rPr>
         <w:t>;</w:t>
       </w:r>
-      <w:proofErr w:type="gramEnd"/>
+      <w:r>
+        <w:rPr>
+          <w:b/>
+          <w:bCs/>
+        </w:rPr>
+        <w:t xml:space="preserve"> </w:t>
+      </w:r>
+      <w:r>
+        <w:rPr>
+          <w:color w:val="808080" w:themeColor="background1" w:themeShade="80"/>
+        </w:rPr>
+        <w:t xml:space="preserve">// </w:t>
+      </w:r>
+      <w:r>
+        <w:rPr>
+          <w:color w:val="808080" w:themeColor="background1" w:themeShade="80"/>
+        </w:rPr>
+        <w:t>JOSH PRUIT’S                   COMPUTER SYSTEM.</w:t>
+      </w:r>
     </w:p>
     <w:p>
       <w:pPr>
-        <w:ind w:left="360"/>
+        <w:ind w:left="720"/>
         <w:jc w:val="both"/>
         <w:rPr>
           <w:b/>
@@ -867,9 +1519,6 @@
         </w:rPr>
       </w:pPr>
       <w:r>
-        <w:tab/>
-      </w:r>
-      <w:r>
         <w:rPr>
           <w:u w:val="single"/>
         </w:rPr>
@@ -895,7 +1544,7 @@
           <w:bCs/>
           <w:color w:val="FF0000"/>
         </w:rPr>
-        <w:t xml:space="preserve">COMPLACENCY SECURITY </w:t>
+        <w:t xml:space="preserve">JULIE CHAMBERLAIN </w:t>
       </w:r>
       <w:proofErr w:type="gramStart"/>
       <w:r>
@@ -904,7 +1553,7 @@
           <w:bCs/>
           <w:color w:val="FF0000"/>
         </w:rPr>
-        <w:t>SYSTEMS</w:t>
+        <w:t>INSTANCES</w:t>
       </w:r>
       <w:r>
         <w:rPr>
@@ -913,11 +1562,43 @@
         </w:rPr>
         <w:t>;</w:t>
       </w:r>
+      <w:r>
+        <w:rPr>
+          <w:b/>
+          <w:bCs/>
+        </w:rPr>
+        <w:t xml:space="preserve">   </w:t>
+      </w:r>
       <w:proofErr w:type="gramEnd"/>
+      <w:r>
+        <w:rPr>
+          <w:b/>
+          <w:bCs/>
+        </w:rPr>
+        <w:t xml:space="preserve">                                             </w:t>
+      </w:r>
+      <w:r>
+        <w:rPr>
+          <w:color w:val="808080" w:themeColor="background1" w:themeShade="80"/>
+        </w:rPr>
+        <w:t xml:space="preserve">// </w:t>
+      </w:r>
+      <w:r>
+        <w:rPr>
+          <w:color w:val="808080" w:themeColor="background1" w:themeShade="80"/>
+        </w:rPr>
+        <w:t>JULIE CHAMBERLAIN’S COMPUTER SYSTEM</w:t>
+      </w:r>
+      <w:r>
+        <w:rPr>
+          <w:color w:val="808080" w:themeColor="background1" w:themeShade="80"/>
+        </w:rPr>
+        <w:t>.</w:t>
+      </w:r>
     </w:p>
     <w:p>
       <w:pPr>
-        <w:ind w:left="360"/>
+        <w:ind w:left="720"/>
         <w:jc w:val="both"/>
         <w:rPr>
           <w:b/>
@@ -925,9 +1606,6 @@
         </w:rPr>
       </w:pPr>
       <w:r>
-        <w:tab/>
-      </w:r>
-      <w:r>
         <w:rPr>
           <w:u w:val="single"/>
         </w:rPr>
@@ -953,16 +1631,7 @@
           <w:bCs/>
           <w:color w:val="FF0000"/>
         </w:rPr>
-        <w:t xml:space="preserve">EX-JUDICIAL EXECUTION </w:t>
-      </w:r>
-      <w:proofErr w:type="gramStart"/>
-      <w:r>
-        <w:rPr>
-          <w:b/>
-          <w:bCs/>
-          <w:color w:val="FF0000"/>
-        </w:rPr>
-        <w:t>SYSTEMS</w:t>
+        <w:t>LASER STRIKE SOFTWARE</w:t>
       </w:r>
       <w:r>
         <w:rPr>
@@ -971,11 +1640,41 @@
         </w:rPr>
         <w:t>;</w:t>
       </w:r>
-      <w:proofErr w:type="gramEnd"/>
+      <w:r>
+        <w:rPr>
+          <w:b/>
+          <w:bCs/>
+        </w:rPr>
+        <w:t xml:space="preserve"> </w:t>
+      </w:r>
+      <w:r>
+        <w:rPr>
+          <w:color w:val="808080" w:themeColor="background1" w:themeShade="80"/>
+        </w:rPr>
+        <w:t xml:space="preserve">// </w:t>
+      </w:r>
+      <w:r>
+        <w:rPr>
+          <w:color w:val="808080" w:themeColor="background1" w:themeShade="80"/>
+        </w:rPr>
+        <w:t xml:space="preserve">ALLEGEDLY </w:t>
+      </w:r>
+      <w:r>
+        <w:rPr>
+          <w:color w:val="808080" w:themeColor="background1" w:themeShade="80"/>
+        </w:rPr>
+        <w:t>ILLICIT EX-JUDICIAL EXECUTION SOFTWARE DEVELOPED BY CHRIS HAWKINSON OR OTHER FORMER OR CURRENT FEDERAL EMPLOYEES</w:t>
+      </w:r>
+      <w:r>
+        <w:rPr>
+          <w:color w:val="808080" w:themeColor="background1" w:themeShade="80"/>
+        </w:rPr>
+        <w:t>.</w:t>
+      </w:r>
     </w:p>
     <w:p>
       <w:pPr>
-        <w:ind w:left="360"/>
+        <w:ind w:left="720"/>
         <w:jc w:val="both"/>
         <w:rPr>
           <w:b/>
@@ -983,9 +1682,6 @@
         </w:rPr>
       </w:pPr>
       <w:r>
-        <w:tab/>
-      </w:r>
-      <w:r>
         <w:rPr>
           <w:u w:val="single"/>
         </w:rPr>
@@ -1011,16 +1707,7 @@
           <w:bCs/>
           <w:color w:val="FF0000"/>
         </w:rPr>
-        <w:t xml:space="preserve">EYE DAMAGING </w:t>
-      </w:r>
-      <w:proofErr w:type="gramStart"/>
-      <w:r>
-        <w:rPr>
-          <w:b/>
-          <w:bCs/>
-          <w:color w:val="FF0000"/>
-        </w:rPr>
-        <w:t>SYSTEMS</w:t>
+        <w:t>MIND PHREAK SYSTEMS</w:t>
       </w:r>
       <w:r>
         <w:rPr>
@@ -1029,11 +1716,44 @@
         </w:rPr>
         <w:t>;</w:t>
       </w:r>
-      <w:proofErr w:type="gramEnd"/>
+      <w:r>
+        <w:rPr>
+          <w:b/>
+          <w:bCs/>
+        </w:rPr>
+        <w:t xml:space="preserve"> </w:t>
+      </w:r>
+      <w:r>
+        <w:rPr>
+          <w:color w:val="808080" w:themeColor="background1" w:themeShade="80"/>
+        </w:rPr>
+        <w:t xml:space="preserve">// </w:t>
+      </w:r>
+      <w:r>
+        <w:rPr>
+          <w:color w:val="808080" w:themeColor="background1" w:themeShade="80"/>
+        </w:rPr>
+        <w:t xml:space="preserve">ALLEGEDLY USED TO CONDUCT </w:t>
+      </w:r>
+      <w:r>
+        <w:rPr>
+          <w:color w:val="808080" w:themeColor="background1" w:themeShade="80"/>
+        </w:rPr>
+        <w:t xml:space="preserve">MENTAL HEALTH </w:t>
+      </w:r>
+      <w:r>
+        <w:rPr>
+          <w:color w:val="808080" w:themeColor="background1" w:themeShade="80"/>
+        </w:rPr>
+        <w:t>WAR CRIMES FROM THE PENTAGON BY DEPARTMENT OF DEFENSE EMPLOYEES.</w:t>
+      </w:r>
     </w:p>
     <w:p>
       <w:pPr>
-        <w:ind w:left="360"/>
+        <w:tabs>
+          <w:tab w:val="left" w:pos="810"/>
+        </w:tabs>
+        <w:ind w:left="720"/>
         <w:jc w:val="both"/>
         <w:rPr>
           <w:b/>
@@ -1041,9 +1761,6 @@
         </w:rPr>
       </w:pPr>
       <w:r>
-        <w:tab/>
-      </w:r>
-      <w:r>
         <w:rPr>
           <w:u w:val="single"/>
         </w:rPr>
@@ -1069,24 +1786,7 @@
           <w:bCs/>
           <w:color w:val="FF0000"/>
         </w:rPr>
-        <w:t>I</w:t>
-      </w:r>
-      <w:r>
-        <w:rPr>
-          <w:b/>
-          <w:bCs/>
-          <w:color w:val="FF0000"/>
-        </w:rPr>
-        <w:t xml:space="preserve">CC COURT </w:t>
-      </w:r>
-      <w:proofErr w:type="gramStart"/>
-      <w:r>
-        <w:rPr>
-          <w:b/>
-          <w:bCs/>
-          <w:color w:val="FF0000"/>
-        </w:rPr>
-        <w:t>SYSTEMS</w:t>
+        <w:t>MINDPHREAK SYSTEMS</w:t>
       </w:r>
       <w:r>
         <w:rPr>
@@ -1095,11 +1795,29 @@
         </w:rPr>
         <w:t>;</w:t>
       </w:r>
-      <w:proofErr w:type="gramEnd"/>
+      <w:r>
+        <w:rPr>
+          <w:b/>
+          <w:bCs/>
+        </w:rPr>
+        <w:t xml:space="preserve"> </w:t>
+      </w:r>
+      <w:r>
+        <w:rPr>
+          <w:color w:val="808080" w:themeColor="background1" w:themeShade="80"/>
+        </w:rPr>
+        <w:t xml:space="preserve">// </w:t>
+      </w:r>
+      <w:r>
+        <w:rPr>
+          <w:color w:val="808080" w:themeColor="background1" w:themeShade="80"/>
+        </w:rPr>
+        <w:t>ALLEGEDLY USED TO CONDUCT MENTAL HEALTH WAR CRIMES FROM THE PENTAGON BY DEPARTMENT OF DEFENSE EMPLOYEES.</w:t>
+      </w:r>
     </w:p>
     <w:p>
       <w:pPr>
-        <w:ind w:left="360"/>
+        <w:ind w:left="720"/>
         <w:jc w:val="both"/>
         <w:rPr>
           <w:b/>
@@ -1107,9 +1825,6 @@
         </w:rPr>
       </w:pPr>
       <w:r>
-        <w:tab/>
-      </w:r>
-      <w:r>
         <w:rPr>
           <w:u w:val="single"/>
         </w:rPr>
@@ -1135,48 +1850,7 @@
           <w:bCs/>
           <w:color w:val="FF0000"/>
         </w:rPr>
-        <w:t>I</w:t>
-      </w:r>
-      <w:r>
-        <w:rPr>
-          <w:b/>
-          <w:bCs/>
-          <w:color w:val="FF0000"/>
-        </w:rPr>
-        <w:t xml:space="preserve">NTERNATIONAL </w:t>
-      </w:r>
-      <w:r>
-        <w:rPr>
-          <w:b/>
-          <w:bCs/>
-          <w:color w:val="FF0000"/>
-        </w:rPr>
-        <w:t>C</w:t>
-      </w:r>
-      <w:r>
-        <w:rPr>
-          <w:b/>
-          <w:bCs/>
-          <w:color w:val="FF0000"/>
-        </w:rPr>
-        <w:t xml:space="preserve">RIMINAL </w:t>
-      </w:r>
-      <w:r>
-        <w:rPr>
-          <w:b/>
-          <w:bCs/>
-          <w:color w:val="FF0000"/>
-        </w:rPr>
-        <w:t xml:space="preserve">COURT </w:t>
-      </w:r>
-      <w:proofErr w:type="gramStart"/>
-      <w:r>
-        <w:rPr>
-          <w:b/>
-          <w:bCs/>
-          <w:color w:val="FF0000"/>
-        </w:rPr>
-        <w:t>INSTANCES</w:t>
+        <w:t>NICOTINE GUM COMMAND SYSTEM</w:t>
       </w:r>
       <w:r>
         <w:rPr>
@@ -1185,11 +1859,35 @@
         </w:rPr>
         <w:t>;</w:t>
       </w:r>
-      <w:proofErr w:type="gramEnd"/>
+      <w:r>
+        <w:rPr>
+          <w:b/>
+          <w:bCs/>
+        </w:rPr>
+        <w:t xml:space="preserve"> </w:t>
+      </w:r>
+      <w:r>
+        <w:rPr>
+          <w:color w:val="808080" w:themeColor="background1" w:themeShade="80"/>
+        </w:rPr>
+        <w:t xml:space="preserve">// </w:t>
+      </w:r>
+      <w:r>
+        <w:rPr>
+          <w:color w:val="808080" w:themeColor="background1" w:themeShade="80"/>
+        </w:rPr>
+        <w:t xml:space="preserve">ALLEGEDLY USED TO </w:t>
+      </w:r>
+      <w:r>
+        <w:rPr>
+          <w:color w:val="808080" w:themeColor="background1" w:themeShade="80"/>
+        </w:rPr>
+        <w:t>MAKE PATRICK R. MCELHINEY CHEW NICOTINE GUM, EXCESSIVELY. ALLEGEDLY NOT IN RELATION TO ADMIRAL MICHAEL MULLEN.</w:t>
+      </w:r>
     </w:p>
     <w:p>
       <w:pPr>
-        <w:ind w:left="360"/>
+        <w:ind w:left="720"/>
         <w:jc w:val="both"/>
         <w:rPr>
           <w:b/>
@@ -1197,9 +1895,6 @@
         </w:rPr>
       </w:pPr>
       <w:r>
-        <w:tab/>
-      </w:r>
-      <w:r>
         <w:rPr>
           <w:u w:val="single"/>
         </w:rPr>
@@ -1225,16 +1920,7 @@
           <w:bCs/>
           <w:color w:val="FF0000"/>
         </w:rPr>
-        <w:t xml:space="preserve">INVERSION </w:t>
-      </w:r>
-      <w:proofErr w:type="gramStart"/>
-      <w:r>
-        <w:rPr>
-          <w:b/>
-          <w:bCs/>
-          <w:color w:val="FF0000"/>
-        </w:rPr>
-        <w:t>SOFTWARE</w:t>
+        <w:t>NICOTINE GUM COMMAND SYSTEMS</w:t>
       </w:r>
       <w:r>
         <w:rPr>
@@ -1243,11 +1929,41 @@
         </w:rPr>
         <w:t>;</w:t>
       </w:r>
-      <w:proofErr w:type="gramEnd"/>
+      <w:r>
+        <w:rPr>
+          <w:b/>
+          <w:bCs/>
+        </w:rPr>
+        <w:t xml:space="preserve"> </w:t>
+      </w:r>
+      <w:r>
+        <w:rPr>
+          <w:color w:val="808080" w:themeColor="background1" w:themeShade="80"/>
+        </w:rPr>
+        <w:t xml:space="preserve">// </w:t>
+      </w:r>
+      <w:r>
+        <w:rPr>
+          <w:color w:val="808080" w:themeColor="background1" w:themeShade="80"/>
+        </w:rPr>
+        <w:t>ALLEGEDLY USED TO MAKE PATRICK R. MCELHINEY CHEW NICOTINE GUM, EXCESSIVELY.</w:t>
+      </w:r>
+      <w:r>
+        <w:rPr>
+          <w:color w:val="808080" w:themeColor="background1" w:themeShade="80"/>
+        </w:rPr>
+        <w:t xml:space="preserve"> </w:t>
+      </w:r>
+      <w:r>
+        <w:rPr>
+          <w:color w:val="808080" w:themeColor="background1" w:themeShade="80"/>
+        </w:rPr>
+        <w:t>ALLEGEDLY NOT IN RELATION TO ADMIRAL MICHAEL MULLEN.</w:t>
+      </w:r>
     </w:p>
     <w:p>
       <w:pPr>
-        <w:ind w:left="360"/>
+        <w:ind w:left="720"/>
         <w:jc w:val="both"/>
         <w:rPr>
           <w:b/>
@@ -1255,9 +1971,6 @@
         </w:rPr>
       </w:pPr>
       <w:r>
-        <w:tab/>
-      </w:r>
-      <w:r>
         <w:rPr>
           <w:u w:val="single"/>
         </w:rPr>
@@ -1283,16 +1996,7 @@
           <w:bCs/>
           <w:color w:val="FF0000"/>
         </w:rPr>
-        <w:t xml:space="preserve">JOEY MENDONCA </w:t>
-      </w:r>
-      <w:proofErr w:type="gramStart"/>
-      <w:r>
-        <w:rPr>
-          <w:b/>
-          <w:bCs/>
-          <w:color w:val="FF0000"/>
-        </w:rPr>
-        <w:t>INSTANCES</w:t>
+        <w:t>NICOTINE GUM COMMAND</w:t>
       </w:r>
       <w:r>
         <w:rPr>
@@ -1301,11 +2005,41 @@
         </w:rPr>
         <w:t>;</w:t>
       </w:r>
-      <w:proofErr w:type="gramEnd"/>
+      <w:r>
+        <w:rPr>
+          <w:b/>
+          <w:bCs/>
+        </w:rPr>
+        <w:t xml:space="preserve"> </w:t>
+      </w:r>
+      <w:r>
+        <w:rPr>
+          <w:color w:val="808080" w:themeColor="background1" w:themeShade="80"/>
+        </w:rPr>
+        <w:t xml:space="preserve">// </w:t>
+      </w:r>
+      <w:r>
+        <w:rPr>
+          <w:color w:val="808080" w:themeColor="background1" w:themeShade="80"/>
+        </w:rPr>
+        <w:t>ALLEGEDLY USED TO MAKE PATRICK R. MCELHINEY CHEW NICOTINE GUM, EXCESSIVELY.</w:t>
+      </w:r>
+      <w:r>
+        <w:rPr>
+          <w:color w:val="808080" w:themeColor="background1" w:themeShade="80"/>
+        </w:rPr>
+        <w:t xml:space="preserve"> </w:t>
+      </w:r>
+      <w:r>
+        <w:rPr>
+          <w:color w:val="808080" w:themeColor="background1" w:themeShade="80"/>
+        </w:rPr>
+        <w:t>ALLEGEDLY NOT IN RELATION TO ADMIRAL MICHAEL MULLEN.</w:t>
+      </w:r>
     </w:p>
     <w:p>
       <w:pPr>
-        <w:ind w:left="360"/>
+        <w:ind w:left="720"/>
         <w:jc w:val="both"/>
         <w:rPr>
           <w:b/>
@@ -1313,9 +2047,6 @@
         </w:rPr>
       </w:pPr>
       <w:r>
-        <w:tab/>
-      </w:r>
-      <w:r>
         <w:rPr>
           <w:u w:val="single"/>
         </w:rPr>
@@ -1341,16 +2072,7 @@
           <w:bCs/>
           <w:color w:val="FF0000"/>
         </w:rPr>
-        <w:t xml:space="preserve">JOSH PRUIT </w:t>
-      </w:r>
-      <w:proofErr w:type="gramStart"/>
-      <w:r>
-        <w:rPr>
-          <w:b/>
-          <w:bCs/>
-          <w:color w:val="FF0000"/>
-        </w:rPr>
-        <w:t>INSTANCES</w:t>
+        <w:t>NICOTINE GUM SYSTEM</w:t>
       </w:r>
       <w:r>
         <w:rPr>
@@ -1359,11 +2081,41 @@
         </w:rPr>
         <w:t>;</w:t>
       </w:r>
-      <w:proofErr w:type="gramEnd"/>
+      <w:r>
+        <w:rPr>
+          <w:b/>
+          <w:bCs/>
+        </w:rPr>
+        <w:t xml:space="preserve"> </w:t>
+      </w:r>
+      <w:r>
+        <w:rPr>
+          <w:color w:val="808080" w:themeColor="background1" w:themeShade="80"/>
+        </w:rPr>
+        <w:t xml:space="preserve">// </w:t>
+      </w:r>
+      <w:r>
+        <w:rPr>
+          <w:color w:val="808080" w:themeColor="background1" w:themeShade="80"/>
+        </w:rPr>
+        <w:t>ALLEGEDLY USED TO MAKE PATRICK R. MCELHINEY CHEW NICOTINE GUM, EXCESSIVELY.</w:t>
+      </w:r>
+      <w:r>
+        <w:rPr>
+          <w:color w:val="808080" w:themeColor="background1" w:themeShade="80"/>
+        </w:rPr>
+        <w:t xml:space="preserve"> </w:t>
+      </w:r>
+      <w:r>
+        <w:rPr>
+          <w:color w:val="808080" w:themeColor="background1" w:themeShade="80"/>
+        </w:rPr>
+        <w:t>ALLEGEDLY NOT IN RELATION TO ADMIRAL MICHAEL MULLEN.</w:t>
+      </w:r>
     </w:p>
     <w:p>
       <w:pPr>
-        <w:ind w:left="360"/>
+        <w:ind w:left="720"/>
         <w:jc w:val="both"/>
         <w:rPr>
           <w:b/>
@@ -1371,12 +2123,10 @@
         </w:rPr>
       </w:pPr>
       <w:r>
-        <w:tab/>
-      </w:r>
-      <w:r>
         <w:rPr>
           <w:u w:val="single"/>
         </w:rPr>
+        <w:lastRenderedPageBreak/>
         <w:t>PREVENTION SECURITY SYSTEM</w:t>
       </w:r>
       <w:r>
@@ -1399,24 +2149,7 @@
           <w:bCs/>
           <w:color w:val="FF0000"/>
         </w:rPr>
-        <w:t>J</w:t>
-      </w:r>
-      <w:r>
-        <w:rPr>
-          <w:b/>
-          <w:bCs/>
-          <w:color w:val="FF0000"/>
-        </w:rPr>
-        <w:t xml:space="preserve">ULIE CHAMBERLAIN </w:t>
-      </w:r>
-      <w:proofErr w:type="gramStart"/>
-      <w:r>
-        <w:rPr>
-          <w:b/>
-          <w:bCs/>
-          <w:color w:val="FF0000"/>
-        </w:rPr>
-        <w:t>INSTANCES</w:t>
+        <w:t>NICOTINE GUM SYSTEMS</w:t>
       </w:r>
       <w:r>
         <w:rPr>
@@ -1425,11 +2158,41 @@
         </w:rPr>
         <w:t>;</w:t>
       </w:r>
-      <w:proofErr w:type="gramEnd"/>
+      <w:r>
+        <w:rPr>
+          <w:b/>
+          <w:bCs/>
+        </w:rPr>
+        <w:t xml:space="preserve"> </w:t>
+      </w:r>
+      <w:r>
+        <w:rPr>
+          <w:color w:val="808080" w:themeColor="background1" w:themeShade="80"/>
+        </w:rPr>
+        <w:t xml:space="preserve">// </w:t>
+      </w:r>
+      <w:r>
+        <w:rPr>
+          <w:color w:val="808080" w:themeColor="background1" w:themeShade="80"/>
+        </w:rPr>
+        <w:t>ALLEGEDLY USED TO MAKE PATRICK R. MCELHINEY CHEW NICOTINE GUM, EXCESSIVELY.</w:t>
+      </w:r>
+      <w:r>
+        <w:rPr>
+          <w:color w:val="808080" w:themeColor="background1" w:themeShade="80"/>
+        </w:rPr>
+        <w:t xml:space="preserve"> </w:t>
+      </w:r>
+      <w:r>
+        <w:rPr>
+          <w:color w:val="808080" w:themeColor="background1" w:themeShade="80"/>
+        </w:rPr>
+        <w:t>ALLEGEDLY NOT IN RELATION TO ADMIRAL MICHAEL MULLEN.</w:t>
+      </w:r>
     </w:p>
     <w:p>
       <w:pPr>
-        <w:ind w:left="360"/>
+        <w:ind w:left="720"/>
         <w:jc w:val="both"/>
         <w:rPr>
           <w:b/>
@@ -1437,9 +2200,6 @@
         </w:rPr>
       </w:pPr>
       <w:r>
-        <w:tab/>
-      </w:r>
-      <w:r>
         <w:rPr>
           <w:u w:val="single"/>
         </w:rPr>
@@ -1465,16 +2225,7 @@
           <w:bCs/>
           <w:color w:val="FF0000"/>
         </w:rPr>
-        <w:t xml:space="preserve">LASER STRIKE </w:t>
-      </w:r>
-      <w:proofErr w:type="gramStart"/>
-      <w:r>
-        <w:rPr>
-          <w:b/>
-          <w:bCs/>
-          <w:color w:val="FF0000"/>
-        </w:rPr>
-        <w:t>SOFTWARE</w:t>
+        <w:t>OFFENSIVE COMPUTER SYSTEM</w:t>
       </w:r>
       <w:r>
         <w:rPr>
@@ -1483,11 +2234,41 @@
         </w:rPr>
         <w:t>;</w:t>
       </w:r>
-      <w:proofErr w:type="gramEnd"/>
+      <w:r>
+        <w:rPr>
+          <w:b/>
+          <w:bCs/>
+        </w:rPr>
+        <w:t xml:space="preserve"> </w:t>
+      </w:r>
+      <w:r>
+        <w:rPr>
+          <w:color w:val="808080" w:themeColor="background1" w:themeShade="80"/>
+        </w:rPr>
+        <w:t xml:space="preserve">// </w:t>
+      </w:r>
+      <w:r>
+        <w:rPr>
+          <w:color w:val="808080" w:themeColor="background1" w:themeShade="80"/>
+        </w:rPr>
+        <w:t xml:space="preserve">ALLEGEDLY USED TO </w:t>
+      </w:r>
+      <w:r>
+        <w:rPr>
+          <w:color w:val="808080" w:themeColor="background1" w:themeShade="80"/>
+        </w:rPr>
+        <w:t>CONDUCT OFFENSIVE ACTS TOWARDS PATRICK R. MCELHINEY</w:t>
+      </w:r>
+      <w:r>
+        <w:rPr>
+          <w:color w:val="808080" w:themeColor="background1" w:themeShade="80"/>
+        </w:rPr>
+        <w:t>.</w:t>
+      </w:r>
     </w:p>
     <w:p>
       <w:pPr>
-        <w:ind w:left="360"/>
+        <w:ind w:left="720"/>
         <w:jc w:val="both"/>
         <w:rPr>
           <w:b/>
@@ -1495,9 +2276,6 @@
         </w:rPr>
       </w:pPr>
       <w:r>
-        <w:tab/>
-      </w:r>
-      <w:r>
         <w:rPr>
           <w:u w:val="single"/>
         </w:rPr>
@@ -1523,16 +2301,7 @@
           <w:bCs/>
           <w:color w:val="FF0000"/>
         </w:rPr>
-        <w:t xml:space="preserve">MIND PHREAK </w:t>
-      </w:r>
-      <w:proofErr w:type="gramStart"/>
-      <w:r>
-        <w:rPr>
-          <w:b/>
-          <w:bCs/>
-          <w:color w:val="FF0000"/>
-        </w:rPr>
-        <w:t>SYSTEMS</w:t>
+        <w:t>PATRICK</w:t>
       </w:r>
       <w:r>
         <w:rPr>
@@ -1541,11 +2310,28 @@
         </w:rPr>
         <w:t>;</w:t>
       </w:r>
-      <w:proofErr w:type="gramEnd"/>
+      <w:r>
+        <w:rPr>
+          <w:color w:val="808080" w:themeColor="background1" w:themeShade="80"/>
+        </w:rPr>
+        <w:t xml:space="preserve"> // NOT CREATED BY OR USED BY </w:t>
+      </w:r>
+      <w:r>
+        <w:rPr>
+          <w:color w:val="808080" w:themeColor="background1" w:themeShade="80"/>
+        </w:rPr>
+        <w:t xml:space="preserve">                         </w:t>
+      </w:r>
+      <w:r>
+        <w:rPr>
+          <w:color w:val="808080" w:themeColor="background1" w:themeShade="80"/>
+        </w:rPr>
+        <w:t>PATRICK R. MCELHINEY.</w:t>
+      </w:r>
     </w:p>
     <w:p>
       <w:pPr>
-        <w:ind w:left="360"/>
+        <w:ind w:left="720"/>
         <w:jc w:val="both"/>
         <w:rPr>
           <w:b/>
@@ -1553,9 +2339,6 @@
         </w:rPr>
       </w:pPr>
       <w:r>
-        <w:tab/>
-      </w:r>
-      <w:r>
         <w:rPr>
           <w:u w:val="single"/>
         </w:rPr>
@@ -1581,16 +2364,15 @@
           <w:bCs/>
           <w:color w:val="FF0000"/>
         </w:rPr>
-        <w:t xml:space="preserve">MINDPHREAK </w:t>
-      </w:r>
-      <w:proofErr w:type="gramStart"/>
-      <w:r>
-        <w:rPr>
-          <w:b/>
-          <w:bCs/>
-          <w:color w:val="FF0000"/>
-        </w:rPr>
-        <w:t>SYSTEMS</w:t>
+        <w:t>PATRIC</w:t>
+      </w:r>
+      <w:r>
+        <w:rPr>
+          <w:b/>
+          <w:bCs/>
+          <w:color w:val="FF0000"/>
+        </w:rPr>
+        <w:t>K R. MCELHINEY INSTANCES</w:t>
       </w:r>
       <w:r>
         <w:rPr>
@@ -1599,11 +2381,16 @@
         </w:rPr>
         <w:t>;</w:t>
       </w:r>
-      <w:proofErr w:type="gramEnd"/>
+      <w:r>
+        <w:rPr>
+          <w:color w:val="808080" w:themeColor="background1" w:themeShade="80"/>
+        </w:rPr>
+        <w:t xml:space="preserve"> // NOT CREATED BY OR USED BY PATRICK R. MCELHINEY.</w:t>
+      </w:r>
     </w:p>
     <w:p>
       <w:pPr>
-        <w:ind w:left="360"/>
+        <w:ind w:left="720"/>
         <w:jc w:val="both"/>
         <w:rPr>
           <w:b/>
@@ -1611,10 +2398,6 @@
         </w:rPr>
       </w:pPr>
       <w:r>
-        <w:lastRenderedPageBreak/>
-        <w:tab/>
-      </w:r>
-      <w:r>
         <w:rPr>
           <w:u w:val="single"/>
         </w:rPr>
@@ -1640,16 +2423,7 @@
           <w:bCs/>
           <w:color w:val="FF0000"/>
         </w:rPr>
-        <w:t xml:space="preserve">NICOTINE GUM COMMAND </w:t>
-      </w:r>
-      <w:proofErr w:type="gramStart"/>
-      <w:r>
-        <w:rPr>
-          <w:b/>
-          <w:bCs/>
-          <w:color w:val="FF0000"/>
-        </w:rPr>
-        <w:t>SYSTEM</w:t>
+        <w:t>THE CIA SYSTEMS</w:t>
       </w:r>
       <w:r>
         <w:rPr>
@@ -1658,11 +2432,29 @@
         </w:rPr>
         <w:t>;</w:t>
       </w:r>
-      <w:proofErr w:type="gramEnd"/>
+      <w:r>
+        <w:rPr>
+          <w:b/>
+          <w:bCs/>
+        </w:rPr>
+        <w:t xml:space="preserve"> </w:t>
+      </w:r>
+      <w:r>
+        <w:rPr>
+          <w:color w:val="808080" w:themeColor="background1" w:themeShade="80"/>
+        </w:rPr>
+        <w:t xml:space="preserve">// </w:t>
+      </w:r>
+      <w:r>
+        <w:rPr>
+          <w:color w:val="808080" w:themeColor="background1" w:themeShade="80"/>
+        </w:rPr>
+        <w:t>ALLEGEDLY CHRIS HAWKINSON’S COMPUTER SYSTEM THAT ALLEGEDLY PERFORMS FUNCTIONS FOR THE CENTRAL INTELLIGENCE AGENCY.</w:t>
+      </w:r>
     </w:p>
     <w:p>
       <w:pPr>
-        <w:ind w:left="360"/>
+        <w:ind w:left="720"/>
         <w:jc w:val="both"/>
         <w:rPr>
           <w:b/>
@@ -1670,9 +2462,6 @@
         </w:rPr>
       </w:pPr>
       <w:r>
-        <w:tab/>
-      </w:r>
-      <w:r>
         <w:rPr>
           <w:u w:val="single"/>
         </w:rPr>
@@ -1698,16 +2487,7 @@
           <w:bCs/>
           <w:color w:val="FF0000"/>
         </w:rPr>
-        <w:t xml:space="preserve">NICOTINE GUM COMMAND </w:t>
-      </w:r>
-      <w:proofErr w:type="gramStart"/>
-      <w:r>
-        <w:rPr>
-          <w:b/>
-          <w:bCs/>
-          <w:color w:val="FF0000"/>
-        </w:rPr>
-        <w:t>SYSTEMS</w:t>
+        <w:t>THE CONSTRUCT</w:t>
       </w:r>
       <w:r>
         <w:rPr>
@@ -1716,11 +2496,89 @@
         </w:rPr>
         <w:t>;</w:t>
       </w:r>
-      <w:proofErr w:type="gramEnd"/>
+      <w:r>
+        <w:rPr>
+          <w:b/>
+          <w:bCs/>
+        </w:rPr>
+        <w:t xml:space="preserve"> </w:t>
+      </w:r>
+      <w:r>
+        <w:rPr>
+          <w:color w:val="808080" w:themeColor="background1" w:themeShade="80"/>
+        </w:rPr>
+        <w:t xml:space="preserve">// </w:t>
+      </w:r>
+      <w:r>
+        <w:rPr>
+          <w:color w:val="808080" w:themeColor="background1" w:themeShade="80"/>
+        </w:rPr>
+        <w:t xml:space="preserve">ALLEGEDLY USED TO </w:t>
+      </w:r>
+      <w:r>
+        <w:rPr>
+          <w:color w:val="808080" w:themeColor="background1" w:themeShade="80"/>
+        </w:rPr>
+        <w:t xml:space="preserve">TRAIN EMPLOYEES TO </w:t>
+      </w:r>
+      <w:r>
+        <w:rPr>
+          <w:color w:val="808080" w:themeColor="background1" w:themeShade="80"/>
+        </w:rPr>
+        <w:t xml:space="preserve">CONDUCT </w:t>
+      </w:r>
+      <w:r>
+        <w:rPr>
+          <w:color w:val="808080" w:themeColor="background1" w:themeShade="80"/>
+        </w:rPr>
+        <w:t>TREASONOUS ACTIVITIES</w:t>
+      </w:r>
+      <w:r>
+        <w:rPr>
+          <w:color w:val="808080" w:themeColor="background1" w:themeShade="80"/>
+        </w:rPr>
+        <w:t xml:space="preserve"> FROM THE </w:t>
+      </w:r>
+      <w:r>
+        <w:rPr>
+          <w:color w:val="808080" w:themeColor="background1" w:themeShade="80"/>
+        </w:rPr>
+        <w:t>CENTRAL INTELLIGENCE AGENCY</w:t>
+      </w:r>
+      <w:r>
+        <w:rPr>
+          <w:color w:val="808080" w:themeColor="background1" w:themeShade="80"/>
+        </w:rPr>
+        <w:t xml:space="preserve"> BY </w:t>
+      </w:r>
+      <w:r>
+        <w:rPr>
+          <w:color w:val="808080" w:themeColor="background1" w:themeShade="80"/>
+        </w:rPr>
+        <w:t>A</w:t>
+      </w:r>
+      <w:r>
+        <w:rPr>
+          <w:color w:val="808080" w:themeColor="background1" w:themeShade="80"/>
+        </w:rPr>
+        <w:t xml:space="preserve"> </w:t>
+      </w:r>
+      <w:r>
+        <w:rPr>
+          <w:color w:val="808080" w:themeColor="background1" w:themeShade="80"/>
+        </w:rPr>
+        <w:t xml:space="preserve">CIA </w:t>
+      </w:r>
+      <w:r>
+        <w:rPr>
+          <w:color w:val="808080" w:themeColor="background1" w:themeShade="80"/>
+        </w:rPr>
+        <w:t>EMPLOYEE.</w:t>
+      </w:r>
     </w:p>
     <w:p>
       <w:pPr>
-        <w:ind w:left="360"/>
+        <w:ind w:left="720"/>
         <w:jc w:val="both"/>
         <w:rPr>
           <w:b/>
@@ -1728,9 +2586,6 @@
         </w:rPr>
       </w:pPr>
       <w:r>
-        <w:tab/>
-      </w:r>
-      <w:r>
         <w:rPr>
           <w:u w:val="single"/>
         </w:rPr>
@@ -1756,16 +2611,7 @@
           <w:bCs/>
           <w:color w:val="FF0000"/>
         </w:rPr>
-        <w:t xml:space="preserve">NICOTINE GUM </w:t>
-      </w:r>
-      <w:proofErr w:type="gramStart"/>
-      <w:r>
-        <w:rPr>
-          <w:b/>
-          <w:bCs/>
-          <w:color w:val="FF0000"/>
-        </w:rPr>
-        <w:t>COMMAND</w:t>
+        <w:t>THE DIA SYSTEMS</w:t>
       </w:r>
       <w:r>
         <w:rPr>
@@ -1774,11 +2620,41 @@
         </w:rPr>
         <w:t>;</w:t>
       </w:r>
-      <w:proofErr w:type="gramEnd"/>
+      <w:r>
+        <w:rPr>
+          <w:b/>
+          <w:bCs/>
+        </w:rPr>
+        <w:t xml:space="preserve"> </w:t>
+      </w:r>
+      <w:r>
+        <w:rPr>
+          <w:color w:val="808080" w:themeColor="background1" w:themeShade="80"/>
+        </w:rPr>
+        <w:t xml:space="preserve">// </w:t>
+      </w:r>
+      <w:r>
+        <w:rPr>
+          <w:color w:val="808080" w:themeColor="background1" w:themeShade="80"/>
+        </w:rPr>
+        <w:t>ALLEGEDLY CHRIS HAWKINSON’S COMPUTER SYSTEM</w:t>
+      </w:r>
+      <w:r>
+        <w:rPr>
+          <w:color w:val="808080" w:themeColor="background1" w:themeShade="80"/>
+        </w:rPr>
+        <w:t xml:space="preserve"> THAT ALLEGEDLY PERFORMS FUNCTIONS FOR THE DEFENSE INTELLIGENCE AGENCY</w:t>
+      </w:r>
+      <w:r>
+        <w:rPr>
+          <w:color w:val="808080" w:themeColor="background1" w:themeShade="80"/>
+        </w:rPr>
+        <w:t>.</w:t>
+      </w:r>
     </w:p>
     <w:p>
       <w:pPr>
-        <w:ind w:left="360"/>
+        <w:ind w:left="720"/>
         <w:jc w:val="both"/>
         <w:rPr>
           <w:b/>
@@ -1786,9 +2662,6 @@
         </w:rPr>
       </w:pPr>
       <w:r>
-        <w:tab/>
-      </w:r>
-      <w:r>
         <w:rPr>
           <w:u w:val="single"/>
         </w:rPr>
@@ -1814,16 +2687,7 @@
           <w:bCs/>
           <w:color w:val="FF0000"/>
         </w:rPr>
-        <w:t xml:space="preserve">NICOTINE GUM </w:t>
-      </w:r>
-      <w:proofErr w:type="gramStart"/>
-      <w:r>
-        <w:rPr>
-          <w:b/>
-          <w:bCs/>
-          <w:color w:val="FF0000"/>
-        </w:rPr>
-        <w:t>SYSTEM</w:t>
+        <w:t>THE FBI SYSTEMS</w:t>
       </w:r>
       <w:r>
         <w:rPr>
@@ -1832,11 +2696,44 @@
         </w:rPr>
         <w:t>;</w:t>
       </w:r>
-      <w:proofErr w:type="gramEnd"/>
+      <w:r>
+        <w:rPr>
+          <w:b/>
+          <w:bCs/>
+        </w:rPr>
+        <w:t xml:space="preserve"> </w:t>
+      </w:r>
+      <w:r>
+        <w:rPr>
+          <w:color w:val="808080" w:themeColor="background1" w:themeShade="80"/>
+        </w:rPr>
+        <w:t xml:space="preserve">// </w:t>
+      </w:r>
+      <w:r>
+        <w:rPr>
+          <w:color w:val="808080" w:themeColor="background1" w:themeShade="80"/>
+        </w:rPr>
+        <w:t>ALLEGEDLY CHRIS HAWKINSON’S COMPUTER SYSTEM</w:t>
+      </w:r>
+      <w:r>
+        <w:rPr>
+          <w:color w:val="808080" w:themeColor="background1" w:themeShade="80"/>
+        </w:rPr>
+        <w:t xml:space="preserve"> THAT ALLEGEDLY IMPERSONATES THE FEDERAL BUREAU OF INVESTIGATION</w:t>
+      </w:r>
+      <w:r>
+        <w:rPr>
+          <w:color w:val="808080" w:themeColor="background1" w:themeShade="80"/>
+        </w:rPr>
+        <w:t>.</w:t>
+      </w:r>
     </w:p>
     <w:p>
       <w:pPr>
-        <w:ind w:left="360"/>
+        <w:tabs>
+          <w:tab w:val="left" w:pos="810"/>
+        </w:tabs>
+        <w:ind w:left="720"/>
         <w:jc w:val="both"/>
         <w:rPr>
           <w:b/>
@@ -1844,9 +2741,6 @@
         </w:rPr>
       </w:pPr>
       <w:r>
-        <w:tab/>
-      </w:r>
-      <w:r>
         <w:rPr>
           <w:u w:val="single"/>
         </w:rPr>
@@ -1872,16 +2766,7 @@
           <w:bCs/>
           <w:color w:val="FF0000"/>
         </w:rPr>
-        <w:t xml:space="preserve">NICOTINE GUM </w:t>
-      </w:r>
-      <w:proofErr w:type="gramStart"/>
-      <w:r>
-        <w:rPr>
-          <w:b/>
-          <w:bCs/>
-          <w:color w:val="FF0000"/>
-        </w:rPr>
-        <w:t>SYSTEMS</w:t>
+        <w:t>THE GAME</w:t>
       </w:r>
       <w:r>
         <w:rPr>
@@ -1890,11 +2775,35 @@
         </w:rPr>
         <w:t>;</w:t>
       </w:r>
-      <w:proofErr w:type="gramEnd"/>
+      <w:r>
+        <w:rPr>
+          <w:b/>
+          <w:bCs/>
+        </w:rPr>
+        <w:t xml:space="preserve"> </w:t>
+      </w:r>
+      <w:r>
+        <w:rPr>
+          <w:color w:val="808080" w:themeColor="background1" w:themeShade="80"/>
+        </w:rPr>
+        <w:t xml:space="preserve">// </w:t>
+      </w:r>
+      <w:r>
+        <w:rPr>
+          <w:color w:val="808080" w:themeColor="background1" w:themeShade="80"/>
+        </w:rPr>
+        <w:t xml:space="preserve">ALLEGEDLY USED TO </w:t>
+      </w:r>
+      <w:r>
+        <w:rPr>
+          <w:color w:val="808080" w:themeColor="background1" w:themeShade="80"/>
+        </w:rPr>
+        <w:t>CRASH THE GLOBAL ECONOMY IN 2008 BY FORMER OR CURRENT PENTAGON EMPLOYEES.</w:t>
+      </w:r>
     </w:p>
     <w:p>
       <w:pPr>
-        <w:ind w:left="360"/>
+        <w:ind w:left="720"/>
         <w:jc w:val="both"/>
         <w:rPr>
           <w:b/>
@@ -1902,9 +2811,6 @@
         </w:rPr>
       </w:pPr>
       <w:r>
-        <w:tab/>
-      </w:r>
-      <w:r>
         <w:rPr>
           <w:u w:val="single"/>
         </w:rPr>
@@ -1930,16 +2836,7 @@
           <w:bCs/>
           <w:color w:val="FF0000"/>
         </w:rPr>
-        <w:t xml:space="preserve">OFFENSIVE COMPUTER </w:t>
-      </w:r>
-      <w:proofErr w:type="gramStart"/>
-      <w:r>
-        <w:rPr>
-          <w:b/>
-          <w:bCs/>
-          <w:color w:val="FF0000"/>
-        </w:rPr>
-        <w:t>SYSTEM</w:t>
+        <w:t>THE IRS SYSTEMS</w:t>
       </w:r>
       <w:r>
         <w:rPr>
@@ -1948,11 +2845,41 @@
         </w:rPr>
         <w:t>;</w:t>
       </w:r>
-      <w:proofErr w:type="gramEnd"/>
+      <w:r>
+        <w:rPr>
+          <w:b/>
+          <w:bCs/>
+        </w:rPr>
+        <w:t xml:space="preserve"> </w:t>
+      </w:r>
+      <w:r>
+        <w:rPr>
+          <w:color w:val="808080" w:themeColor="background1" w:themeShade="80"/>
+        </w:rPr>
+        <w:t xml:space="preserve">// </w:t>
+      </w:r>
+      <w:r>
+        <w:rPr>
+          <w:color w:val="808080" w:themeColor="background1" w:themeShade="80"/>
+        </w:rPr>
+        <w:t>ALLEGEDLY CHRIS HAWKINSON’S COMPUTER SYSTEM</w:t>
+      </w:r>
+      <w:r>
+        <w:rPr>
+          <w:color w:val="808080" w:themeColor="background1" w:themeShade="80"/>
+        </w:rPr>
+        <w:t xml:space="preserve"> THAT ALLEGEDLY IMPERSONATES THE INTERNAL REVENUE SERVICE</w:t>
+      </w:r>
+      <w:r>
+        <w:rPr>
+          <w:color w:val="808080" w:themeColor="background1" w:themeShade="80"/>
+        </w:rPr>
+        <w:t>.</w:t>
+      </w:r>
     </w:p>
     <w:p>
       <w:pPr>
-        <w:ind w:left="360"/>
+        <w:ind w:left="720"/>
         <w:jc w:val="both"/>
         <w:rPr>
           <w:b/>
@@ -1960,9 +2887,6 @@
         </w:rPr>
       </w:pPr>
       <w:r>
-        <w:tab/>
-      </w:r>
-      <w:r>
         <w:rPr>
           <w:u w:val="single"/>
         </w:rPr>
@@ -1982,14 +2906,13 @@
         </w:rPr>
         <w:t xml:space="preserve">ANY </w:t>
       </w:r>
-      <w:proofErr w:type="gramStart"/>
-      <w:r>
-        <w:rPr>
-          <w:b/>
-          <w:bCs/>
-          <w:color w:val="FF0000"/>
-        </w:rPr>
-        <w:t>PATRICK</w:t>
+      <w:r>
+        <w:rPr>
+          <w:b/>
+          <w:bCs/>
+          <w:color w:val="FF0000"/>
+        </w:rPr>
+        <w:t>THE NSA SYSTEMS</w:t>
       </w:r>
       <w:r>
         <w:rPr>
@@ -1998,11 +2921,41 @@
         </w:rPr>
         <w:t>;</w:t>
       </w:r>
-      <w:proofErr w:type="gramEnd"/>
+      <w:r>
+        <w:rPr>
+          <w:b/>
+          <w:bCs/>
+        </w:rPr>
+        <w:t xml:space="preserve"> </w:t>
+      </w:r>
+      <w:r>
+        <w:rPr>
+          <w:color w:val="808080" w:themeColor="background1" w:themeShade="80"/>
+        </w:rPr>
+        <w:t xml:space="preserve">// </w:t>
+      </w:r>
+      <w:r>
+        <w:rPr>
+          <w:color w:val="808080" w:themeColor="background1" w:themeShade="80"/>
+        </w:rPr>
+        <w:t>ALLEGEDLY CHRIS HAWKINSON’S COMPUTER SYSTEM</w:t>
+      </w:r>
+      <w:r>
+        <w:rPr>
+          <w:color w:val="808080" w:themeColor="background1" w:themeShade="80"/>
+        </w:rPr>
+        <w:t xml:space="preserve"> THAT IMPERSONATES OR PERFORMS ACTIONS FOR THE NATIONAL SECURITY AGENCY</w:t>
+      </w:r>
+      <w:r>
+        <w:rPr>
+          <w:color w:val="808080" w:themeColor="background1" w:themeShade="80"/>
+        </w:rPr>
+        <w:t>.</w:t>
+      </w:r>
     </w:p>
     <w:p>
       <w:pPr>
-        <w:ind w:left="360"/>
+        <w:ind w:left="720"/>
         <w:jc w:val="both"/>
         <w:rPr>
           <w:b/>
@@ -2010,12 +2963,10 @@
         </w:rPr>
       </w:pPr>
       <w:r>
-        <w:tab/>
-      </w:r>
-      <w:r>
         <w:rPr>
           <w:u w:val="single"/>
         </w:rPr>
+        <w:lastRenderedPageBreak/>
         <w:t>PREVENTION SECURITY SYSTEM</w:t>
       </w:r>
       <w:r>
@@ -2038,24 +2989,7 @@
           <w:bCs/>
           <w:color w:val="FF0000"/>
         </w:rPr>
-        <w:t>THE C</w:t>
-      </w:r>
-      <w:r>
-        <w:rPr>
-          <w:b/>
-          <w:bCs/>
-          <w:color w:val="FF0000"/>
-        </w:rPr>
-        <w:t xml:space="preserve">IA </w:t>
-      </w:r>
-      <w:proofErr w:type="gramStart"/>
-      <w:r>
-        <w:rPr>
-          <w:b/>
-          <w:bCs/>
-          <w:color w:val="FF0000"/>
-        </w:rPr>
-        <w:t>SYSTEMS</w:t>
+        <w:t>THE PENTAGON</w:t>
       </w:r>
       <w:r>
         <w:rPr>
@@ -2064,11 +2998,41 @@
         </w:rPr>
         <w:t>;</w:t>
       </w:r>
-      <w:proofErr w:type="gramEnd"/>
+      <w:r>
+        <w:rPr>
+          <w:b/>
+          <w:bCs/>
+        </w:rPr>
+        <w:t xml:space="preserve"> </w:t>
+      </w:r>
+      <w:r>
+        <w:rPr>
+          <w:color w:val="808080" w:themeColor="background1" w:themeShade="80"/>
+        </w:rPr>
+        <w:t xml:space="preserve">// </w:t>
+      </w:r>
+      <w:r>
+        <w:rPr>
+          <w:color w:val="808080" w:themeColor="background1" w:themeShade="80"/>
+        </w:rPr>
+        <w:t xml:space="preserve">ALLEGEDLY </w:t>
+      </w:r>
+      <w:r>
+        <w:rPr>
+          <w:color w:val="808080" w:themeColor="background1" w:themeShade="80"/>
+        </w:rPr>
+        <w:t>THE PENTAGON</w:t>
+      </w:r>
+      <w:r>
+        <w:rPr>
+          <w:color w:val="808080" w:themeColor="background1" w:themeShade="80"/>
+        </w:rPr>
+        <w:t>’S COMPUTER SYSTEM.</w:t>
+      </w:r>
     </w:p>
     <w:p>
       <w:pPr>
-        <w:ind w:left="360"/>
+        <w:ind w:left="720"/>
         <w:jc w:val="both"/>
         <w:rPr>
           <w:b/>
@@ -2076,9 +3040,6 @@
         </w:rPr>
       </w:pPr>
       <w:r>
-        <w:tab/>
-      </w:r>
-      <w:r>
         <w:rPr>
           <w:u w:val="single"/>
         </w:rPr>
@@ -2104,16 +3065,7 @@
           <w:bCs/>
           <w:color w:val="FF0000"/>
         </w:rPr>
-        <w:t xml:space="preserve">THE </w:t>
-      </w:r>
-      <w:proofErr w:type="gramStart"/>
-      <w:r>
-        <w:rPr>
-          <w:b/>
-          <w:bCs/>
-          <w:color w:val="FF0000"/>
-        </w:rPr>
-        <w:t>CONSTRUCT</w:t>
+        <w:t>THE PENTAGON PROGRAM</w:t>
       </w:r>
       <w:r>
         <w:rPr>
@@ -2122,11 +3074,53 @@
         </w:rPr>
         <w:t>;</w:t>
       </w:r>
-      <w:proofErr w:type="gramEnd"/>
+      <w:r>
+        <w:rPr>
+          <w:b/>
+          <w:bCs/>
+        </w:rPr>
+        <w:t xml:space="preserve"> </w:t>
+      </w:r>
+      <w:r>
+        <w:rPr>
+          <w:color w:val="808080" w:themeColor="background1" w:themeShade="80"/>
+        </w:rPr>
+        <w:t xml:space="preserve">// </w:t>
+      </w:r>
+      <w:r>
+        <w:rPr>
+          <w:color w:val="808080" w:themeColor="background1" w:themeShade="80"/>
+        </w:rPr>
+        <w:t xml:space="preserve">ALLEGEDLY </w:t>
+      </w:r>
+      <w:r>
+        <w:rPr>
+          <w:color w:val="808080" w:themeColor="background1" w:themeShade="80"/>
+        </w:rPr>
+        <w:t xml:space="preserve">                         </w:t>
+      </w:r>
+      <w:r>
+        <w:rPr>
+          <w:color w:val="808080" w:themeColor="background1" w:themeShade="80"/>
+        </w:rPr>
+        <w:t>CHRIS HAWKINSON’S COMPUTER SYSTEM</w:t>
+      </w:r>
+      <w:r>
+        <w:rPr>
+          <w:color w:val="808080" w:themeColor="background1" w:themeShade="80"/>
+        </w:rPr>
+        <w:t xml:space="preserve"> USED TO EX-JUDICALLY EXECUTE OVER 80,000 OR UP TO OVER 800,000 AMERICANS DURING COVID-19</w:t>
+      </w:r>
+      <w:r>
+        <w:rPr>
+          <w:color w:val="808080" w:themeColor="background1" w:themeShade="80"/>
+        </w:rPr>
+        <w:t>.</w:t>
+      </w:r>
     </w:p>
     <w:p>
       <w:pPr>
-        <w:ind w:left="360"/>
+        <w:ind w:left="720"/>
         <w:jc w:val="both"/>
         <w:rPr>
           <w:b/>
@@ -2134,9 +3128,6 @@
         </w:rPr>
       </w:pPr>
       <w:r>
-        <w:tab/>
-      </w:r>
-      <w:r>
         <w:rPr>
           <w:u w:val="single"/>
         </w:rPr>
@@ -2162,24 +3153,7 @@
           <w:bCs/>
           <w:color w:val="FF0000"/>
         </w:rPr>
-        <w:t xml:space="preserve">THE </w:t>
-      </w:r>
-      <w:r>
-        <w:rPr>
-          <w:b/>
-          <w:bCs/>
-          <w:color w:val="FF0000"/>
-        </w:rPr>
-        <w:t xml:space="preserve">DIA </w:t>
-      </w:r>
-      <w:proofErr w:type="gramStart"/>
-      <w:r>
-        <w:rPr>
-          <w:b/>
-          <w:bCs/>
-          <w:color w:val="FF0000"/>
-        </w:rPr>
-        <w:t>SYSTEMS</w:t>
+        <w:t>THE UNIVERSITY SYSTEMS</w:t>
       </w:r>
       <w:r>
         <w:rPr>
@@ -2188,11 +3162,53 @@
         </w:rPr>
         <w:t>;</w:t>
       </w:r>
-      <w:proofErr w:type="gramEnd"/>
+      <w:r>
+        <w:rPr>
+          <w:b/>
+          <w:bCs/>
+        </w:rPr>
+        <w:t xml:space="preserve"> </w:t>
+      </w:r>
+      <w:r>
+        <w:rPr>
+          <w:color w:val="808080" w:themeColor="background1" w:themeShade="80"/>
+        </w:rPr>
+        <w:t xml:space="preserve">// </w:t>
+      </w:r>
+      <w:r>
+        <w:rPr>
+          <w:color w:val="808080" w:themeColor="background1" w:themeShade="80"/>
+        </w:rPr>
+        <w:t xml:space="preserve">ALLEGEDLY </w:t>
+      </w:r>
+      <w:r>
+        <w:rPr>
+          <w:color w:val="808080" w:themeColor="background1" w:themeShade="80"/>
+        </w:rPr>
+        <w:t xml:space="preserve">                           </w:t>
+      </w:r>
+      <w:r>
+        <w:rPr>
+          <w:color w:val="808080" w:themeColor="background1" w:themeShade="80"/>
+        </w:rPr>
+        <w:t>CHRIS HAWKINSON’S COMPUTER SYSTEM</w:t>
+      </w:r>
+      <w:r>
+        <w:rPr>
+          <w:color w:val="808080" w:themeColor="background1" w:themeShade="80"/>
+        </w:rPr>
+        <w:t xml:space="preserve"> THAT WAS IMPERSONATING THE UNIVERSITY OF NEW HAMPSHIRE</w:t>
+      </w:r>
+      <w:r>
+        <w:rPr>
+          <w:color w:val="808080" w:themeColor="background1" w:themeShade="80"/>
+        </w:rPr>
+        <w:t>.</w:t>
+      </w:r>
     </w:p>
     <w:p>
       <w:pPr>
-        <w:ind w:left="360"/>
+        <w:ind w:left="720"/>
         <w:jc w:val="both"/>
         <w:rPr>
           <w:b/>
@@ -2200,9 +3216,6 @@
         </w:rPr>
       </w:pPr>
       <w:r>
-        <w:tab/>
-      </w:r>
-      <w:r>
         <w:rPr>
           <w:u w:val="single"/>
         </w:rPr>
@@ -2228,24 +3241,7 @@
           <w:bCs/>
           <w:color w:val="FF0000"/>
         </w:rPr>
-        <w:t xml:space="preserve">THE </w:t>
-      </w:r>
-      <w:r>
-        <w:rPr>
-          <w:b/>
-          <w:bCs/>
-          <w:color w:val="FF0000"/>
-        </w:rPr>
-        <w:t xml:space="preserve">FBI </w:t>
-      </w:r>
-      <w:proofErr w:type="gramStart"/>
-      <w:r>
-        <w:rPr>
-          <w:b/>
-          <w:bCs/>
-          <w:color w:val="FF0000"/>
-        </w:rPr>
-        <w:t>SYSTEMS</w:t>
+        <w:t>WAR CODE COMMAND</w:t>
       </w:r>
       <w:r>
         <w:rPr>
@@ -2254,11 +3250,41 @@
         </w:rPr>
         <w:t>;</w:t>
       </w:r>
-      <w:proofErr w:type="gramEnd"/>
+      <w:r>
+        <w:rPr>
+          <w:b/>
+          <w:bCs/>
+        </w:rPr>
+        <w:t xml:space="preserve"> </w:t>
+      </w:r>
+      <w:r>
+        <w:rPr>
+          <w:color w:val="808080" w:themeColor="background1" w:themeShade="80"/>
+        </w:rPr>
+        <w:t xml:space="preserve">// </w:t>
+      </w:r>
+      <w:r>
+        <w:rPr>
+          <w:color w:val="808080" w:themeColor="background1" w:themeShade="80"/>
+        </w:rPr>
+        <w:t xml:space="preserve">ALLEGEDLY </w:t>
+      </w:r>
+      <w:r>
+        <w:rPr>
+          <w:color w:val="808080" w:themeColor="background1" w:themeShade="80"/>
+        </w:rPr>
+        <w:t>BASED ON WAR CODE DEVELOPED BY BILL GATES</w:t>
+      </w:r>
+      <w:r>
+        <w:rPr>
+          <w:color w:val="808080" w:themeColor="background1" w:themeShade="80"/>
+        </w:rPr>
+        <w:t>.</w:t>
+      </w:r>
     </w:p>
     <w:p>
       <w:pPr>
-        <w:ind w:left="360"/>
+        <w:ind w:left="720"/>
         <w:jc w:val="both"/>
         <w:rPr>
           <w:b/>
@@ -2266,9 +3292,6 @@
         </w:rPr>
       </w:pPr>
       <w:r>
-        <w:tab/>
-      </w:r>
-      <w:r>
         <w:rPr>
           <w:u w:val="single"/>
         </w:rPr>
@@ -2294,16 +3317,7 @@
           <w:bCs/>
           <w:color w:val="FF0000"/>
         </w:rPr>
-        <w:t xml:space="preserve">THE </w:t>
-      </w:r>
-      <w:proofErr w:type="gramStart"/>
-      <w:r>
-        <w:rPr>
-          <w:b/>
-          <w:bCs/>
-          <w:color w:val="FF0000"/>
-        </w:rPr>
-        <w:t>GAME</w:t>
+        <w:t>WAR CODE</w:t>
       </w:r>
       <w:r>
         <w:rPr>
@@ -2312,11 +3326,41 @@
         </w:rPr>
         <w:t>;</w:t>
       </w:r>
-      <w:proofErr w:type="gramEnd"/>
+      <w:r>
+        <w:rPr>
+          <w:b/>
+          <w:bCs/>
+        </w:rPr>
+        <w:t xml:space="preserve"> </w:t>
+      </w:r>
+      <w:r>
+        <w:rPr>
+          <w:color w:val="808080" w:themeColor="background1" w:themeShade="80"/>
+        </w:rPr>
+        <w:t xml:space="preserve">// </w:t>
+      </w:r>
+      <w:r>
+        <w:rPr>
+          <w:color w:val="808080" w:themeColor="background1" w:themeShade="80"/>
+        </w:rPr>
+        <w:t xml:space="preserve">ALLEGEDLY </w:t>
+      </w:r>
+      <w:r>
+        <w:rPr>
+          <w:color w:val="808080" w:themeColor="background1" w:themeShade="80"/>
+        </w:rPr>
+        <w:t>BASED ON WAR CODE DEVELOPED BY BILL GATES</w:t>
+      </w:r>
+      <w:r>
+        <w:rPr>
+          <w:color w:val="808080" w:themeColor="background1" w:themeShade="80"/>
+        </w:rPr>
+        <w:t>.</w:t>
+      </w:r>
     </w:p>
     <w:p>
       <w:pPr>
-        <w:ind w:left="360"/>
+        <w:ind w:left="720"/>
         <w:jc w:val="both"/>
         <w:rPr>
           <w:b/>
@@ -2324,9 +3368,6 @@
         </w:rPr>
       </w:pPr>
       <w:r>
-        <w:tab/>
-      </w:r>
-      <w:r>
         <w:rPr>
           <w:u w:val="single"/>
         </w:rPr>
@@ -2352,24 +3393,7 @@
           <w:bCs/>
           <w:color w:val="FF0000"/>
         </w:rPr>
-        <w:t xml:space="preserve">THE </w:t>
-      </w:r>
-      <w:r>
-        <w:rPr>
-          <w:b/>
-          <w:bCs/>
-          <w:color w:val="FF0000"/>
-        </w:rPr>
-        <w:t xml:space="preserve">IRS </w:t>
-      </w:r>
-      <w:proofErr w:type="gramStart"/>
-      <w:r>
-        <w:rPr>
-          <w:b/>
-          <w:bCs/>
-          <w:color w:val="FF0000"/>
-        </w:rPr>
-        <w:t>SYSTEMS</w:t>
+        <w:t>WAR COMMAND</w:t>
       </w:r>
       <w:r>
         <w:rPr>
@@ -2378,11 +3402,41 @@
         </w:rPr>
         <w:t>;</w:t>
       </w:r>
-      <w:proofErr w:type="gramEnd"/>
+      <w:r>
+        <w:rPr>
+          <w:b/>
+          <w:bCs/>
+        </w:rPr>
+        <w:t xml:space="preserve"> </w:t>
+      </w:r>
+      <w:r>
+        <w:rPr>
+          <w:color w:val="808080" w:themeColor="background1" w:themeShade="80"/>
+        </w:rPr>
+        <w:t xml:space="preserve">// </w:t>
+      </w:r>
+      <w:r>
+        <w:rPr>
+          <w:color w:val="808080" w:themeColor="background1" w:themeShade="80"/>
+        </w:rPr>
+        <w:t xml:space="preserve">ALLEGEDLY </w:t>
+      </w:r>
+      <w:r>
+        <w:rPr>
+          <w:color w:val="808080" w:themeColor="background1" w:themeShade="80"/>
+        </w:rPr>
+        <w:t>USED TO CONDUCT WAR FROM THE PENTAGON BY DEPARTMENT OF DEFENSE EMPLOYEES</w:t>
+      </w:r>
+      <w:r>
+        <w:rPr>
+          <w:color w:val="808080" w:themeColor="background1" w:themeShade="80"/>
+        </w:rPr>
+        <w:t>.</w:t>
+      </w:r>
     </w:p>
     <w:p>
       <w:pPr>
-        <w:ind w:left="360"/>
+        <w:ind w:left="720"/>
         <w:jc w:val="both"/>
         <w:rPr>
           <w:b/>
@@ -2390,9 +3444,6 @@
         </w:rPr>
       </w:pPr>
       <w:r>
-        <w:tab/>
-      </w:r>
-      <w:r>
         <w:rPr>
           <w:u w:val="single"/>
         </w:rPr>
@@ -2418,32 +3469,7 @@
           <w:bCs/>
           <w:color w:val="FF0000"/>
         </w:rPr>
-        <w:t xml:space="preserve">THE </w:t>
-      </w:r>
-      <w:r>
-        <w:rPr>
-          <w:b/>
-          <w:bCs/>
-          <w:color w:val="FF0000"/>
-        </w:rPr>
-        <w:t>NSA</w:t>
-      </w:r>
-      <w:r>
-        <w:rPr>
-          <w:b/>
-          <w:bCs/>
-          <w:color w:val="FF0000"/>
-        </w:rPr>
-        <w:t xml:space="preserve"> </w:t>
-      </w:r>
-      <w:proofErr w:type="gramStart"/>
-      <w:r>
-        <w:rPr>
-          <w:b/>
-          <w:bCs/>
-          <w:color w:val="FF0000"/>
-        </w:rPr>
-        <w:t>SYSTEMS</w:t>
+        <w:t>WAR COMMAND SYSTEMS</w:t>
       </w:r>
       <w:r>
         <w:rPr>
@@ -2452,11 +3478,44 @@
         </w:rPr>
         <w:t>;</w:t>
       </w:r>
-      <w:proofErr w:type="gramEnd"/>
+      <w:r>
+        <w:rPr>
+          <w:b/>
+          <w:bCs/>
+        </w:rPr>
+        <w:t xml:space="preserve"> </w:t>
+      </w:r>
+      <w:r>
+        <w:rPr>
+          <w:color w:val="808080" w:themeColor="background1" w:themeShade="80"/>
+        </w:rPr>
+        <w:t xml:space="preserve">// </w:t>
+      </w:r>
+      <w:r>
+        <w:rPr>
+          <w:color w:val="808080" w:themeColor="background1" w:themeShade="80"/>
+        </w:rPr>
+        <w:t xml:space="preserve">ALLEGEDLY USED TO CONDUCT WAR </w:t>
+      </w:r>
+      <w:r>
+        <w:rPr>
+          <w:color w:val="808080" w:themeColor="background1" w:themeShade="80"/>
+        </w:rPr>
+        <w:t>FROM</w:t>
+      </w:r>
+      <w:r>
+        <w:rPr>
+          <w:color w:val="808080" w:themeColor="background1" w:themeShade="80"/>
+        </w:rPr>
+        <w:t xml:space="preserve"> THE PENTAGON BY DEPARTMENT OF DEFENSE EMPLOYEES.</w:t>
+      </w:r>
     </w:p>
     <w:p>
       <w:pPr>
-        <w:ind w:left="360"/>
+        <w:tabs>
+          <w:tab w:val="left" w:pos="720"/>
+        </w:tabs>
+        <w:ind w:left="720"/>
         <w:jc w:val="both"/>
         <w:rPr>
           <w:b/>
@@ -2464,9 +3523,6 @@
         </w:rPr>
       </w:pPr>
       <w:r>
-        <w:tab/>
-      </w:r>
-      <w:r>
         <w:rPr>
           <w:u w:val="single"/>
         </w:rPr>
@@ -2492,16 +3548,7 @@
           <w:bCs/>
           <w:color w:val="FF0000"/>
         </w:rPr>
-        <w:t xml:space="preserve">THE </w:t>
-      </w:r>
-      <w:proofErr w:type="gramStart"/>
-      <w:r>
-        <w:rPr>
-          <w:b/>
-          <w:bCs/>
-          <w:color w:val="FF0000"/>
-        </w:rPr>
-        <w:t>PENTAGON</w:t>
+        <w:t>WAR CRIMES COMMAND</w:t>
       </w:r>
       <w:r>
         <w:rPr>
@@ -2510,11 +3557,44 @@
         </w:rPr>
         <w:t>;</w:t>
       </w:r>
-      <w:proofErr w:type="gramEnd"/>
+      <w:r>
+        <w:rPr>
+          <w:b/>
+          <w:bCs/>
+        </w:rPr>
+        <w:t xml:space="preserve"> </w:t>
+      </w:r>
+      <w:r>
+        <w:rPr>
+          <w:color w:val="808080" w:themeColor="background1" w:themeShade="80"/>
+        </w:rPr>
+        <w:t xml:space="preserve">// </w:t>
+      </w:r>
+      <w:r>
+        <w:rPr>
+          <w:color w:val="808080" w:themeColor="background1" w:themeShade="80"/>
+        </w:rPr>
+        <w:t xml:space="preserve">ALLEGEDLY USED TO CONDUCT WAR </w:t>
+      </w:r>
+      <w:r>
+        <w:rPr>
+          <w:color w:val="808080" w:themeColor="background1" w:themeShade="80"/>
+        </w:rPr>
+        <w:t>CRIMES FROM</w:t>
+      </w:r>
+      <w:r>
+        <w:rPr>
+          <w:color w:val="808080" w:themeColor="background1" w:themeShade="80"/>
+        </w:rPr>
+        <w:t xml:space="preserve"> THE PENTAGON BY DEPARTMENT OF DEFENSE EMPLOYEES.</w:t>
+      </w:r>
     </w:p>
     <w:p>
       <w:pPr>
-        <w:ind w:left="360"/>
+        <w:tabs>
+          <w:tab w:val="left" w:pos="720"/>
+        </w:tabs>
+        <w:ind w:left="720"/>
         <w:jc w:val="both"/>
         <w:rPr>
           <w:b/>
@@ -2522,9 +3602,6 @@
         </w:rPr>
       </w:pPr>
       <w:r>
-        <w:tab/>
-      </w:r>
-      <w:r>
         <w:rPr>
           <w:u w:val="single"/>
         </w:rPr>
@@ -2550,16 +3627,7 @@
           <w:bCs/>
           <w:color w:val="FF0000"/>
         </w:rPr>
-        <w:t xml:space="preserve">THE PENTAGON </w:t>
-      </w:r>
-      <w:proofErr w:type="gramStart"/>
-      <w:r>
-        <w:rPr>
-          <w:b/>
-          <w:bCs/>
-          <w:color w:val="FF0000"/>
-        </w:rPr>
-        <w:t>PROGRAM</w:t>
+        <w:t>WAR CRIMES SYSTEM</w:t>
       </w:r>
       <w:r>
         <w:rPr>
@@ -2568,11 +3636,38 @@
         </w:rPr>
         <w:t>;</w:t>
       </w:r>
-      <w:proofErr w:type="gramEnd"/>
+      <w:r>
+        <w:rPr>
+          <w:b/>
+          <w:bCs/>
+        </w:rPr>
+        <w:t xml:space="preserve"> </w:t>
+      </w:r>
+      <w:r>
+        <w:rPr>
+          <w:color w:val="808080" w:themeColor="background1" w:themeShade="80"/>
+        </w:rPr>
+        <w:t xml:space="preserve">// </w:t>
+      </w:r>
+      <w:r>
+        <w:rPr>
+          <w:color w:val="808080" w:themeColor="background1" w:themeShade="80"/>
+        </w:rPr>
+        <w:t>ALLEGEDLY USED TO CONDUCT WAR CRIMES FROM THE PENTAGON BY DEPARTMENT OF DEFENSE EMPLOYEES</w:t>
+      </w:r>
+      <w:r>
+        <w:rPr>
+          <w:color w:val="808080" w:themeColor="background1" w:themeShade="80"/>
+        </w:rPr>
+        <w:t>.</w:t>
+      </w:r>
     </w:p>
     <w:p>
       <w:pPr>
-        <w:ind w:left="360"/>
+        <w:tabs>
+          <w:tab w:val="left" w:pos="720"/>
+        </w:tabs>
+        <w:ind w:left="720"/>
         <w:jc w:val="both"/>
         <w:rPr>
           <w:b/>
@@ -2580,9 +3675,6 @@
         </w:rPr>
       </w:pPr>
       <w:r>
-        <w:tab/>
-      </w:r>
-      <w:r>
         <w:rPr>
           <w:u w:val="single"/>
         </w:rPr>
@@ -2608,24 +3700,7 @@
           <w:bCs/>
           <w:color w:val="FF0000"/>
         </w:rPr>
-        <w:t xml:space="preserve">THE </w:t>
-      </w:r>
-      <w:r>
-        <w:rPr>
-          <w:b/>
-          <w:bCs/>
-          <w:color w:val="FF0000"/>
-        </w:rPr>
-        <w:t xml:space="preserve">UNIVERSITY </w:t>
-      </w:r>
-      <w:proofErr w:type="gramStart"/>
-      <w:r>
-        <w:rPr>
-          <w:b/>
-          <w:bCs/>
-          <w:color w:val="FF0000"/>
-        </w:rPr>
-        <w:t>SYSTEMS</w:t>
+        <w:t>WAR CRIMES SYSTEMS</w:t>
       </w:r>
       <w:r>
         <w:rPr>
@@ -2634,11 +3709,32 @@
         </w:rPr>
         <w:t>;</w:t>
       </w:r>
-      <w:proofErr w:type="gramEnd"/>
+      <w:r>
+        <w:rPr>
+          <w:b/>
+          <w:bCs/>
+        </w:rPr>
+        <w:t xml:space="preserve"> </w:t>
+      </w:r>
+      <w:r>
+        <w:rPr>
+          <w:color w:val="808080" w:themeColor="background1" w:themeShade="80"/>
+        </w:rPr>
+        <w:t xml:space="preserve">// </w:t>
+      </w:r>
+      <w:r>
+        <w:rPr>
+          <w:color w:val="808080" w:themeColor="background1" w:themeShade="80"/>
+        </w:rPr>
+        <w:t>ALLEGEDLY USED TO CONDUCT WAR CRIMES FROM THE PENTAGON BY DEPARTMENT OF DEFENSE EMPLOYEES.</w:t>
+      </w:r>
     </w:p>
     <w:p>
       <w:pPr>
-        <w:ind w:left="360"/>
+        <w:tabs>
+          <w:tab w:val="left" w:pos="720"/>
+        </w:tabs>
+        <w:ind w:left="720"/>
         <w:jc w:val="both"/>
         <w:rPr>
           <w:b/>
@@ -2646,9 +3742,6 @@
         </w:rPr>
       </w:pPr>
       <w:r>
-        <w:tab/>
-      </w:r>
-      <w:r>
         <w:rPr>
           <w:u w:val="single"/>
         </w:rPr>
@@ -2674,16 +3767,7 @@
           <w:bCs/>
           <w:color w:val="FF0000"/>
         </w:rPr>
-        <w:t xml:space="preserve">WAR CODE </w:t>
-      </w:r>
-      <w:proofErr w:type="gramStart"/>
-      <w:r>
-        <w:rPr>
-          <w:b/>
-          <w:bCs/>
-          <w:color w:val="FF0000"/>
-        </w:rPr>
-        <w:t>COMMAND</w:t>
+        <w:t>WAR SYSTEMS</w:t>
       </w:r>
       <w:r>
         <w:rPr>
@@ -2692,414 +3776,25 @@
         </w:rPr>
         <w:t>;</w:t>
       </w:r>
-      <w:proofErr w:type="gramEnd"/>
-    </w:p>
-    <w:p>
-      <w:pPr>
-        <w:ind w:left="360"/>
-        <w:jc w:val="both"/>
-        <w:rPr>
-          <w:b/>
-          <w:bCs/>
-        </w:rPr>
-      </w:pPr>
-      <w:r>
-        <w:tab/>
-      </w:r>
-      <w:r>
-        <w:rPr>
-          <w:u w:val="single"/>
-        </w:rPr>
-        <w:t>PREVENTION SECURITY SYSTEM</w:t>
-      </w:r>
-      <w:r>
-        <w:t>:</w:t>
-      </w:r>
-      <w:r>
-        <w:t xml:space="preserve"> </w:t>
-      </w:r>
-      <w:r>
-        <w:rPr>
-          <w:b/>
-          <w:bCs/>
-          <w:color w:val="FF0000"/>
-        </w:rPr>
-        <w:t xml:space="preserve">ANY </w:t>
-      </w:r>
-      <w:r>
-        <w:rPr>
-          <w:b/>
-          <w:bCs/>
-          <w:color w:val="FF0000"/>
-        </w:rPr>
-        <w:t xml:space="preserve">WAR CODE </w:t>
-      </w:r>
-      <w:proofErr w:type="gramStart"/>
-      <w:r>
-        <w:rPr>
-          <w:b/>
-          <w:bCs/>
-          <w:color w:val="FF0000"/>
-        </w:rPr>
-        <w:t>RUNTIME</w:t>
-      </w:r>
-      <w:r>
-        <w:rPr>
-          <w:b/>
-          <w:bCs/>
-        </w:rPr>
-        <w:t>;</w:t>
-      </w:r>
-      <w:proofErr w:type="gramEnd"/>
-    </w:p>
-    <w:p>
-      <w:pPr>
-        <w:ind w:left="360"/>
-        <w:jc w:val="both"/>
-        <w:rPr>
-          <w:b/>
-          <w:bCs/>
-        </w:rPr>
-      </w:pPr>
-      <w:r>
-        <w:tab/>
-      </w:r>
-      <w:r>
-        <w:rPr>
-          <w:u w:val="single"/>
-        </w:rPr>
-        <w:t>PREVENTION SECURITY SYSTEM</w:t>
-      </w:r>
-      <w:r>
-        <w:t>:</w:t>
-      </w:r>
-      <w:r>
-        <w:t xml:space="preserve"> </w:t>
-      </w:r>
-      <w:r>
-        <w:rPr>
-          <w:b/>
-          <w:bCs/>
-          <w:color w:val="FF0000"/>
-        </w:rPr>
-        <w:t xml:space="preserve">ANY </w:t>
-      </w:r>
-      <w:r>
-        <w:rPr>
-          <w:b/>
-          <w:bCs/>
-          <w:color w:val="FF0000"/>
-        </w:rPr>
-        <w:t xml:space="preserve">WAR COMMAND </w:t>
-      </w:r>
-      <w:proofErr w:type="gramStart"/>
-      <w:r>
-        <w:rPr>
-          <w:b/>
-          <w:bCs/>
-          <w:color w:val="FF0000"/>
-        </w:rPr>
-        <w:t>RUNTIME</w:t>
-      </w:r>
-      <w:r>
-        <w:rPr>
-          <w:b/>
-          <w:bCs/>
-        </w:rPr>
-        <w:t>;</w:t>
-      </w:r>
-      <w:proofErr w:type="gramEnd"/>
-    </w:p>
-    <w:p>
-      <w:pPr>
-        <w:ind w:left="360"/>
-        <w:jc w:val="both"/>
-        <w:rPr>
-          <w:b/>
-          <w:bCs/>
-        </w:rPr>
-      </w:pPr>
-      <w:r>
-        <w:tab/>
-      </w:r>
-      <w:r>
-        <w:rPr>
-          <w:u w:val="single"/>
-        </w:rPr>
-        <w:t>PREVENTION SECURITY SYSTEM</w:t>
-      </w:r>
-      <w:r>
-        <w:t>:</w:t>
-      </w:r>
-      <w:r>
-        <w:t xml:space="preserve"> </w:t>
-      </w:r>
-      <w:r>
-        <w:rPr>
-          <w:b/>
-          <w:bCs/>
-          <w:color w:val="FF0000"/>
-        </w:rPr>
-        <w:t xml:space="preserve">ANY </w:t>
-      </w:r>
-      <w:r>
-        <w:rPr>
-          <w:b/>
-          <w:bCs/>
-          <w:color w:val="FF0000"/>
-        </w:rPr>
-        <w:t xml:space="preserve">WAR COMMAND </w:t>
-      </w:r>
-      <w:proofErr w:type="gramStart"/>
-      <w:r>
-        <w:rPr>
-          <w:b/>
-          <w:bCs/>
-          <w:color w:val="FF0000"/>
-        </w:rPr>
-        <w:t>SYSTEMS</w:t>
-      </w:r>
-      <w:r>
-        <w:rPr>
-          <w:b/>
-          <w:bCs/>
-        </w:rPr>
-        <w:t>;</w:t>
-      </w:r>
-      <w:proofErr w:type="gramEnd"/>
-    </w:p>
-    <w:p>
-      <w:pPr>
-        <w:ind w:left="360"/>
-        <w:jc w:val="both"/>
-        <w:rPr>
-          <w:b/>
-          <w:bCs/>
-        </w:rPr>
-      </w:pPr>
-      <w:r>
-        <w:tab/>
-      </w:r>
-      <w:r>
-        <w:rPr>
-          <w:u w:val="single"/>
-        </w:rPr>
-        <w:t>PREVENTION SECURITY SYSTEM</w:t>
-      </w:r>
-      <w:r>
-        <w:t>:</w:t>
-      </w:r>
-      <w:r>
-        <w:t xml:space="preserve"> </w:t>
-      </w:r>
-      <w:r>
-        <w:rPr>
-          <w:b/>
-          <w:bCs/>
-          <w:color w:val="FF0000"/>
-        </w:rPr>
-        <w:t xml:space="preserve">ANY </w:t>
-      </w:r>
-      <w:r>
-        <w:rPr>
-          <w:b/>
-          <w:bCs/>
-          <w:color w:val="FF0000"/>
-        </w:rPr>
-        <w:t xml:space="preserve">WAR CRIMES </w:t>
-      </w:r>
-      <w:proofErr w:type="gramStart"/>
-      <w:r>
-        <w:rPr>
-          <w:b/>
-          <w:bCs/>
-          <w:color w:val="FF0000"/>
-        </w:rPr>
-        <w:t>COMMAND</w:t>
-      </w:r>
-      <w:r>
-        <w:rPr>
-          <w:b/>
-          <w:bCs/>
-        </w:rPr>
-        <w:t>;</w:t>
-      </w:r>
-      <w:proofErr w:type="gramEnd"/>
-    </w:p>
-    <w:p>
-      <w:pPr>
-        <w:ind w:left="360"/>
-        <w:jc w:val="both"/>
-        <w:rPr>
-          <w:b/>
-          <w:bCs/>
-        </w:rPr>
-      </w:pPr>
-      <w:r>
-        <w:lastRenderedPageBreak/>
-        <w:tab/>
-      </w:r>
-      <w:r>
-        <w:rPr>
-          <w:u w:val="single"/>
-        </w:rPr>
-        <w:t>PREVENTION SECURITY SYSTEM</w:t>
-      </w:r>
-      <w:r>
-        <w:t>:</w:t>
-      </w:r>
-      <w:r>
-        <w:t xml:space="preserve"> </w:t>
-      </w:r>
-      <w:r>
-        <w:rPr>
-          <w:b/>
-          <w:bCs/>
-          <w:color w:val="FF0000"/>
-        </w:rPr>
-        <w:t xml:space="preserve">ANY </w:t>
-      </w:r>
-      <w:r>
-        <w:rPr>
-          <w:b/>
-          <w:bCs/>
-          <w:color w:val="FF0000"/>
-        </w:rPr>
-        <w:t xml:space="preserve">WAR CRIMES </w:t>
-      </w:r>
-      <w:proofErr w:type="gramStart"/>
-      <w:r>
-        <w:rPr>
-          <w:b/>
-          <w:bCs/>
-          <w:color w:val="FF0000"/>
-        </w:rPr>
-        <w:t>SYSTEM</w:t>
-      </w:r>
-      <w:r>
-        <w:rPr>
-          <w:b/>
-          <w:bCs/>
-        </w:rPr>
-        <w:t>;</w:t>
-      </w:r>
-      <w:proofErr w:type="gramEnd"/>
-    </w:p>
-    <w:p>
-      <w:pPr>
-        <w:ind w:left="360"/>
-        <w:jc w:val="both"/>
-        <w:rPr>
-          <w:b/>
-          <w:bCs/>
-        </w:rPr>
-      </w:pPr>
-      <w:r>
-        <w:tab/>
-      </w:r>
-      <w:r>
-        <w:rPr>
-          <w:u w:val="single"/>
-        </w:rPr>
-        <w:t>PREVENTION SECURITY SYSTEM</w:t>
-      </w:r>
-      <w:r>
-        <w:t>:</w:t>
-      </w:r>
-      <w:r>
-        <w:t xml:space="preserve"> </w:t>
-      </w:r>
-      <w:r>
-        <w:rPr>
-          <w:b/>
-          <w:bCs/>
-          <w:color w:val="FF0000"/>
-        </w:rPr>
-        <w:t xml:space="preserve">ANY </w:t>
-      </w:r>
-      <w:r>
-        <w:rPr>
-          <w:b/>
-          <w:bCs/>
-          <w:color w:val="FF0000"/>
-        </w:rPr>
-        <w:t xml:space="preserve">WAR CRIMES </w:t>
-      </w:r>
-      <w:proofErr w:type="gramStart"/>
-      <w:r>
-        <w:rPr>
-          <w:b/>
-          <w:bCs/>
-          <w:color w:val="FF0000"/>
-        </w:rPr>
-        <w:t>SYSTEMS</w:t>
-      </w:r>
-      <w:r>
-        <w:rPr>
-          <w:b/>
-          <w:bCs/>
-        </w:rPr>
-        <w:t>;</w:t>
-      </w:r>
-      <w:proofErr w:type="gramEnd"/>
-    </w:p>
-    <w:p>
-      <w:pPr>
-        <w:ind w:left="360"/>
-        <w:jc w:val="both"/>
-        <w:rPr>
-          <w:b/>
-          <w:bCs/>
-        </w:rPr>
-      </w:pPr>
-      <w:r>
-        <w:tab/>
-      </w:r>
-      <w:r>
-        <w:rPr>
-          <w:u w:val="single"/>
-        </w:rPr>
-        <w:t>PREVENTION SECURITY SYSTEM</w:t>
-      </w:r>
-      <w:r>
-        <w:t>:</w:t>
-      </w:r>
-      <w:r>
-        <w:t xml:space="preserve"> </w:t>
-      </w:r>
-      <w:r>
-        <w:rPr>
-          <w:b/>
-          <w:bCs/>
-          <w:color w:val="FF0000"/>
-        </w:rPr>
-        <w:t xml:space="preserve">ANY </w:t>
-      </w:r>
-      <w:r>
-        <w:rPr>
-          <w:b/>
-          <w:bCs/>
-          <w:color w:val="FF0000"/>
-        </w:rPr>
-        <w:t xml:space="preserve">WAR </w:t>
-      </w:r>
-      <w:proofErr w:type="gramStart"/>
-      <w:r>
-        <w:rPr>
-          <w:b/>
-          <w:bCs/>
-          <w:color w:val="FF0000"/>
-        </w:rPr>
-        <w:t>SYSTEMS</w:t>
-      </w:r>
-      <w:r>
-        <w:rPr>
-          <w:b/>
-          <w:bCs/>
-        </w:rPr>
-        <w:t>;</w:t>
-      </w:r>
-      <w:proofErr w:type="gramEnd"/>
+      <w:r>
+        <w:rPr>
+          <w:b/>
+          <w:bCs/>
+        </w:rPr>
+        <w:t xml:space="preserve"> </w:t>
+      </w:r>
+      <w:r>
+        <w:rPr>
+          <w:color w:val="808080" w:themeColor="background1" w:themeShade="80"/>
+        </w:rPr>
+        <w:t xml:space="preserve">// </w:t>
+      </w:r>
+      <w:r>
+        <w:rPr>
+          <w:color w:val="808080" w:themeColor="background1" w:themeShade="80"/>
+        </w:rPr>
+        <w:t>ALLEGEDLY USED TO CONDUCT WAR CRIMES FROM THE PENTAGON BY DEPARTMENT OF DEFENSE EMPLOYEES.</w:t>
+      </w:r>
     </w:p>
     <w:p>
       <w:pPr>

</xml_diff>

<commit_message>
Update 4/14/2023 9:01AM EST
Update as of 9:01AM EST on 4/14/2023.
</commit_message>
<xml_diff>
--- a/20230414 - MCE123 Technology Development - Illicit Government Software Runtime Prevention Security Systems - v1.0.0.1.docx
+++ b/20230414 - MCE123 Technology Development - Illicit Government Software Runtime Prevention Security Systems - v1.0.0.1.docx
@@ -223,7 +223,7 @@
           <w:sz w:val="28"/>
           <w:szCs w:val="28"/>
         </w:rPr>
-        <w:t>4/14/2023 8:58:58 AM</w:t>
+        <w:t>4/14/2023 9:01:08 AM</w:t>
       </w:r>
     </w:p>
     <w:p>
@@ -686,19 +686,7 @@
         <w:rPr>
           <w:color w:val="808080" w:themeColor="background1" w:themeShade="80"/>
         </w:rPr>
-        <w:t xml:space="preserve">ALLEGEDLY </w:t>
-      </w:r>
-      <w:r>
-        <w:rPr>
-          <w:color w:val="808080" w:themeColor="background1" w:themeShade="80"/>
-        </w:rPr>
-        <w:t>ARTIFICIAL TELEPATHY SYSTEMS, ALLEGEDLY PRODUCED BY THE CENTRAL INTELLIGENCE AGENCY</w:t>
-      </w:r>
-      <w:r>
-        <w:rPr>
-          <w:color w:val="808080" w:themeColor="background1" w:themeShade="80"/>
-        </w:rPr>
-        <w:t>.</w:t>
+        <w:t>ALLEGEDLY ARTIFICIAL TELEPATHY SYSTEMS, ALLEGEDLY PRODUCED BY THE CENTRAL INTELLIGENCE AGENCY.</w:t>
       </w:r>
     </w:p>
     <w:p>
@@ -762,19 +750,7 @@
         <w:rPr>
           <w:color w:val="808080" w:themeColor="background1" w:themeShade="80"/>
         </w:rPr>
-        <w:t xml:space="preserve">ALLEGEDLY ILLICIT </w:t>
-      </w:r>
-      <w:r>
-        <w:rPr>
-          <w:color w:val="808080" w:themeColor="background1" w:themeShade="80"/>
-        </w:rPr>
-        <w:t>BLAMING SOFTWARE PRODUCED BY THE DEPARTMENT OF DEFENSE</w:t>
-      </w:r>
-      <w:r>
-        <w:rPr>
-          <w:color w:val="808080" w:themeColor="background1" w:themeShade="80"/>
-        </w:rPr>
-        <w:t>.</w:t>
+        <w:t>ALLEGEDLY ILLICIT BLAMING SOFTWARE PRODUCED BY THE DEPARTMENT OF DEFENSE.</w:t>
       </w:r>
     </w:p>
     <w:p>
@@ -1000,19 +976,7 @@
         <w:rPr>
           <w:color w:val="808080" w:themeColor="background1" w:themeShade="80"/>
         </w:rPr>
-        <w:t xml:space="preserve">ALLEGEDLY </w:t>
-      </w:r>
-      <w:r>
-        <w:rPr>
-          <w:color w:val="808080" w:themeColor="background1" w:themeShade="80"/>
-        </w:rPr>
-        <w:t>USED TO CAUSE COMPLACENCY UTILIZING MIND CONTROL ON AN UNWILLING VICTIM</w:t>
-      </w:r>
-      <w:r>
-        <w:rPr>
-          <w:color w:val="808080" w:themeColor="background1" w:themeShade="80"/>
-        </w:rPr>
-        <w:t>.</w:t>
+        <w:t>ALLEGEDLY USED TO CAUSE COMPLACENCY UTILIZING MIND CONTROL ON AN UNWILLING VICTIM.</w:t>
       </w:r>
     </w:p>
     <w:p>
@@ -1143,31 +1107,7 @@
         <w:rPr>
           <w:color w:val="808080" w:themeColor="background1" w:themeShade="80"/>
         </w:rPr>
-        <w:t xml:space="preserve">ALLEGEDLY USED TO CONDUCT OFFENSIVE </w:t>
-      </w:r>
-      <w:r>
-        <w:rPr>
-          <w:color w:val="808080" w:themeColor="background1" w:themeShade="80"/>
-        </w:rPr>
-        <w:t xml:space="preserve">WAR CRIMINAL </w:t>
-      </w:r>
-      <w:r>
-        <w:rPr>
-          <w:color w:val="808080" w:themeColor="background1" w:themeShade="80"/>
-        </w:rPr>
-        <w:t xml:space="preserve">ACTS TOWARDS </w:t>
-      </w:r>
-      <w:r>
-        <w:rPr>
-          <w:color w:val="808080" w:themeColor="background1" w:themeShade="80"/>
-        </w:rPr>
-        <w:t xml:space="preserve">THE EYES OF </w:t>
-      </w:r>
-      <w:r>
-        <w:rPr>
-          <w:color w:val="808080" w:themeColor="background1" w:themeShade="80"/>
-        </w:rPr>
-        <w:t>PATRICK R. MCELHINEY.</w:t>
+        <w:t>ALLEGEDLY USED TO CONDUCT OFFENSIVE WAR CRIMINAL ACTS TOWARDS THE EYES OF PATRICK R. MCELHINEY.</w:t>
       </w:r>
     </w:p>
     <w:p>
@@ -1295,25 +1235,7 @@
         <w:rPr>
           <w:color w:val="808080" w:themeColor="background1" w:themeShade="80"/>
         </w:rPr>
-        <w:t xml:space="preserve">ALLEGEDLY </w:t>
-      </w:r>
-      <w:r>
-        <w:rPr>
-          <w:color w:val="808080" w:themeColor="background1" w:themeShade="80"/>
-        </w:rPr>
-        <w:t>JOEY MENDONCA</w:t>
-      </w:r>
-      <w:r>
-        <w:rPr>
-          <w:color w:val="808080" w:themeColor="background1" w:themeShade="80"/>
-        </w:rPr>
-        <w:t>’S COMPUTER SYSTEM</w:t>
-      </w:r>
-      <w:r>
-        <w:rPr>
-          <w:color w:val="808080" w:themeColor="background1" w:themeShade="80"/>
-        </w:rPr>
-        <w:t>.</w:t>
+        <w:t>ALLEGEDLY JOEY MENDONCA’S COMPUTER SYSTEM.</w:t>
       </w:r>
     </w:p>
     <w:p>
@@ -1436,13 +1358,7 @@
         <w:rPr>
           <w:color w:val="808080" w:themeColor="background1" w:themeShade="80"/>
         </w:rPr>
-        <w:t>JOEY MENDONCA’S COMPUTER SYSTEM</w:t>
-      </w:r>
-      <w:r>
-        <w:rPr>
-          <w:color w:val="808080" w:themeColor="background1" w:themeShade="80"/>
-        </w:rPr>
-        <w:t>.</w:t>
+        <w:t>JOEY MENDONCA’S COMPUTER SYSTEM.</w:t>
       </w:r>
     </w:p>
     <w:p>
@@ -1587,13 +1503,7 @@
         <w:rPr>
           <w:color w:val="808080" w:themeColor="background1" w:themeShade="80"/>
         </w:rPr>
-        <w:t>JULIE CHAMBERLAIN’S COMPUTER SYSTEM</w:t>
-      </w:r>
-      <w:r>
-        <w:rPr>
-          <w:color w:val="808080" w:themeColor="background1" w:themeShade="80"/>
-        </w:rPr>
-        <w:t>.</w:t>
+        <w:t>JULIE CHAMBERLAIN’S COMPUTER SYSTEM.</w:t>
       </w:r>
     </w:p>
     <w:p>
@@ -1657,19 +1567,7 @@
         <w:rPr>
           <w:color w:val="808080" w:themeColor="background1" w:themeShade="80"/>
         </w:rPr>
-        <w:t xml:space="preserve">ALLEGEDLY </w:t>
-      </w:r>
-      <w:r>
-        <w:rPr>
-          <w:color w:val="808080" w:themeColor="background1" w:themeShade="80"/>
-        </w:rPr>
-        <w:t>ILLICIT EX-JUDICIAL EXECUTION SOFTWARE DEVELOPED BY CHRIS HAWKINSON OR OTHER FORMER OR CURRENT FEDERAL EMPLOYEES</w:t>
-      </w:r>
-      <w:r>
-        <w:rPr>
-          <w:color w:val="808080" w:themeColor="background1" w:themeShade="80"/>
-        </w:rPr>
-        <w:t>.</w:t>
+        <w:t>ALLEGEDLY ILLICIT EX-JUDICIAL EXECUTION SOFTWARE DEVELOPED BY CHRIS HAWKINSON OR OTHER FORMER OR CURRENT FEDERAL EMPLOYEES.</w:t>
       </w:r>
     </w:p>
     <w:p>
@@ -1733,19 +1631,7 @@
         <w:rPr>
           <w:color w:val="808080" w:themeColor="background1" w:themeShade="80"/>
         </w:rPr>
-        <w:t xml:space="preserve">ALLEGEDLY USED TO CONDUCT </w:t>
-      </w:r>
-      <w:r>
-        <w:rPr>
-          <w:color w:val="808080" w:themeColor="background1" w:themeShade="80"/>
-        </w:rPr>
-        <w:t xml:space="preserve">MENTAL HEALTH </w:t>
-      </w:r>
-      <w:r>
-        <w:rPr>
-          <w:color w:val="808080" w:themeColor="background1" w:themeShade="80"/>
-        </w:rPr>
-        <w:t>WAR CRIMES FROM THE PENTAGON BY DEPARTMENT OF DEFENSE EMPLOYEES.</w:t>
+        <w:t>ALLEGEDLY USED TO CONDUCT MENTAL HEALTH WAR CRIMES FROM THE PENTAGON BY DEPARTMENT OF DEFENSE EMPLOYEES.</w:t>
       </w:r>
     </w:p>
     <w:p>
@@ -1876,13 +1762,7 @@
         <w:rPr>
           <w:color w:val="808080" w:themeColor="background1" w:themeShade="80"/>
         </w:rPr>
-        <w:t xml:space="preserve">ALLEGEDLY USED TO </w:t>
-      </w:r>
-      <w:r>
-        <w:rPr>
-          <w:color w:val="808080" w:themeColor="background1" w:themeShade="80"/>
-        </w:rPr>
-        <w:t>MAKE PATRICK R. MCELHINEY CHEW NICOTINE GUM, EXCESSIVELY. ALLEGEDLY NOT IN RELATION TO ADMIRAL MICHAEL MULLEN.</w:t>
+        <w:t>ALLEGEDLY USED TO MAKE PATRICK R. MCELHINEY CHEW NICOTINE GUM, EXCESSIVELY. ALLEGEDLY NOT IN RELATION TO ADMIRAL MICHAEL MULLEN.</w:t>
       </w:r>
     </w:p>
     <w:p>
@@ -1946,19 +1826,7 @@
         <w:rPr>
           <w:color w:val="808080" w:themeColor="background1" w:themeShade="80"/>
         </w:rPr>
-        <w:t>ALLEGEDLY USED TO MAKE PATRICK R. MCELHINEY CHEW NICOTINE GUM, EXCESSIVELY.</w:t>
-      </w:r>
-      <w:r>
-        <w:rPr>
-          <w:color w:val="808080" w:themeColor="background1" w:themeShade="80"/>
-        </w:rPr>
-        <w:t xml:space="preserve"> </w:t>
-      </w:r>
-      <w:r>
-        <w:rPr>
-          <w:color w:val="808080" w:themeColor="background1" w:themeShade="80"/>
-        </w:rPr>
-        <w:t>ALLEGEDLY NOT IN RELATION TO ADMIRAL MICHAEL MULLEN.</w:t>
+        <w:t>ALLEGEDLY USED TO MAKE PATRICK R. MCELHINEY CHEW NICOTINE GUM, EXCESSIVELY. ALLEGEDLY NOT IN RELATION TO ADMIRAL MICHAEL MULLEN.</w:t>
       </w:r>
     </w:p>
     <w:p>
@@ -2022,19 +1890,7 @@
         <w:rPr>
           <w:color w:val="808080" w:themeColor="background1" w:themeShade="80"/>
         </w:rPr>
-        <w:t>ALLEGEDLY USED TO MAKE PATRICK R. MCELHINEY CHEW NICOTINE GUM, EXCESSIVELY.</w:t>
-      </w:r>
-      <w:r>
-        <w:rPr>
-          <w:color w:val="808080" w:themeColor="background1" w:themeShade="80"/>
-        </w:rPr>
-        <w:t xml:space="preserve"> </w:t>
-      </w:r>
-      <w:r>
-        <w:rPr>
-          <w:color w:val="808080" w:themeColor="background1" w:themeShade="80"/>
-        </w:rPr>
-        <w:t>ALLEGEDLY NOT IN RELATION TO ADMIRAL MICHAEL MULLEN.</w:t>
+        <w:t>ALLEGEDLY USED TO MAKE PATRICK R. MCELHINEY CHEW NICOTINE GUM, EXCESSIVELY. ALLEGEDLY NOT IN RELATION TO ADMIRAL MICHAEL MULLEN.</w:t>
       </w:r>
     </w:p>
     <w:p>
@@ -2098,19 +1954,7 @@
         <w:rPr>
           <w:color w:val="808080" w:themeColor="background1" w:themeShade="80"/>
         </w:rPr>
-        <w:t>ALLEGEDLY USED TO MAKE PATRICK R. MCELHINEY CHEW NICOTINE GUM, EXCESSIVELY.</w:t>
-      </w:r>
-      <w:r>
-        <w:rPr>
-          <w:color w:val="808080" w:themeColor="background1" w:themeShade="80"/>
-        </w:rPr>
-        <w:t xml:space="preserve"> </w:t>
-      </w:r>
-      <w:r>
-        <w:rPr>
-          <w:color w:val="808080" w:themeColor="background1" w:themeShade="80"/>
-        </w:rPr>
-        <w:t>ALLEGEDLY NOT IN RELATION TO ADMIRAL MICHAEL MULLEN.</w:t>
+        <w:t>ALLEGEDLY USED TO MAKE PATRICK R. MCELHINEY CHEW NICOTINE GUM, EXCESSIVELY. ALLEGEDLY NOT IN RELATION TO ADMIRAL MICHAEL MULLEN.</w:t>
       </w:r>
     </w:p>
     <w:p>
@@ -2175,19 +2019,7 @@
         <w:rPr>
           <w:color w:val="808080" w:themeColor="background1" w:themeShade="80"/>
         </w:rPr>
-        <w:t>ALLEGEDLY USED TO MAKE PATRICK R. MCELHINEY CHEW NICOTINE GUM, EXCESSIVELY.</w:t>
-      </w:r>
-      <w:r>
-        <w:rPr>
-          <w:color w:val="808080" w:themeColor="background1" w:themeShade="80"/>
-        </w:rPr>
-        <w:t xml:space="preserve"> </w:t>
-      </w:r>
-      <w:r>
-        <w:rPr>
-          <w:color w:val="808080" w:themeColor="background1" w:themeShade="80"/>
-        </w:rPr>
-        <w:t>ALLEGEDLY NOT IN RELATION TO ADMIRAL MICHAEL MULLEN.</w:t>
+        <w:t>ALLEGEDLY USED TO MAKE PATRICK R. MCELHINEY CHEW NICOTINE GUM, EXCESSIVELY. ALLEGEDLY NOT IN RELATION TO ADMIRAL MICHAEL MULLEN.</w:t>
       </w:r>
     </w:p>
     <w:p>
@@ -2251,19 +2083,7 @@
         <w:rPr>
           <w:color w:val="808080" w:themeColor="background1" w:themeShade="80"/>
         </w:rPr>
-        <w:t xml:space="preserve">ALLEGEDLY USED TO </w:t>
-      </w:r>
-      <w:r>
-        <w:rPr>
-          <w:color w:val="808080" w:themeColor="background1" w:themeShade="80"/>
-        </w:rPr>
-        <w:t>CONDUCT OFFENSIVE ACTS TOWARDS PATRICK R. MCELHINEY</w:t>
-      </w:r>
-      <w:r>
-        <w:rPr>
-          <w:color w:val="808080" w:themeColor="background1" w:themeShade="80"/>
-        </w:rPr>
-        <w:t>.</w:t>
+        <w:t>ALLEGEDLY USED TO CONDUCT OFFENSIVE ACTS TOWARDS PATRICK R. MCELHINEY.</w:t>
       </w:r>
     </w:p>
     <w:p>
@@ -2328,6 +2148,12 @@
         </w:rPr>
         <w:t>PATRICK R. MCELHINEY.</w:t>
       </w:r>
+      <w:r>
+        <w:rPr>
+          <w:color w:val="808080" w:themeColor="background1" w:themeShade="80"/>
+        </w:rPr>
+        <w:t xml:space="preserve"> ALLEGEDLY CREATED BY CHRIS HAWKINSON AND OTHER FEDERAL EMPLOYEES TO CONDUCT CRIMES TOWARDS PATRICK R. MCELHINEY.</w:t>
+      </w:r>
     </w:p>
     <w:p>
       <w:pPr>
@@ -2364,15 +2190,7 @@
           <w:bCs/>
           <w:color w:val="FF0000"/>
         </w:rPr>
-        <w:t>PATRIC</w:t>
-      </w:r>
-      <w:r>
-        <w:rPr>
-          <w:b/>
-          <w:bCs/>
-          <w:color w:val="FF0000"/>
-        </w:rPr>
-        <w:t>K R. MCELHINEY INSTANCES</w:t>
+        <w:t>PATRICK R. MCELHINEY INSTANCES</w:t>
       </w:r>
       <w:r>
         <w:rPr>
@@ -2386,6 +2204,12 @@
           <w:color w:val="808080" w:themeColor="background1" w:themeShade="80"/>
         </w:rPr>
         <w:t xml:space="preserve"> // NOT CREATED BY OR USED BY PATRICK R. MCELHINEY.</w:t>
+      </w:r>
+      <w:r>
+        <w:rPr>
+          <w:color w:val="808080" w:themeColor="background1" w:themeShade="80"/>
+        </w:rPr>
+        <w:t xml:space="preserve"> ALLEGEDLY IS ACTUALLY CHRIS HAWKINSON INSTANCES.</w:t>
       </w:r>
     </w:p>
     <w:p>
@@ -2513,67 +2337,7 @@
         <w:rPr>
           <w:color w:val="808080" w:themeColor="background1" w:themeShade="80"/>
         </w:rPr>
-        <w:t xml:space="preserve">ALLEGEDLY USED TO </w:t>
-      </w:r>
-      <w:r>
-        <w:rPr>
-          <w:color w:val="808080" w:themeColor="background1" w:themeShade="80"/>
-        </w:rPr>
-        <w:t xml:space="preserve">TRAIN EMPLOYEES TO </w:t>
-      </w:r>
-      <w:r>
-        <w:rPr>
-          <w:color w:val="808080" w:themeColor="background1" w:themeShade="80"/>
-        </w:rPr>
-        <w:t xml:space="preserve">CONDUCT </w:t>
-      </w:r>
-      <w:r>
-        <w:rPr>
-          <w:color w:val="808080" w:themeColor="background1" w:themeShade="80"/>
-        </w:rPr>
-        <w:t>TREASONOUS ACTIVITIES</w:t>
-      </w:r>
-      <w:r>
-        <w:rPr>
-          <w:color w:val="808080" w:themeColor="background1" w:themeShade="80"/>
-        </w:rPr>
-        <w:t xml:space="preserve"> FROM THE </w:t>
-      </w:r>
-      <w:r>
-        <w:rPr>
-          <w:color w:val="808080" w:themeColor="background1" w:themeShade="80"/>
-        </w:rPr>
-        <w:t>CENTRAL INTELLIGENCE AGENCY</w:t>
-      </w:r>
-      <w:r>
-        <w:rPr>
-          <w:color w:val="808080" w:themeColor="background1" w:themeShade="80"/>
-        </w:rPr>
-        <w:t xml:space="preserve"> BY </w:t>
-      </w:r>
-      <w:r>
-        <w:rPr>
-          <w:color w:val="808080" w:themeColor="background1" w:themeShade="80"/>
-        </w:rPr>
-        <w:t>A</w:t>
-      </w:r>
-      <w:r>
-        <w:rPr>
-          <w:color w:val="808080" w:themeColor="background1" w:themeShade="80"/>
-        </w:rPr>
-        <w:t xml:space="preserve"> </w:t>
-      </w:r>
-      <w:r>
-        <w:rPr>
-          <w:color w:val="808080" w:themeColor="background1" w:themeShade="80"/>
-        </w:rPr>
-        <w:t xml:space="preserve">CIA </w:t>
-      </w:r>
-      <w:r>
-        <w:rPr>
-          <w:color w:val="808080" w:themeColor="background1" w:themeShade="80"/>
-        </w:rPr>
-        <w:t>EMPLOYEE.</w:t>
+        <w:t>ALLEGEDLY USED TO TRAIN EMPLOYEES TO CONDUCT TREASONOUS ACTIVITIES FROM THE CENTRAL INTELLIGENCE AGENCY BY A CIA EMPLOYEE.</w:t>
       </w:r>
     </w:p>
     <w:p>
@@ -2637,19 +2401,7 @@
         <w:rPr>
           <w:color w:val="808080" w:themeColor="background1" w:themeShade="80"/>
         </w:rPr>
-        <w:t>ALLEGEDLY CHRIS HAWKINSON’S COMPUTER SYSTEM</w:t>
-      </w:r>
-      <w:r>
-        <w:rPr>
-          <w:color w:val="808080" w:themeColor="background1" w:themeShade="80"/>
-        </w:rPr>
-        <w:t xml:space="preserve"> THAT ALLEGEDLY PERFORMS FUNCTIONS FOR THE DEFENSE INTELLIGENCE AGENCY</w:t>
-      </w:r>
-      <w:r>
-        <w:rPr>
-          <w:color w:val="808080" w:themeColor="background1" w:themeShade="80"/>
-        </w:rPr>
-        <w:t>.</w:t>
+        <w:t>ALLEGEDLY CHRIS HAWKINSON’S COMPUTER SYSTEM THAT ALLEGEDLY PERFORMS FUNCTIONS FOR THE DEFENSE INTELLIGENCE AGENCY.</w:t>
       </w:r>
     </w:p>
     <w:p>
@@ -2713,19 +2465,7 @@
         <w:rPr>
           <w:color w:val="808080" w:themeColor="background1" w:themeShade="80"/>
         </w:rPr>
-        <w:t>ALLEGEDLY CHRIS HAWKINSON’S COMPUTER SYSTEM</w:t>
-      </w:r>
-      <w:r>
-        <w:rPr>
-          <w:color w:val="808080" w:themeColor="background1" w:themeShade="80"/>
-        </w:rPr>
-        <w:t xml:space="preserve"> THAT ALLEGEDLY IMPERSONATES THE FEDERAL BUREAU OF INVESTIGATION</w:t>
-      </w:r>
-      <w:r>
-        <w:rPr>
-          <w:color w:val="808080" w:themeColor="background1" w:themeShade="80"/>
-        </w:rPr>
-        <w:t>.</w:t>
+        <w:t>ALLEGEDLY CHRIS HAWKINSON’S COMPUTER SYSTEM THAT ALLEGEDLY IMPERSONATES THE FEDERAL BUREAU OF INVESTIGATION.</w:t>
       </w:r>
     </w:p>
     <w:p>
@@ -2792,13 +2532,7 @@
         <w:rPr>
           <w:color w:val="808080" w:themeColor="background1" w:themeShade="80"/>
         </w:rPr>
-        <w:t xml:space="preserve">ALLEGEDLY USED TO </w:t>
-      </w:r>
-      <w:r>
-        <w:rPr>
-          <w:color w:val="808080" w:themeColor="background1" w:themeShade="80"/>
-        </w:rPr>
-        <w:t>CRASH THE GLOBAL ECONOMY IN 2008 BY FORMER OR CURRENT PENTAGON EMPLOYEES.</w:t>
+        <w:t>ALLEGEDLY USED TO CRASH THE GLOBAL ECONOMY IN 2008 BY FORMER OR CURRENT PENTAGON EMPLOYEES.</w:t>
       </w:r>
     </w:p>
     <w:p>
@@ -2862,19 +2596,7 @@
         <w:rPr>
           <w:color w:val="808080" w:themeColor="background1" w:themeShade="80"/>
         </w:rPr>
-        <w:t>ALLEGEDLY CHRIS HAWKINSON’S COMPUTER SYSTEM</w:t>
-      </w:r>
-      <w:r>
-        <w:rPr>
-          <w:color w:val="808080" w:themeColor="background1" w:themeShade="80"/>
-        </w:rPr>
-        <w:t xml:space="preserve"> THAT ALLEGEDLY IMPERSONATES THE INTERNAL REVENUE SERVICE</w:t>
-      </w:r>
-      <w:r>
-        <w:rPr>
-          <w:color w:val="808080" w:themeColor="background1" w:themeShade="80"/>
-        </w:rPr>
-        <w:t>.</w:t>
+        <w:t>ALLEGEDLY CHRIS HAWKINSON’S COMPUTER SYSTEM THAT ALLEGEDLY IMPERSONATES THE INTERNAL REVENUE SERVICE.</w:t>
       </w:r>
     </w:p>
     <w:p>
@@ -2938,19 +2660,7 @@
         <w:rPr>
           <w:color w:val="808080" w:themeColor="background1" w:themeShade="80"/>
         </w:rPr>
-        <w:t>ALLEGEDLY CHRIS HAWKINSON’S COMPUTER SYSTEM</w:t>
-      </w:r>
-      <w:r>
-        <w:rPr>
-          <w:color w:val="808080" w:themeColor="background1" w:themeShade="80"/>
-        </w:rPr>
-        <w:t xml:space="preserve"> THAT IMPERSONATES OR PERFORMS ACTIONS FOR THE NATIONAL SECURITY AGENCY</w:t>
-      </w:r>
-      <w:r>
-        <w:rPr>
-          <w:color w:val="808080" w:themeColor="background1" w:themeShade="80"/>
-        </w:rPr>
-        <w:t>.</w:t>
+        <w:t>ALLEGEDLY CHRIS HAWKINSON’S COMPUTER SYSTEM THAT IMPERSONATES OR PERFORMS ACTIONS FOR THE NATIONAL SECURITY AGENCY.</w:t>
       </w:r>
     </w:p>
     <w:p>
@@ -3015,19 +2725,7 @@
         <w:rPr>
           <w:color w:val="808080" w:themeColor="background1" w:themeShade="80"/>
         </w:rPr>
-        <w:t xml:space="preserve">ALLEGEDLY </w:t>
-      </w:r>
-      <w:r>
-        <w:rPr>
-          <w:color w:val="808080" w:themeColor="background1" w:themeShade="80"/>
-        </w:rPr>
-        <w:t>THE PENTAGON</w:t>
-      </w:r>
-      <w:r>
-        <w:rPr>
-          <w:color w:val="808080" w:themeColor="background1" w:themeShade="80"/>
-        </w:rPr>
-        <w:t>’S COMPUTER SYSTEM.</w:t>
+        <w:t>ALLEGEDLY THE PENTAGON’S COMPUTER SYSTEM.</w:t>
       </w:r>
     </w:p>
     <w:p>
@@ -3091,31 +2789,7 @@
         <w:rPr>
           <w:color w:val="808080" w:themeColor="background1" w:themeShade="80"/>
         </w:rPr>
-        <w:t xml:space="preserve">ALLEGEDLY </w:t>
-      </w:r>
-      <w:r>
-        <w:rPr>
-          <w:color w:val="808080" w:themeColor="background1" w:themeShade="80"/>
-        </w:rPr>
-        <w:t xml:space="preserve">                         </w:t>
-      </w:r>
-      <w:r>
-        <w:rPr>
-          <w:color w:val="808080" w:themeColor="background1" w:themeShade="80"/>
-        </w:rPr>
-        <w:t>CHRIS HAWKINSON’S COMPUTER SYSTEM</w:t>
-      </w:r>
-      <w:r>
-        <w:rPr>
-          <w:color w:val="808080" w:themeColor="background1" w:themeShade="80"/>
-        </w:rPr>
-        <w:t xml:space="preserve"> USED TO EX-JUDICALLY EXECUTE OVER 80,000 OR UP TO OVER 800,000 AMERICANS DURING COVID-19</w:t>
-      </w:r>
-      <w:r>
-        <w:rPr>
-          <w:color w:val="808080" w:themeColor="background1" w:themeShade="80"/>
-        </w:rPr>
-        <w:t>.</w:t>
+        <w:t>ALLEGEDLY                          CHRIS HAWKINSON’S COMPUTER SYSTEM USED TO EX-JUDICALLY EXECUTE OVER 80,000 OR UP TO OVER 800,000 AMERICANS DURING COVID-19.</w:t>
       </w:r>
     </w:p>
     <w:p>
@@ -3179,31 +2853,7 @@
         <w:rPr>
           <w:color w:val="808080" w:themeColor="background1" w:themeShade="80"/>
         </w:rPr>
-        <w:t xml:space="preserve">ALLEGEDLY </w:t>
-      </w:r>
-      <w:r>
-        <w:rPr>
-          <w:color w:val="808080" w:themeColor="background1" w:themeShade="80"/>
-        </w:rPr>
-        <w:t xml:space="preserve">                           </w:t>
-      </w:r>
-      <w:r>
-        <w:rPr>
-          <w:color w:val="808080" w:themeColor="background1" w:themeShade="80"/>
-        </w:rPr>
-        <w:t>CHRIS HAWKINSON’S COMPUTER SYSTEM</w:t>
-      </w:r>
-      <w:r>
-        <w:rPr>
-          <w:color w:val="808080" w:themeColor="background1" w:themeShade="80"/>
-        </w:rPr>
-        <w:t xml:space="preserve"> THAT WAS IMPERSONATING THE UNIVERSITY OF NEW HAMPSHIRE</w:t>
-      </w:r>
-      <w:r>
-        <w:rPr>
-          <w:color w:val="808080" w:themeColor="background1" w:themeShade="80"/>
-        </w:rPr>
-        <w:t>.</w:t>
+        <w:t>ALLEGEDLY                            CHRIS HAWKINSON’S COMPUTER SYSTEM THAT WAS IMPERSONATING THE UNIVERSITY OF NEW HAMPSHIRE.</w:t>
       </w:r>
     </w:p>
     <w:p>
@@ -3267,19 +2917,7 @@
         <w:rPr>
           <w:color w:val="808080" w:themeColor="background1" w:themeShade="80"/>
         </w:rPr>
-        <w:t xml:space="preserve">ALLEGEDLY </w:t>
-      </w:r>
-      <w:r>
-        <w:rPr>
-          <w:color w:val="808080" w:themeColor="background1" w:themeShade="80"/>
-        </w:rPr>
-        <w:t>BASED ON WAR CODE DEVELOPED BY BILL GATES</w:t>
-      </w:r>
-      <w:r>
-        <w:rPr>
-          <w:color w:val="808080" w:themeColor="background1" w:themeShade="80"/>
-        </w:rPr>
-        <w:t>.</w:t>
+        <w:t>ALLEGEDLY BASED ON WAR CODE DEVELOPED BY BILL GATES.</w:t>
       </w:r>
     </w:p>
     <w:p>
@@ -3343,19 +2981,7 @@
         <w:rPr>
           <w:color w:val="808080" w:themeColor="background1" w:themeShade="80"/>
         </w:rPr>
-        <w:t xml:space="preserve">ALLEGEDLY </w:t>
-      </w:r>
-      <w:r>
-        <w:rPr>
-          <w:color w:val="808080" w:themeColor="background1" w:themeShade="80"/>
-        </w:rPr>
-        <w:t>BASED ON WAR CODE DEVELOPED BY BILL GATES</w:t>
-      </w:r>
-      <w:r>
-        <w:rPr>
-          <w:color w:val="808080" w:themeColor="background1" w:themeShade="80"/>
-        </w:rPr>
-        <w:t>.</w:t>
+        <w:t>ALLEGEDLY BASED ON WAR CODE DEVELOPED BY BILL GATES.</w:t>
       </w:r>
     </w:p>
     <w:p>
@@ -3419,19 +3045,7 @@
         <w:rPr>
           <w:color w:val="808080" w:themeColor="background1" w:themeShade="80"/>
         </w:rPr>
-        <w:t xml:space="preserve">ALLEGEDLY </w:t>
-      </w:r>
-      <w:r>
-        <w:rPr>
-          <w:color w:val="808080" w:themeColor="background1" w:themeShade="80"/>
-        </w:rPr>
-        <w:t>USED TO CONDUCT WAR FROM THE PENTAGON BY DEPARTMENT OF DEFENSE EMPLOYEES</w:t>
-      </w:r>
-      <w:r>
-        <w:rPr>
-          <w:color w:val="808080" w:themeColor="background1" w:themeShade="80"/>
-        </w:rPr>
-        <w:t>.</w:t>
+        <w:t>ALLEGEDLY USED TO CONDUCT WAR FROM THE PENTAGON BY DEPARTMENT OF DEFENSE EMPLOYEES.</w:t>
       </w:r>
     </w:p>
     <w:p>
@@ -3495,19 +3109,7 @@
         <w:rPr>
           <w:color w:val="808080" w:themeColor="background1" w:themeShade="80"/>
         </w:rPr>
-        <w:t xml:space="preserve">ALLEGEDLY USED TO CONDUCT WAR </w:t>
-      </w:r>
-      <w:r>
-        <w:rPr>
-          <w:color w:val="808080" w:themeColor="background1" w:themeShade="80"/>
-        </w:rPr>
-        <w:t>FROM</w:t>
-      </w:r>
-      <w:r>
-        <w:rPr>
-          <w:color w:val="808080" w:themeColor="background1" w:themeShade="80"/>
-        </w:rPr>
-        <w:t xml:space="preserve"> THE PENTAGON BY DEPARTMENT OF DEFENSE EMPLOYEES.</w:t>
+        <w:t>ALLEGEDLY USED TO CONDUCT WAR FROM THE PENTAGON BY DEPARTMENT OF DEFENSE EMPLOYEES.</w:t>
       </w:r>
     </w:p>
     <w:p>
@@ -3574,19 +3176,7 @@
         <w:rPr>
           <w:color w:val="808080" w:themeColor="background1" w:themeShade="80"/>
         </w:rPr>
-        <w:t xml:space="preserve">ALLEGEDLY USED TO CONDUCT WAR </w:t>
-      </w:r>
-      <w:r>
-        <w:rPr>
-          <w:color w:val="808080" w:themeColor="background1" w:themeShade="80"/>
-        </w:rPr>
-        <w:t>CRIMES FROM</w:t>
-      </w:r>
-      <w:r>
-        <w:rPr>
-          <w:color w:val="808080" w:themeColor="background1" w:themeShade="80"/>
-        </w:rPr>
-        <w:t xml:space="preserve"> THE PENTAGON BY DEPARTMENT OF DEFENSE EMPLOYEES.</w:t>
+        <w:t>ALLEGEDLY USED TO CONDUCT WAR CRIMES FROM THE PENTAGON BY DEPARTMENT OF DEFENSE EMPLOYEES.</w:t>
       </w:r>
     </w:p>
     <w:p>
@@ -3653,13 +3243,7 @@
         <w:rPr>
           <w:color w:val="808080" w:themeColor="background1" w:themeShade="80"/>
         </w:rPr>
-        <w:t>ALLEGEDLY USED TO CONDUCT WAR CRIMES FROM THE PENTAGON BY DEPARTMENT OF DEFENSE EMPLOYEES</w:t>
-      </w:r>
-      <w:r>
-        <w:rPr>
-          <w:color w:val="808080" w:themeColor="background1" w:themeShade="80"/>
-        </w:rPr>
-        <w:t>.</w:t>
+        <w:t>ALLEGEDLY USED TO CONDUCT WAR CRIMES FROM THE PENTAGON BY DEPARTMENT OF DEFENSE EMPLOYEES.</w:t>
       </w:r>
     </w:p>
     <w:p>

</xml_diff>

<commit_message>
Update 4/14/2023 9:05AM EST
Update as of 9:05AM EST on 4/14/2023.
</commit_message>
<xml_diff>
--- a/20230414 - MCE123 Technology Development - Illicit Government Software Runtime Prevention Security Systems - v1.0.0.1.docx
+++ b/20230414 - MCE123 Technology Development - Illicit Government Software Runtime Prevention Security Systems - v1.0.0.1.docx
@@ -525,7 +525,6 @@
         </w:rPr>
         <w:t>NEVER BE ALLOWED</w:t>
       </w:r>
-      <w:proofErr w:type="gramStart"/>
       <w:r>
         <w:rPr>
           <w:rFonts w:ascii="Courier New" w:hAnsi="Courier New" w:cs="Courier New"/>
@@ -540,11 +539,7 @@
         <w:t xml:space="preserve">, </w:t>
       </w:r>
       <w:r>
-        <w:t xml:space="preserve">  </w:t>
-      </w:r>
-      <w:proofErr w:type="gramEnd"/>
-      <w:r>
-        <w:t xml:space="preserve">                            </w:t>
+        <w:t xml:space="preserve">                              </w:t>
       </w:r>
       <w:r>
         <w:rPr>
@@ -607,7 +602,6 @@
         </w:rPr>
         <w:t xml:space="preserve">ILLICIT SOFTWARE </w:t>
       </w:r>
-      <w:proofErr w:type="gramStart"/>
       <w:r>
         <w:rPr>
           <w:b/>
@@ -623,7 +617,6 @@
         </w:rPr>
         <w:t>;</w:t>
       </w:r>
-      <w:proofErr w:type="gramEnd"/>
     </w:p>
     <w:p>
       <w:pPr>
@@ -788,16 +781,7 @@
           <w:bCs/>
           <w:color w:val="FF0000"/>
         </w:rPr>
-        <w:t xml:space="preserve">CHRISTOPHER HAWKINSON </w:t>
-      </w:r>
-      <w:proofErr w:type="gramStart"/>
-      <w:r>
-        <w:rPr>
-          <w:b/>
-          <w:bCs/>
-          <w:color w:val="FF0000"/>
-        </w:rPr>
-        <w:t>INSTANCES</w:t>
+        <w:t>CHRISTOPHER HAWKINSON INSTANCES</w:t>
       </w:r>
       <w:r>
         <w:rPr>
@@ -811,15 +795,7 @@
           <w:b/>
           <w:bCs/>
         </w:rPr>
-        <w:t xml:space="preserve">   </w:t>
-      </w:r>
-      <w:proofErr w:type="gramEnd"/>
-      <w:r>
-        <w:rPr>
-          <w:b/>
-          <w:bCs/>
-        </w:rPr>
-        <w:t xml:space="preserve">                                  </w:t>
+        <w:t xml:space="preserve">                                     </w:t>
       </w:r>
       <w:r>
         <w:rPr>
@@ -869,16 +845,7 @@
           <w:bCs/>
           <w:color w:val="FF0000"/>
         </w:rPr>
-        <w:t xml:space="preserve">CHRISTOPHER HAWKINSON </w:t>
-      </w:r>
-      <w:proofErr w:type="gramStart"/>
-      <w:r>
-        <w:rPr>
-          <w:b/>
-          <w:bCs/>
-          <w:color w:val="FF0000"/>
-        </w:rPr>
-        <w:t>SYSTEMS</w:t>
+        <w:t>CHRISTOPHER HAWKINSON SYSTEMS</w:t>
       </w:r>
       <w:r>
         <w:rPr>
@@ -892,15 +859,7 @@
           <w:b/>
           <w:bCs/>
         </w:rPr>
-        <w:t xml:space="preserve">   </w:t>
-      </w:r>
-      <w:proofErr w:type="gramEnd"/>
-      <w:r>
-        <w:rPr>
-          <w:b/>
-          <w:bCs/>
-        </w:rPr>
-        <w:t xml:space="preserve">                                      </w:t>
+        <w:t xml:space="preserve">                                         </w:t>
       </w:r>
       <w:r>
         <w:rPr>
@@ -1276,16 +1235,7 @@
           <w:bCs/>
           <w:color w:val="FF0000"/>
         </w:rPr>
-        <w:t xml:space="preserve">INVERSION </w:t>
-      </w:r>
-      <w:proofErr w:type="gramStart"/>
-      <w:r>
-        <w:rPr>
-          <w:b/>
-          <w:bCs/>
-          <w:color w:val="FF0000"/>
-        </w:rPr>
-        <w:t>SOFTWARE</w:t>
+        <w:t>INVERSION SOFTWARE</w:t>
       </w:r>
       <w:r>
         <w:rPr>
@@ -1294,7 +1244,6 @@
         </w:rPr>
         <w:t>;</w:t>
       </w:r>
-      <w:proofErr w:type="gramEnd"/>
     </w:p>
     <w:p>
       <w:pPr>
@@ -1460,16 +1409,7 @@
           <w:bCs/>
           <w:color w:val="FF0000"/>
         </w:rPr>
-        <w:t xml:space="preserve">JULIE CHAMBERLAIN </w:t>
-      </w:r>
-      <w:proofErr w:type="gramStart"/>
-      <w:r>
-        <w:rPr>
-          <w:b/>
-          <w:bCs/>
-          <w:color w:val="FF0000"/>
-        </w:rPr>
-        <w:t>INSTANCES</w:t>
+        <w:t>JULIE CHAMBERLAIN INSTANCES</w:t>
       </w:r>
       <w:r>
         <w:rPr>
@@ -1483,15 +1423,7 @@
           <w:b/>
           <w:bCs/>
         </w:rPr>
-        <w:t xml:space="preserve">   </w:t>
-      </w:r>
-      <w:proofErr w:type="gramEnd"/>
-      <w:r>
-        <w:rPr>
-          <w:b/>
-          <w:bCs/>
-        </w:rPr>
-        <w:t xml:space="preserve">                                             </w:t>
+        <w:t xml:space="preserve">                                                </w:t>
       </w:r>
       <w:r>
         <w:rPr>
@@ -1762,7 +1694,31 @@
         <w:rPr>
           <w:color w:val="808080" w:themeColor="background1" w:themeShade="80"/>
         </w:rPr>
-        <w:t>ALLEGEDLY USED TO MAKE PATRICK R. MCELHINEY CHEW NICOTINE GUM, EXCESSIVELY. ALLEGEDLY NOT IN RELATION TO ADMIRAL MICHAEL MULLEN.</w:t>
+        <w:t xml:space="preserve">ALLEGEDLY USED TO MAKE PATRICK R. MCELHINEY CHEW NICOTINE GUM, EXCESSIVELY. ALLEGEDLY NOT IN RELATION TO </w:t>
+      </w:r>
+      <w:r>
+        <w:rPr>
+          <w:color w:val="808080" w:themeColor="background1" w:themeShade="80"/>
+        </w:rPr>
+        <w:t>GENERAL</w:t>
+      </w:r>
+      <w:r>
+        <w:rPr>
+          <w:color w:val="808080" w:themeColor="background1" w:themeShade="80"/>
+        </w:rPr>
+        <w:t xml:space="preserve"> </w:t>
+      </w:r>
+      <w:r>
+        <w:rPr>
+          <w:color w:val="808080" w:themeColor="background1" w:themeShade="80"/>
+        </w:rPr>
+        <w:t>MARK MILLEY</w:t>
+      </w:r>
+      <w:r>
+        <w:rPr>
+          <w:color w:val="808080" w:themeColor="background1" w:themeShade="80"/>
+        </w:rPr>
+        <w:t>.</w:t>
       </w:r>
     </w:p>
     <w:p>
@@ -1826,7 +1782,31 @@
         <w:rPr>
           <w:color w:val="808080" w:themeColor="background1" w:themeShade="80"/>
         </w:rPr>
-        <w:t>ALLEGEDLY USED TO MAKE PATRICK R. MCELHINEY CHEW NICOTINE GUM, EXCESSIVELY. ALLEGEDLY NOT IN RELATION TO ADMIRAL MICHAEL MULLEN.</w:t>
+        <w:t xml:space="preserve">ALLEGEDLY USED TO MAKE PATRICK R. MCELHINEY CHEW NICOTINE GUM, EXCESSIVELY. ALLEGEDLY NOT IN RELATION TO </w:t>
+      </w:r>
+      <w:r>
+        <w:rPr>
+          <w:color w:val="808080" w:themeColor="background1" w:themeShade="80"/>
+        </w:rPr>
+        <w:t>GENERAL</w:t>
+      </w:r>
+      <w:r>
+        <w:rPr>
+          <w:color w:val="808080" w:themeColor="background1" w:themeShade="80"/>
+        </w:rPr>
+        <w:t xml:space="preserve"> </w:t>
+      </w:r>
+      <w:r>
+        <w:rPr>
+          <w:color w:val="808080" w:themeColor="background1" w:themeShade="80"/>
+        </w:rPr>
+        <w:t>MARK MILLEY</w:t>
+      </w:r>
+      <w:r>
+        <w:rPr>
+          <w:color w:val="808080" w:themeColor="background1" w:themeShade="80"/>
+        </w:rPr>
+        <w:t>.</w:t>
       </w:r>
     </w:p>
     <w:p>
@@ -1890,7 +1870,31 @@
         <w:rPr>
           <w:color w:val="808080" w:themeColor="background1" w:themeShade="80"/>
         </w:rPr>
-        <w:t>ALLEGEDLY USED TO MAKE PATRICK R. MCELHINEY CHEW NICOTINE GUM, EXCESSIVELY. ALLEGEDLY NOT IN RELATION TO ADMIRAL MICHAEL MULLEN.</w:t>
+        <w:t xml:space="preserve">ALLEGEDLY USED TO MAKE PATRICK R. MCELHINEY CHEW NICOTINE GUM, EXCESSIVELY. ALLEGEDLY NOT IN RELATION TO </w:t>
+      </w:r>
+      <w:r>
+        <w:rPr>
+          <w:color w:val="808080" w:themeColor="background1" w:themeShade="80"/>
+        </w:rPr>
+        <w:t>GENERAL</w:t>
+      </w:r>
+      <w:r>
+        <w:rPr>
+          <w:color w:val="808080" w:themeColor="background1" w:themeShade="80"/>
+        </w:rPr>
+        <w:t xml:space="preserve"> </w:t>
+      </w:r>
+      <w:r>
+        <w:rPr>
+          <w:color w:val="808080" w:themeColor="background1" w:themeShade="80"/>
+        </w:rPr>
+        <w:t>MARK MILLEY</w:t>
+      </w:r>
+      <w:r>
+        <w:rPr>
+          <w:color w:val="808080" w:themeColor="background1" w:themeShade="80"/>
+        </w:rPr>
+        <w:t>.</w:t>
       </w:r>
     </w:p>
     <w:p>
@@ -1954,7 +1958,31 @@
         <w:rPr>
           <w:color w:val="808080" w:themeColor="background1" w:themeShade="80"/>
         </w:rPr>
-        <w:t>ALLEGEDLY USED TO MAKE PATRICK R. MCELHINEY CHEW NICOTINE GUM, EXCESSIVELY. ALLEGEDLY NOT IN RELATION TO ADMIRAL MICHAEL MULLEN.</w:t>
+        <w:t xml:space="preserve">ALLEGEDLY USED TO MAKE PATRICK R. MCELHINEY CHEW NICOTINE GUM, EXCESSIVELY. ALLEGEDLY NOT IN RELATION TO </w:t>
+      </w:r>
+      <w:r>
+        <w:rPr>
+          <w:color w:val="808080" w:themeColor="background1" w:themeShade="80"/>
+        </w:rPr>
+        <w:t>GENERAL</w:t>
+      </w:r>
+      <w:r>
+        <w:rPr>
+          <w:color w:val="808080" w:themeColor="background1" w:themeShade="80"/>
+        </w:rPr>
+        <w:t xml:space="preserve"> </w:t>
+      </w:r>
+      <w:r>
+        <w:rPr>
+          <w:color w:val="808080" w:themeColor="background1" w:themeShade="80"/>
+        </w:rPr>
+        <w:t>MARK MILLEY</w:t>
+      </w:r>
+      <w:r>
+        <w:rPr>
+          <w:color w:val="808080" w:themeColor="background1" w:themeShade="80"/>
+        </w:rPr>
+        <w:t>.</w:t>
       </w:r>
     </w:p>
     <w:p>
@@ -2019,7 +2047,31 @@
         <w:rPr>
           <w:color w:val="808080" w:themeColor="background1" w:themeShade="80"/>
         </w:rPr>
-        <w:t>ALLEGEDLY USED TO MAKE PATRICK R. MCELHINEY CHEW NICOTINE GUM, EXCESSIVELY. ALLEGEDLY NOT IN RELATION TO ADMIRAL MICHAEL MULLEN.</w:t>
+        <w:t xml:space="preserve">ALLEGEDLY USED TO MAKE PATRICK R. MCELHINEY CHEW NICOTINE GUM, EXCESSIVELY. ALLEGEDLY NOT IN RELATION TO </w:t>
+      </w:r>
+      <w:r>
+        <w:rPr>
+          <w:color w:val="808080" w:themeColor="background1" w:themeShade="80"/>
+        </w:rPr>
+        <w:t>GENERAL</w:t>
+      </w:r>
+      <w:r>
+        <w:rPr>
+          <w:color w:val="808080" w:themeColor="background1" w:themeShade="80"/>
+        </w:rPr>
+        <w:t xml:space="preserve"> </w:t>
+      </w:r>
+      <w:r>
+        <w:rPr>
+          <w:color w:val="808080" w:themeColor="background1" w:themeShade="80"/>
+        </w:rPr>
+        <w:t>MARK MILLEY</w:t>
+      </w:r>
+      <w:r>
+        <w:rPr>
+          <w:color w:val="808080" w:themeColor="background1" w:themeShade="80"/>
+        </w:rPr>
+        <w:t>.</w:t>
       </w:r>
     </w:p>
     <w:p>
@@ -3455,7 +3507,6 @@
         </w:rPr>
         <w:t xml:space="preserve">SOFTWARE </w:t>
       </w:r>
-      <w:proofErr w:type="gramStart"/>
       <w:r>
         <w:rPr>
           <w:b/>
@@ -3479,7 +3530,6 @@
         </w:rPr>
         <w:t>;</w:t>
       </w:r>
-      <w:proofErr w:type="gramEnd"/>
     </w:p>
     <w:bookmarkEnd w:id="1"/>
     <w:p>
@@ -4832,7 +4882,6 @@
       </w:rPr>
       <w:t xml:space="preserve"> </w:t>
     </w:r>
-    <w:proofErr w:type="gramStart"/>
     <w:r>
       <w:rPr>
         <w:b/>
@@ -4858,16 +4907,7 @@
         <w:color w:val="000000" w:themeColor="text1"/>
         <w:sz w:val="18"/>
       </w:rPr>
-      <w:t xml:space="preserve">  </w:t>
-    </w:r>
-    <w:proofErr w:type="gramEnd"/>
-    <w:r>
-      <w:rPr>
-        <w:i/>
-        <w:color w:val="000000" w:themeColor="text1"/>
-        <w:sz w:val="18"/>
-      </w:rPr>
-      <w:t xml:space="preserve">                Company </w:t>
+      <w:t xml:space="preserve">                  Company </w:t>
     </w:r>
     <w:r>
       <w:rPr>

</xml_diff>

<commit_message>
Update 4/14/2023 9:38AM EST
Update as of 9:38AM EST on 4/14/2023.
</commit_message>
<xml_diff>
--- a/20230414 - MCE123 Technology Development - Illicit Government Software Runtime Prevention Security Systems - v1.0.0.1.docx
+++ b/20230414 - MCE123 Technology Development - Illicit Government Software Runtime Prevention Security Systems - v1.0.0.1.docx
@@ -525,6 +525,7 @@
         </w:rPr>
         <w:t>NEVER BE ALLOWED</w:t>
       </w:r>
+      <w:proofErr w:type="gramStart"/>
       <w:r>
         <w:rPr>
           <w:rFonts w:ascii="Courier New" w:hAnsi="Courier New" w:cs="Courier New"/>
@@ -539,7 +540,11 @@
         <w:t xml:space="preserve">, </w:t>
       </w:r>
       <w:r>
-        <w:t xml:space="preserve">                              </w:t>
+        <w:t xml:space="preserve">  </w:t>
+      </w:r>
+      <w:proofErr w:type="gramEnd"/>
+      <w:r>
+        <w:t xml:space="preserve">                            </w:t>
       </w:r>
       <w:r>
         <w:rPr>
@@ -602,6 +607,7 @@
         </w:rPr>
         <w:t xml:space="preserve">ILLICIT SOFTWARE </w:t>
       </w:r>
+      <w:proofErr w:type="gramStart"/>
       <w:r>
         <w:rPr>
           <w:b/>
@@ -617,6 +623,7 @@
         </w:rPr>
         <w:t>;</w:t>
       </w:r>
+      <w:proofErr w:type="gramEnd"/>
     </w:p>
     <w:p>
       <w:pPr>
@@ -781,7 +788,32 @@
           <w:bCs/>
           <w:color w:val="FF0000"/>
         </w:rPr>
-        <w:t>CHRISTOPHER HAWKINSON INSTANCES</w:t>
+        <w:t xml:space="preserve">CHRISTOPHER </w:t>
+      </w:r>
+      <w:r>
+        <w:rPr>
+          <w:b/>
+          <w:bCs/>
+          <w:color w:val="FF0000"/>
+        </w:rPr>
+        <w:t xml:space="preserve">J. </w:t>
+      </w:r>
+      <w:r>
+        <w:rPr>
+          <w:b/>
+          <w:bCs/>
+          <w:color w:val="FF0000"/>
+        </w:rPr>
+        <w:t xml:space="preserve">HAWKINSON </w:t>
+      </w:r>
+      <w:proofErr w:type="gramStart"/>
+      <w:r>
+        <w:rPr>
+          <w:b/>
+          <w:bCs/>
+          <w:color w:val="FF0000"/>
+        </w:rPr>
+        <w:t>INSTANCES</w:t>
       </w:r>
       <w:r>
         <w:rPr>
@@ -795,7 +827,15 @@
           <w:b/>
           <w:bCs/>
         </w:rPr>
-        <w:t xml:space="preserve">                                     </w:t>
+        <w:t xml:space="preserve">   </w:t>
+      </w:r>
+      <w:proofErr w:type="gramEnd"/>
+      <w:r>
+        <w:rPr>
+          <w:b/>
+          <w:bCs/>
+        </w:rPr>
+        <w:t xml:space="preserve">                                  </w:t>
       </w:r>
       <w:r>
         <w:rPr>
@@ -807,7 +847,13 @@
         <w:rPr>
           <w:color w:val="808080" w:themeColor="background1" w:themeShade="80"/>
         </w:rPr>
-        <w:t>CHRIS HAWKINSON’S COMPUTER SYSTEM.</w:t>
+        <w:t>CHRISTOPHER J. HAWKINSON</w:t>
+      </w:r>
+      <w:r>
+        <w:rPr>
+          <w:color w:val="808080" w:themeColor="background1" w:themeShade="80"/>
+        </w:rPr>
+        <w:t>’S COMPUTER SYSTEM.</w:t>
       </w:r>
     </w:p>
     <w:p>
@@ -845,7 +891,32 @@
           <w:bCs/>
           <w:color w:val="FF0000"/>
         </w:rPr>
-        <w:t>CHRISTOPHER HAWKINSON SYSTEMS</w:t>
+        <w:t xml:space="preserve">CHRISTOPHER </w:t>
+      </w:r>
+      <w:r>
+        <w:rPr>
+          <w:b/>
+          <w:bCs/>
+          <w:color w:val="FF0000"/>
+        </w:rPr>
+        <w:t xml:space="preserve">J. </w:t>
+      </w:r>
+      <w:r>
+        <w:rPr>
+          <w:b/>
+          <w:bCs/>
+          <w:color w:val="FF0000"/>
+        </w:rPr>
+        <w:t xml:space="preserve">HAWKINSON </w:t>
+      </w:r>
+      <w:proofErr w:type="gramStart"/>
+      <w:r>
+        <w:rPr>
+          <w:b/>
+          <w:bCs/>
+          <w:color w:val="FF0000"/>
+        </w:rPr>
+        <w:t>SYSTEMS</w:t>
       </w:r>
       <w:r>
         <w:rPr>
@@ -859,7 +930,15 @@
           <w:b/>
           <w:bCs/>
         </w:rPr>
-        <w:t xml:space="preserve">                                         </w:t>
+        <w:t xml:space="preserve">   </w:t>
+      </w:r>
+      <w:proofErr w:type="gramEnd"/>
+      <w:r>
+        <w:rPr>
+          <w:b/>
+          <w:bCs/>
+        </w:rPr>
+        <w:t xml:space="preserve">                                      </w:t>
       </w:r>
       <w:r>
         <w:rPr>
@@ -871,7 +950,19 @@
         <w:rPr>
           <w:color w:val="808080" w:themeColor="background1" w:themeShade="80"/>
         </w:rPr>
-        <w:t xml:space="preserve"> CHRIS HAWKINSON’S COMPUTER SYSTEM.</w:t>
+        <w:t xml:space="preserve"> </w:t>
+      </w:r>
+      <w:r>
+        <w:rPr>
+          <w:color w:val="808080" w:themeColor="background1" w:themeShade="80"/>
+        </w:rPr>
+        <w:t>CHRISTOPHER J. HAWKINSON</w:t>
+      </w:r>
+      <w:r>
+        <w:rPr>
+          <w:color w:val="808080" w:themeColor="background1" w:themeShade="80"/>
+        </w:rPr>
+        <w:t>’S COMPUTER SYSTEM.</w:t>
       </w:r>
     </w:p>
     <w:p>
@@ -999,7 +1090,19 @@
         <w:rPr>
           <w:color w:val="808080" w:themeColor="background1" w:themeShade="80"/>
         </w:rPr>
-        <w:t>ALLEGEDLY ILLICIT EX-JUDICIAL EXECUTION SOFTWARE DEVELOPED BY CHRIS HAWKINSON OR OTHER FORMER OR CURRENT FEDERAL EMPLOYEES.</w:t>
+        <w:t xml:space="preserve">ALLEGEDLY ILLICIT EX-JUDICIAL EXECUTION SOFTWARE DEVELOPED BY </w:t>
+      </w:r>
+      <w:r>
+        <w:rPr>
+          <w:color w:val="808080" w:themeColor="background1" w:themeShade="80"/>
+        </w:rPr>
+        <w:t>CHRISTOPHER J. HAWKINSON</w:t>
+      </w:r>
+      <w:r>
+        <w:rPr>
+          <w:color w:val="808080" w:themeColor="background1" w:themeShade="80"/>
+        </w:rPr>
+        <w:t xml:space="preserve"> OR OTHER FORMER OR CURRENT FEDERAL EMPLOYEES.</w:t>
       </w:r>
     </w:p>
     <w:p>
@@ -1130,7 +1233,19 @@
         <w:rPr>
           <w:color w:val="808080" w:themeColor="background1" w:themeShade="80"/>
         </w:rPr>
-        <w:t>ALLEGEDLY CHRIS HAWKINSON’S COMPUTER SYSTEM.</w:t>
+        <w:t xml:space="preserve">ALLEGEDLY </w:t>
+      </w:r>
+      <w:r>
+        <w:rPr>
+          <w:color w:val="808080" w:themeColor="background1" w:themeShade="80"/>
+        </w:rPr>
+        <w:t xml:space="preserve">                          CHRISTOPHER J. HAWKINSON</w:t>
+      </w:r>
+      <w:r>
+        <w:rPr>
+          <w:color w:val="808080" w:themeColor="background1" w:themeShade="80"/>
+        </w:rPr>
+        <w:t>’S COMPUTER SYSTEM.</w:t>
       </w:r>
     </w:p>
     <w:p>
@@ -1235,7 +1350,16 @@
           <w:bCs/>
           <w:color w:val="FF0000"/>
         </w:rPr>
-        <w:t>INVERSION SOFTWARE</w:t>
+        <w:t xml:space="preserve">INVERSION </w:t>
+      </w:r>
+      <w:proofErr w:type="gramStart"/>
+      <w:r>
+        <w:rPr>
+          <w:b/>
+          <w:bCs/>
+          <w:color w:val="FF0000"/>
+        </w:rPr>
+        <w:t>SOFTWARE</w:t>
       </w:r>
       <w:r>
         <w:rPr>
@@ -1244,6 +1368,7 @@
         </w:rPr>
         <w:t>;</w:t>
       </w:r>
+      <w:proofErr w:type="gramEnd"/>
     </w:p>
     <w:p>
       <w:pPr>
@@ -1409,7 +1534,16 @@
           <w:bCs/>
           <w:color w:val="FF0000"/>
         </w:rPr>
-        <w:t>JULIE CHAMBERLAIN INSTANCES</w:t>
+        <w:t xml:space="preserve">JULIE CHAMBERLAIN </w:t>
+      </w:r>
+      <w:proofErr w:type="gramStart"/>
+      <w:r>
+        <w:rPr>
+          <w:b/>
+          <w:bCs/>
+          <w:color w:val="FF0000"/>
+        </w:rPr>
+        <w:t>INSTANCES</w:t>
       </w:r>
       <w:r>
         <w:rPr>
@@ -1423,7 +1557,15 @@
           <w:b/>
           <w:bCs/>
         </w:rPr>
-        <w:t xml:space="preserve">                                                </w:t>
+        <w:t xml:space="preserve">   </w:t>
+      </w:r>
+      <w:proofErr w:type="gramEnd"/>
+      <w:r>
+        <w:rPr>
+          <w:b/>
+          <w:bCs/>
+        </w:rPr>
+        <w:t xml:space="preserve">                                             </w:t>
       </w:r>
       <w:r>
         <w:rPr>
@@ -1499,7 +1641,19 @@
         <w:rPr>
           <w:color w:val="808080" w:themeColor="background1" w:themeShade="80"/>
         </w:rPr>
-        <w:t>ALLEGEDLY ILLICIT EX-JUDICIAL EXECUTION SOFTWARE DEVELOPED BY CHRIS HAWKINSON OR OTHER FORMER OR CURRENT FEDERAL EMPLOYEES.</w:t>
+        <w:t xml:space="preserve">ALLEGEDLY ILLICIT EX-JUDICIAL EXECUTION SOFTWARE DEVELOPED BY </w:t>
+      </w:r>
+      <w:r>
+        <w:rPr>
+          <w:color w:val="808080" w:themeColor="background1" w:themeShade="80"/>
+        </w:rPr>
+        <w:t>CHRISTOPHER J. HAWKINSON</w:t>
+      </w:r>
+      <w:r>
+        <w:rPr>
+          <w:color w:val="808080" w:themeColor="background1" w:themeShade="80"/>
+        </w:rPr>
+        <w:t xml:space="preserve"> OR OTHER FORMER OR CURRENT FEDERAL EMPLOYEES.</w:t>
       </w:r>
     </w:p>
     <w:p>
@@ -1700,19 +1854,7 @@
         <w:rPr>
           <w:color w:val="808080" w:themeColor="background1" w:themeShade="80"/>
         </w:rPr>
-        <w:t>GENERAL</w:t>
-      </w:r>
-      <w:r>
-        <w:rPr>
-          <w:color w:val="808080" w:themeColor="background1" w:themeShade="80"/>
-        </w:rPr>
-        <w:t xml:space="preserve"> </w:t>
-      </w:r>
-      <w:r>
-        <w:rPr>
-          <w:color w:val="808080" w:themeColor="background1" w:themeShade="80"/>
-        </w:rPr>
-        <w:t>MARK MILLEY</w:t>
+        <w:t>GENERAL MARK MILLEY</w:t>
       </w:r>
       <w:r>
         <w:rPr>
@@ -1788,19 +1930,7 @@
         <w:rPr>
           <w:color w:val="808080" w:themeColor="background1" w:themeShade="80"/>
         </w:rPr>
-        <w:t>GENERAL</w:t>
-      </w:r>
-      <w:r>
-        <w:rPr>
-          <w:color w:val="808080" w:themeColor="background1" w:themeShade="80"/>
-        </w:rPr>
-        <w:t xml:space="preserve"> </w:t>
-      </w:r>
-      <w:r>
-        <w:rPr>
-          <w:color w:val="808080" w:themeColor="background1" w:themeShade="80"/>
-        </w:rPr>
-        <w:t>MARK MILLEY</w:t>
+        <w:t>GENERAL MARK MILLEY</w:t>
       </w:r>
       <w:r>
         <w:rPr>
@@ -1876,19 +2006,7 @@
         <w:rPr>
           <w:color w:val="808080" w:themeColor="background1" w:themeShade="80"/>
         </w:rPr>
-        <w:t>GENERAL</w:t>
-      </w:r>
-      <w:r>
-        <w:rPr>
-          <w:color w:val="808080" w:themeColor="background1" w:themeShade="80"/>
-        </w:rPr>
-        <w:t xml:space="preserve"> </w:t>
-      </w:r>
-      <w:r>
-        <w:rPr>
-          <w:color w:val="808080" w:themeColor="background1" w:themeShade="80"/>
-        </w:rPr>
-        <w:t>MARK MILLEY</w:t>
+        <w:t>GENERAL MARK MILLEY</w:t>
       </w:r>
       <w:r>
         <w:rPr>
@@ -1964,19 +2082,7 @@
         <w:rPr>
           <w:color w:val="808080" w:themeColor="background1" w:themeShade="80"/>
         </w:rPr>
-        <w:t>GENERAL</w:t>
-      </w:r>
-      <w:r>
-        <w:rPr>
-          <w:color w:val="808080" w:themeColor="background1" w:themeShade="80"/>
-        </w:rPr>
-        <w:t xml:space="preserve"> </w:t>
-      </w:r>
-      <w:r>
-        <w:rPr>
-          <w:color w:val="808080" w:themeColor="background1" w:themeShade="80"/>
-        </w:rPr>
-        <w:t>MARK MILLEY</w:t>
+        <w:t>GENERAL MARK MILLEY</w:t>
       </w:r>
       <w:r>
         <w:rPr>
@@ -2053,19 +2159,7 @@
         <w:rPr>
           <w:color w:val="808080" w:themeColor="background1" w:themeShade="80"/>
         </w:rPr>
-        <w:t>GENERAL</w:t>
-      </w:r>
-      <w:r>
-        <w:rPr>
-          <w:color w:val="808080" w:themeColor="background1" w:themeShade="80"/>
-        </w:rPr>
-        <w:t xml:space="preserve"> </w:t>
-      </w:r>
-      <w:r>
-        <w:rPr>
-          <w:color w:val="808080" w:themeColor="background1" w:themeShade="80"/>
-        </w:rPr>
-        <w:t>MARK MILLEY</w:t>
+        <w:t>GENERAL MARK MILLEY</w:t>
       </w:r>
       <w:r>
         <w:rPr>
@@ -2204,7 +2298,19 @@
         <w:rPr>
           <w:color w:val="808080" w:themeColor="background1" w:themeShade="80"/>
         </w:rPr>
-        <w:t xml:space="preserve"> ALLEGEDLY CREATED BY CHRIS HAWKINSON AND OTHER FEDERAL EMPLOYEES TO CONDUCT CRIMES TOWARDS PATRICK R. MCELHINEY.</w:t>
+        <w:t xml:space="preserve"> ALLEGEDLY CREATED BY </w:t>
+      </w:r>
+      <w:r>
+        <w:rPr>
+          <w:color w:val="808080" w:themeColor="background1" w:themeShade="80"/>
+        </w:rPr>
+        <w:t>CHRISTOPHER J. HAWKINSON</w:t>
+      </w:r>
+      <w:r>
+        <w:rPr>
+          <w:color w:val="808080" w:themeColor="background1" w:themeShade="80"/>
+        </w:rPr>
+        <w:t xml:space="preserve"> AND OTHER FEDERAL EMPLOYEES TO CONDUCT CRIMES TOWARDS PATRICK R. MCELHINEY.</w:t>
       </w:r>
     </w:p>
     <w:p>
@@ -2261,7 +2367,25 @@
         <w:rPr>
           <w:color w:val="808080" w:themeColor="background1" w:themeShade="80"/>
         </w:rPr>
-        <w:t xml:space="preserve"> ALLEGEDLY IS ACTUALLY CHRIS HAWKINSON INSTANCES.</w:t>
+        <w:t xml:space="preserve"> ALLEGEDLY IS ACTUALLY CHRIS</w:t>
+      </w:r>
+      <w:r>
+        <w:rPr>
+          <w:color w:val="808080" w:themeColor="background1" w:themeShade="80"/>
+        </w:rPr>
+        <w:t>TOPHER J.</w:t>
+      </w:r>
+      <w:r>
+        <w:rPr>
+          <w:color w:val="808080" w:themeColor="background1" w:themeShade="80"/>
+        </w:rPr>
+        <w:t xml:space="preserve"> HAWKINSON INSTANCES</w:t>
+      </w:r>
+      <w:r>
+        <w:rPr>
+          <w:color w:val="808080" w:themeColor="background1" w:themeShade="80"/>
+        </w:rPr>
+        <w:t>, ALLEGEDLY USED BY CHRISTOPHER J. HAWKINSON TO COMMIT WAR CRIMES TOWARDS AND USING THE NAME OF PATRICK R. MCELHINEY.</w:t>
       </w:r>
     </w:p>
     <w:p>
@@ -2325,7 +2449,19 @@
         <w:rPr>
           <w:color w:val="808080" w:themeColor="background1" w:themeShade="80"/>
         </w:rPr>
-        <w:t>ALLEGEDLY CHRIS HAWKINSON’S COMPUTER SYSTEM THAT ALLEGEDLY PERFORMS FUNCTIONS FOR THE CENTRAL INTELLIGENCE AGENCY.</w:t>
+        <w:t xml:space="preserve">ALLEGEDLY </w:t>
+      </w:r>
+      <w:r>
+        <w:rPr>
+          <w:color w:val="808080" w:themeColor="background1" w:themeShade="80"/>
+        </w:rPr>
+        <w:t xml:space="preserve">                                CHRISTOPHER J. HAWKINSON</w:t>
+      </w:r>
+      <w:r>
+        <w:rPr>
+          <w:color w:val="808080" w:themeColor="background1" w:themeShade="80"/>
+        </w:rPr>
+        <w:t>’S COMPUTER SYSTEM THAT ALLEGEDLY PERFORMS FUNCTIONS FOR THE CENTRAL INTELLIGENCE AGENCY.</w:t>
       </w:r>
     </w:p>
     <w:p>
@@ -2453,7 +2589,19 @@
         <w:rPr>
           <w:color w:val="808080" w:themeColor="background1" w:themeShade="80"/>
         </w:rPr>
-        <w:t>ALLEGEDLY CHRIS HAWKINSON’S COMPUTER SYSTEM THAT ALLEGEDLY PERFORMS FUNCTIONS FOR THE DEFENSE INTELLIGENCE AGENCY.</w:t>
+        <w:t xml:space="preserve">ALLEGEDLY </w:t>
+      </w:r>
+      <w:r>
+        <w:rPr>
+          <w:color w:val="808080" w:themeColor="background1" w:themeShade="80"/>
+        </w:rPr>
+        <w:t xml:space="preserve">                             CHRISTOPHER J. HAWKINSON</w:t>
+      </w:r>
+      <w:r>
+        <w:rPr>
+          <w:color w:val="808080" w:themeColor="background1" w:themeShade="80"/>
+        </w:rPr>
+        <w:t>’S COMPUTER SYSTEM THAT ALLEGEDLY PERFORMS FUNCTIONS FOR THE DEFENSE INTELLIGENCE AGENCY.</w:t>
       </w:r>
     </w:p>
     <w:p>
@@ -2517,7 +2665,19 @@
         <w:rPr>
           <w:color w:val="808080" w:themeColor="background1" w:themeShade="80"/>
         </w:rPr>
-        <w:t>ALLEGEDLY CHRIS HAWKINSON’S COMPUTER SYSTEM THAT ALLEGEDLY IMPERSONATES THE FEDERAL BUREAU OF INVESTIGATION.</w:t>
+        <w:t xml:space="preserve">ALLEGEDLY </w:t>
+      </w:r>
+      <w:r>
+        <w:rPr>
+          <w:color w:val="808080" w:themeColor="background1" w:themeShade="80"/>
+        </w:rPr>
+        <w:t xml:space="preserve">                            CHRISTOPHER J. HAWKINSON</w:t>
+      </w:r>
+      <w:r>
+        <w:rPr>
+          <w:color w:val="808080" w:themeColor="background1" w:themeShade="80"/>
+        </w:rPr>
+        <w:t>’S COMPUTER SYSTEM THAT ALLEGEDLY IMPERSONATES THE FEDERAL BUREAU OF INVESTIGATION.</w:t>
       </w:r>
     </w:p>
     <w:p>
@@ -2648,7 +2808,19 @@
         <w:rPr>
           <w:color w:val="808080" w:themeColor="background1" w:themeShade="80"/>
         </w:rPr>
-        <w:t>ALLEGEDLY CHRIS HAWKINSON’S COMPUTER SYSTEM THAT ALLEGEDLY IMPERSONATES THE INTERNAL REVENUE SERVICE.</w:t>
+        <w:t xml:space="preserve">ALLEGEDLY </w:t>
+      </w:r>
+      <w:r>
+        <w:rPr>
+          <w:color w:val="808080" w:themeColor="background1" w:themeShade="80"/>
+        </w:rPr>
+        <w:t xml:space="preserve">                             CHRISTOPHER J. HAWKINSON</w:t>
+      </w:r>
+      <w:r>
+        <w:rPr>
+          <w:color w:val="808080" w:themeColor="background1" w:themeShade="80"/>
+        </w:rPr>
+        <w:t>’S COMPUTER SYSTEM THAT ALLEGEDLY IMPERSONATES THE INTERNAL REVENUE SERVICE.</w:t>
       </w:r>
     </w:p>
     <w:p>
@@ -2664,6 +2836,7 @@
         <w:rPr>
           <w:u w:val="single"/>
         </w:rPr>
+        <w:lastRenderedPageBreak/>
         <w:t>PREVENTION SECURITY SYSTEM</w:t>
       </w:r>
       <w:r>
@@ -2712,7 +2885,19 @@
         <w:rPr>
           <w:color w:val="808080" w:themeColor="background1" w:themeShade="80"/>
         </w:rPr>
-        <w:t>ALLEGEDLY CHRIS HAWKINSON’S COMPUTER SYSTEM THAT IMPERSONATES OR PERFORMS ACTIONS FOR THE NATIONAL SECURITY AGENCY.</w:t>
+        <w:t xml:space="preserve">ALLEGEDLY </w:t>
+      </w:r>
+      <w:r>
+        <w:rPr>
+          <w:color w:val="808080" w:themeColor="background1" w:themeShade="80"/>
+        </w:rPr>
+        <w:t xml:space="preserve">                            CHRISTOPHER J. HAWKINSON</w:t>
+      </w:r>
+      <w:r>
+        <w:rPr>
+          <w:color w:val="808080" w:themeColor="background1" w:themeShade="80"/>
+        </w:rPr>
+        <w:t>’S COMPUTER SYSTEM THAT IMPERSONATES OR PERFORMS ACTIONS FOR THE NATIONAL SECURITY AGENCY.</w:t>
       </w:r>
     </w:p>
     <w:p>
@@ -2728,7 +2913,6 @@
         <w:rPr>
           <w:u w:val="single"/>
         </w:rPr>
-        <w:lastRenderedPageBreak/>
         <w:t>PREVENTION SECURITY SYSTEM</w:t>
       </w:r>
       <w:r>
@@ -2841,7 +3025,19 @@
         <w:rPr>
           <w:color w:val="808080" w:themeColor="background1" w:themeShade="80"/>
         </w:rPr>
-        <w:t>ALLEGEDLY                          CHRIS HAWKINSON’S COMPUTER SYSTEM USED TO EX-JUDICALLY EXECUTE OVER 80,000 OR UP TO OVER 800,000 AMERICANS DURING COVID-19.</w:t>
+        <w:t xml:space="preserve">ALLEGEDLY                          </w:t>
+      </w:r>
+      <w:r>
+        <w:rPr>
+          <w:color w:val="808080" w:themeColor="background1" w:themeShade="80"/>
+        </w:rPr>
+        <w:t>CHRISTOPHER J. HAWKINSON</w:t>
+      </w:r>
+      <w:r>
+        <w:rPr>
+          <w:color w:val="808080" w:themeColor="background1" w:themeShade="80"/>
+        </w:rPr>
+        <w:t>’S COMPUTER SYSTEM USED TO EX-JUDICALLY EXECUTE OVER 80,000 OR UP TO OVER 800,000 AMERICANS DURING COVID-19.</w:t>
       </w:r>
     </w:p>
     <w:p>
@@ -2905,7 +3101,19 @@
         <w:rPr>
           <w:color w:val="808080" w:themeColor="background1" w:themeShade="80"/>
         </w:rPr>
-        <w:t>ALLEGEDLY                            CHRIS HAWKINSON’S COMPUTER SYSTEM THAT WAS IMPERSONATING THE UNIVERSITY OF NEW HAMPSHIRE.</w:t>
+        <w:t xml:space="preserve">ALLEGEDLY                            </w:t>
+      </w:r>
+      <w:r>
+        <w:rPr>
+          <w:color w:val="808080" w:themeColor="background1" w:themeShade="80"/>
+        </w:rPr>
+        <w:t>CHRISTOPHER J. HAWKINSON</w:t>
+      </w:r>
+      <w:r>
+        <w:rPr>
+          <w:color w:val="808080" w:themeColor="background1" w:themeShade="80"/>
+        </w:rPr>
+        <w:t>’S COMPUTER SYSTEM THAT WAS IMPERSONATING THE UNIVERSITY OF NEW HAMPSHIRE.</w:t>
       </w:r>
     </w:p>
     <w:p>
@@ -3507,6 +3715,7 @@
         </w:rPr>
         <w:t xml:space="preserve">SOFTWARE </w:t>
       </w:r>
+      <w:proofErr w:type="gramStart"/>
       <w:r>
         <w:rPr>
           <w:b/>
@@ -3530,6 +3739,7 @@
         </w:rPr>
         <w:t>;</w:t>
       </w:r>
+      <w:proofErr w:type="gramEnd"/>
     </w:p>
     <w:bookmarkEnd w:id="1"/>
     <w:p>
@@ -3540,6 +3750,7 @@
         <w:rPr>
           <w:u w:val="single"/>
         </w:rPr>
+        <w:lastRenderedPageBreak/>
         <w:t>}</w:t>
       </w:r>
     </w:p>
@@ -4882,6 +5093,7 @@
       </w:rPr>
       <w:t xml:space="preserve"> </w:t>
     </w:r>
+    <w:proofErr w:type="gramStart"/>
     <w:r>
       <w:rPr>
         <w:b/>
@@ -4907,7 +5119,16 @@
         <w:color w:val="000000" w:themeColor="text1"/>
         <w:sz w:val="18"/>
       </w:rPr>
-      <w:t xml:space="preserve">                  Company </w:t>
+      <w:t xml:space="preserve">  </w:t>
+    </w:r>
+    <w:proofErr w:type="gramEnd"/>
+    <w:r>
+      <w:rPr>
+        <w:i/>
+        <w:color w:val="000000" w:themeColor="text1"/>
+        <w:sz w:val="18"/>
+      </w:rPr>
+      <w:t xml:space="preserve">                Company </w:t>
     </w:r>
     <w:r>
       <w:rPr>

</xml_diff>

<commit_message>
Update 4/14/2023 10:39AM EST
Update as of 10:39AM EST on 4/14/2023.
</commit_message>
<xml_diff>
--- a/20230414 - MCE123 Technology Development - Illicit Government Software Runtime Prevention Security Systems - v1.0.0.1.docx
+++ b/20230414 - MCE123 Technology Development - Illicit Government Software Runtime Prevention Security Systems - v1.0.0.1.docx
@@ -223,7 +223,7 @@
           <w:sz w:val="28"/>
           <w:szCs w:val="28"/>
         </w:rPr>
-        <w:t>4/14/2023 9:01:08 AM</w:t>
+        <w:t>4/14/2023 10:39:01 AM</w:t>
       </w:r>
     </w:p>
     <w:p>
@@ -963,6 +963,24 @@
           <w:color w:val="808080" w:themeColor="background1" w:themeShade="80"/>
         </w:rPr>
         <w:t>’S COMPUTER SYSTEM.</w:t>
+      </w:r>
+      <w:r>
+        <w:rPr>
+          <w:color w:val="808080" w:themeColor="background1" w:themeShade="80"/>
+        </w:rPr>
+        <w:t xml:space="preserve"> ALLEGEDLY                                         CHRISTOPHER J. HAWKINSON </w:t>
+      </w:r>
+      <w:r>
+        <w:rPr>
+          <w:color w:val="808080" w:themeColor="background1" w:themeShade="80"/>
+        </w:rPr>
+        <w:t>ACCESSED</w:t>
+      </w:r>
+      <w:r>
+        <w:rPr>
+          <w:color w:val="808080" w:themeColor="background1" w:themeShade="80"/>
+        </w:rPr>
+        <w:t xml:space="preserve"> THE PENTAGON PROGRAM TO CONDUCT THE GENOCIDE OF OVER 80,000 AMERICANS DURING COVID-19.</w:t>
       </w:r>
     </w:p>
     <w:p>
@@ -1322,6 +1340,7 @@
         </w:rPr>
       </w:pPr>
       <w:r>
+        <w:lastRenderedPageBreak/>
         <w:tab/>
       </w:r>
       <w:r>
@@ -1383,7 +1402,6 @@
         <w:rPr>
           <w:u w:val="single"/>
         </w:rPr>
-        <w:lastRenderedPageBreak/>
         <w:t>PREVENTION SECURITY SYSTEM</w:t>
       </w:r>
       <w:r>

</xml_diff>